<commit_message>
Final improvements, only deadman reset to go
</commit_message>
<xml_diff>
--- a/profiles/mat64_ct_tsc_thejag.docx
+++ b/profiles/mat64_ct_tsc_thejag.docx
@@ -109,9 +109,9 @@
                 <w:noProof/>
               </w:rPr>
               <w:drawing>
-                <wp:inline distT="0" distB="0" distL="0" distR="0" wp14:anchorId="6543BDCD" wp14:editId="57B4D294">
-                  <wp:extent cx="359410" cy="219075"/>
-                  <wp:effectExtent l="0" t="0" r="2540" b="9525"/>
+                <wp:inline distT="0" distB="0" distL="0" distR="0" wp14:anchorId="6543BDCD" wp14:editId="52CFD69B">
+                  <wp:extent cx="532932" cy="324844"/>
+                  <wp:effectExtent l="0" t="0" r="635" b="0"/>
                   <wp:docPr id="1708481258" name="Picture 1" descr="Android Apps by Nederlandse Spoorwegen ..."/>
                   <wp:cNvGraphicFramePr>
                     <a:graphicFrameLocks xmlns:a="http://schemas.openxmlformats.org/drawingml/2006/main" noChangeAspect="1"/>
@@ -141,7 +141,7 @@
                         <pic:spPr bwMode="auto">
                           <a:xfrm>
                             <a:off x="0" y="0"/>
-                            <a:ext cx="359410" cy="219075"/>
+                            <a:ext cx="541975" cy="330356"/>
                           </a:xfrm>
                           <a:prstGeom prst="rect">
                             <a:avLst/>
@@ -340,7 +340,7 @@
                 <w:noProof/>
               </w:rPr>
               <w:drawing>
-                <wp:inline distT="0" distB="0" distL="0" distR="0" wp14:anchorId="620BEBDD" wp14:editId="2B038506">
+                <wp:inline distT="0" distB="0" distL="0" distR="0" wp14:anchorId="620BEBDD" wp14:editId="3FA25EE6">
                   <wp:extent cx="6840000" cy="240506"/>
                   <wp:effectExtent l="0" t="0" r="0" b="7620"/>
                   <wp:docPr id="1452356147" name="Picture 2"/>
@@ -452,15 +452,2925 @@
             </w:pPr>
             <w:r>
               <w:rPr>
+                <w:noProof/>
                 <w:color w:val="FFFFFF" w:themeColor="background1"/>
                 <w:sz w:val="32"/>
                 <w:szCs w:val="32"/>
               </w:rPr>
+              <mc:AlternateContent>
+                <mc:Choice Requires="wps">
+                  <w:drawing>
+                    <wp:anchor distT="0" distB="0" distL="114300" distR="114300" simplePos="0" relativeHeight="251694080" behindDoc="0" locked="0" layoutInCell="1" allowOverlap="1" wp14:anchorId="01FDE6F4" wp14:editId="176AEA1E">
+                      <wp:simplePos x="0" y="0"/>
+                      <wp:positionH relativeFrom="column">
+                        <wp:posOffset>1313612</wp:posOffset>
+                      </wp:positionH>
+                      <wp:positionV relativeFrom="paragraph">
+                        <wp:posOffset>4053985</wp:posOffset>
+                      </wp:positionV>
+                      <wp:extent cx="660203" cy="323850"/>
+                      <wp:effectExtent l="0" t="0" r="26035" b="19050"/>
+                      <wp:wrapNone/>
+                      <wp:docPr id="2094956401" name="Rectangle 1"/>
+                      <wp:cNvGraphicFramePr/>
+                      <a:graphic xmlns:a="http://schemas.openxmlformats.org/drawingml/2006/main">
+                        <a:graphicData uri="http://schemas.microsoft.com/office/word/2010/wordprocessingShape">
+                          <wps:wsp>
+                            <wps:cNvSpPr/>
+                            <wps:spPr>
+                              <a:xfrm>
+                                <a:off x="0" y="0"/>
+                                <a:ext cx="660203" cy="323850"/>
+                              </a:xfrm>
+                              <a:prstGeom prst="rect">
+                                <a:avLst/>
+                              </a:prstGeom>
+                              <a:solidFill>
+                                <a:srgbClr val="000000">
+                                  <a:alpha val="60000"/>
+                                </a:srgbClr>
+                              </a:solidFill>
+                              <a:ln w="12700">
+                                <a:solidFill>
+                                  <a:srgbClr val="FF0000"/>
+                                </a:solidFill>
+                              </a:ln>
+                            </wps:spPr>
+                            <wps:style>
+                              <a:lnRef idx="2">
+                                <a:schemeClr val="accent1">
+                                  <a:shade val="15000"/>
+                                </a:schemeClr>
+                              </a:lnRef>
+                              <a:fillRef idx="1">
+                                <a:schemeClr val="accent1"/>
+                              </a:fillRef>
+                              <a:effectRef idx="0">
+                                <a:schemeClr val="accent1"/>
+                              </a:effectRef>
+                              <a:fontRef idx="minor">
+                                <a:schemeClr val="lt1"/>
+                              </a:fontRef>
+                            </wps:style>
+                            <wps:txbx>
+                              <w:txbxContent>
+                                <w:p>
+                                  <w:pPr>
+                                    <w:spacing w:after="0" w:line="204" w:lineRule="auto"/>
+                                    <w:jc w:val="center"/>
+                                    <w:rPr>
+                                      <w:b/>
+                                      <w:bCs/>
+                                      <w:color w:val="FF0000"/>
+                                      <w:sz w:val="20"/>
+                                      <w:szCs w:val="20"/>
+                                      <w14:shadow w14:blurRad="50800" w14:dist="38100" w14:dir="2700000" w14:sx="100000" w14:sy="100000" w14:kx="0" w14:ky="0" w14:algn="tl">
+                                        <w14:srgbClr w14:val="000000">
+                                          <w14:alpha w14:val="60000"/>
+                                        </w14:srgbClr>
+                                      </w14:shadow>
+                                    </w:rPr>
+                                  </w:pPr>
+                                  <w:r>
+                                    <w:rPr>
+                                      <w:b/>
+                                      <w:bCs/>
+                                      <w:color w:val="FF0000"/>
+                                      <w:sz w:val="20"/>
+                                      <w:szCs w:val="20"/>
+                                      <w14:shadow w14:blurRad="50800" w14:dist="38100" w14:dir="2700000" w14:sx="100000" w14:sy="100000" w14:kx="0" w14:ky="0" w14:algn="tl">
+                                        <w14:srgbClr w14:val="000000">
+                                          <w14:alpha w14:val="60000"/>
+                                        </w14:srgbClr>
+                                      </w14:shadow>
+                                    </w:rPr>
+                                    <w:t xml:space="preserve">Deadman </w:t>
+                                  </w:r>
+                                  <w:r>
+                                    <w:rPr>
+                                      <w:b/>
+                                      <w:bCs/>
+                                      <w:color w:val="FF0000"/>
+                                      <w:sz w:val="20"/>
+                                      <w:szCs w:val="20"/>
+                                      <w14:shadow w14:blurRad="50800" w14:dist="38100" w14:dir="2700000" w14:sx="100000" w14:sy="100000" w14:kx="0" w14:ky="0" w14:algn="tl">
+                                        <w14:srgbClr w14:val="000000">
+                                          <w14:alpha w14:val="60000"/>
+                                        </w14:srgbClr>
+                                      </w14:shadow>
+                                    </w:rPr>
+                                    <w:t>reset</w:t>
+                                  </w:r>
+                                </w:p>
+                              </w:txbxContent>
+                            </wps:txbx>
+                            <wps:bodyPr rot="0" spcFirstLastPara="0" vertOverflow="overflow" horzOverflow="overflow" vert="horz" wrap="square" lIns="0" tIns="0" rIns="0" bIns="0" numCol="1" spcCol="0" rtlCol="0" fromWordArt="0" anchor="ctr" anchorCtr="0" forceAA="0" compatLnSpc="1">
+                              <a:prstTxWarp prst="textNoShape">
+                                <a:avLst/>
+                              </a:prstTxWarp>
+                              <a:noAutofit/>
+                            </wps:bodyPr>
+                          </wps:wsp>
+                        </a:graphicData>
+                      </a:graphic>
+                      <wp14:sizeRelH relativeFrom="margin">
+                        <wp14:pctWidth>0</wp14:pctWidth>
+                      </wp14:sizeRelH>
+                      <wp14:sizeRelV relativeFrom="margin">
+                        <wp14:pctHeight>0</wp14:pctHeight>
+                      </wp14:sizeRelV>
+                    </wp:anchor>
+                  </w:drawing>
+                </mc:Choice>
+                <mc:Fallback>
+                  <w:pict>
+                    <v:rect w14:anchorId="01FDE6F4" id="Rectangle 1" o:spid="_x0000_s1026" style="position:absolute;left:0;text-align:left;margin-left:103.45pt;margin-top:319.2pt;width:52pt;height:25.5pt;z-index:251694080;visibility:visible;mso-wrap-style:square;mso-width-percent:0;mso-height-percent:0;mso-wrap-distance-left:9pt;mso-wrap-distance-top:0;mso-wrap-distance-right:9pt;mso-wrap-distance-bottom:0;mso-position-horizontal:absolute;mso-position-horizontal-relative:text;mso-position-vertical:absolute;mso-position-vertical-relative:text;mso-width-percent:0;mso-height-percent:0;mso-width-relative:margin;mso-height-relative:margin;v-text-anchor:middle" o:gfxdata="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" fillcolor="black" strokecolor="red" strokeweight="1pt">
+                      <v:fill opacity="39321f"/>
+                      <v:textbox inset="0,0,0,0">
+                        <w:txbxContent>
+                          <w:p>
+                            <w:pPr>
+                              <w:spacing w:after="0" w:line="204" w:lineRule="auto"/>
+                              <w:jc w:val="center"/>
+                              <w:rPr>
+                                <w:b/>
+                                <w:bCs/>
+                                <w:color w:val="FF0000"/>
+                                <w:sz w:val="20"/>
+                                <w:szCs w:val="20"/>
+                                <w14:shadow w14:blurRad="50800" w14:dist="38100" w14:dir="2700000" w14:sx="100000" w14:sy="100000" w14:kx="0" w14:ky="0" w14:algn="tl">
+                                  <w14:srgbClr w14:val="000000">
+                                    <w14:alpha w14:val="60000"/>
+                                  </w14:srgbClr>
+                                </w14:shadow>
+                              </w:rPr>
+                            </w:pPr>
+                            <w:r>
+                              <w:rPr>
+                                <w:b/>
+                                <w:bCs/>
+                                <w:color w:val="FF0000"/>
+                                <w:sz w:val="20"/>
+                                <w:szCs w:val="20"/>
+                                <w14:shadow w14:blurRad="50800" w14:dist="38100" w14:dir="2700000" w14:sx="100000" w14:sy="100000" w14:kx="0" w14:ky="0" w14:algn="tl">
+                                  <w14:srgbClr w14:val="000000">
+                                    <w14:alpha w14:val="60000"/>
+                                  </w14:srgbClr>
+                                </w14:shadow>
+                              </w:rPr>
+                              <w:t xml:space="preserve">Deadman </w:t>
+                            </w:r>
+                            <w:r>
+                              <w:rPr>
+                                <w:b/>
+                                <w:bCs/>
+                                <w:color w:val="FF0000"/>
+                                <w:sz w:val="20"/>
+                                <w:szCs w:val="20"/>
+                                <w14:shadow w14:blurRad="50800" w14:dist="38100" w14:dir="2700000" w14:sx="100000" w14:sy="100000" w14:kx="0" w14:ky="0" w14:algn="tl">
+                                  <w14:srgbClr w14:val="000000">
+                                    <w14:alpha w14:val="60000"/>
+                                  </w14:srgbClr>
+                                </w14:shadow>
+                              </w:rPr>
+                              <w:t>reset</w:t>
+                            </w:r>
+                          </w:p>
+                        </w:txbxContent>
+                      </v:textbox>
+                    </v:rect>
+                  </w:pict>
+                </mc:Fallback>
+              </mc:AlternateContent>
+            </w:r>
+            <w:r>
+              <w:rPr>
+                <w:noProof/>
+                <w:color w:val="FFFFFF" w:themeColor="background1"/>
+                <w:sz w:val="32"/>
+                <w:szCs w:val="32"/>
+              </w:rPr>
+              <mc:AlternateContent>
+                <mc:Choice Requires="wps">
+                  <w:drawing>
+                    <wp:anchor distT="0" distB="0" distL="114300" distR="114300" simplePos="0" relativeHeight="251700224" behindDoc="0" locked="0" layoutInCell="1" allowOverlap="1" wp14:anchorId="7B697D34" wp14:editId="682EEED2">
+                      <wp:simplePos x="0" y="0"/>
+                      <wp:positionH relativeFrom="column">
+                        <wp:posOffset>4622673</wp:posOffset>
+                      </wp:positionH>
+                      <wp:positionV relativeFrom="paragraph">
+                        <wp:posOffset>4975809</wp:posOffset>
+                      </wp:positionV>
+                      <wp:extent cx="611505" cy="215900"/>
+                      <wp:effectExtent l="0" t="0" r="17145" b="12700"/>
+                      <wp:wrapNone/>
+                      <wp:docPr id="974760974" name="Rectangle 1"/>
+                      <wp:cNvGraphicFramePr/>
+                      <a:graphic xmlns:a="http://schemas.openxmlformats.org/drawingml/2006/main">
+                        <a:graphicData uri="http://schemas.microsoft.com/office/word/2010/wordprocessingShape">
+                          <wps:wsp>
+                            <wps:cNvSpPr/>
+                            <wps:spPr>
+                              <a:xfrm>
+                                <a:off x="0" y="0"/>
+                                <a:ext cx="611505" cy="215900"/>
+                              </a:xfrm>
+                              <a:prstGeom prst="rect">
+                                <a:avLst/>
+                              </a:prstGeom>
+                              <a:solidFill>
+                                <a:srgbClr val="000000">
+                                  <a:alpha val="60000"/>
+                                </a:srgbClr>
+                              </a:solidFill>
+                              <a:ln w="12700" cap="flat" cmpd="sng" algn="ctr">
+                                <a:solidFill>
+                                  <a:srgbClr val="FF0000"/>
+                                </a:solidFill>
+                                <a:prstDash val="solid"/>
+                                <a:miter lim="800000"/>
+                              </a:ln>
+                              <a:effectLst/>
+                            </wps:spPr>
+                            <wps:txbx>
+                              <w:txbxContent>
+                                <w:p>
+                                  <w:pPr>
+                                    <w:spacing w:after="0"/>
+                                    <w:jc w:val="center"/>
+                                    <w:rPr>
+                                      <w:b/>
+                                      <w:bCs/>
+                                      <w:color w:val="FF0000"/>
+                                      <w:sz w:val="20"/>
+                                      <w:szCs w:val="20"/>
+                                      <w14:shadow w14:blurRad="50800" w14:dist="38100" w14:dir="2700000" w14:sx="100000" w14:sy="100000" w14:kx="0" w14:ky="0" w14:algn="tl">
+                                        <w14:srgbClr w14:val="000000">
+                                          <w14:alpha w14:val="60000"/>
+                                        </w14:srgbClr>
+                                      </w14:shadow>
+                                    </w:rPr>
+                                  </w:pPr>
+                                  <w:r>
+                                    <w:rPr>
+                                      <w:b/>
+                                      <w:bCs/>
+                                      <w:color w:val="FF0000"/>
+                                      <w:sz w:val="20"/>
+                                      <w:szCs w:val="20"/>
+                                      <w14:shadow w14:blurRad="50800" w14:dist="38100" w14:dir="2700000" w14:sx="100000" w14:sy="100000" w14:kx="0" w14:ky="0" w14:algn="tl">
+                                        <w14:srgbClr w14:val="000000">
+                                          <w14:alpha w14:val="60000"/>
+                                        </w14:srgbClr>
+                                      </w14:shadow>
+                                    </w:rPr>
+                                    <w:t>Wipers</w:t>
+                                  </w:r>
+                                </w:p>
+                              </w:txbxContent>
+                            </wps:txbx>
+                            <wps:bodyPr rot="0" spcFirstLastPara="0" vertOverflow="overflow" horzOverflow="overflow" vert="horz" wrap="square" lIns="0" tIns="0" rIns="0" bIns="0" numCol="1" spcCol="0" rtlCol="0" fromWordArt="0" anchor="ctr" anchorCtr="0" forceAA="0" compatLnSpc="1">
+                              <a:prstTxWarp prst="textNoShape">
+                                <a:avLst/>
+                              </a:prstTxWarp>
+                              <a:noAutofit/>
+                            </wps:bodyPr>
+                          </wps:wsp>
+                        </a:graphicData>
+                      </a:graphic>
+                      <wp14:sizeRelH relativeFrom="margin">
+                        <wp14:pctWidth>0</wp14:pctWidth>
+                      </wp14:sizeRelH>
+                      <wp14:sizeRelV relativeFrom="margin">
+                        <wp14:pctHeight>0</wp14:pctHeight>
+                      </wp14:sizeRelV>
+                    </wp:anchor>
+                  </w:drawing>
+                </mc:Choice>
+                <mc:Fallback>
+                  <w:pict>
+                    <v:rect w14:anchorId="7B697D34" id="_x0000_s1027" style="position:absolute;left:0;text-align:left;margin-left:364pt;margin-top:391.8pt;width:48.15pt;height:17pt;z-index:251700224;visibility:visible;mso-wrap-style:square;mso-width-percent:0;mso-height-percent:0;mso-wrap-distance-left:9pt;mso-wrap-distance-top:0;mso-wrap-distance-right:9pt;mso-wrap-distance-bottom:0;mso-position-horizontal:absolute;mso-position-horizontal-relative:text;mso-position-vertical:absolute;mso-position-vertical-relative:text;mso-width-percent:0;mso-height-percent:0;mso-width-relative:margin;mso-height-relative:margin;v-text-anchor:middle" o:gfxdata="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" fillcolor="black" strokecolor="red" strokeweight="1pt">
+                      <v:fill opacity="39321f"/>
+                      <v:textbox inset="0,0,0,0">
+                        <w:txbxContent>
+                          <w:p>
+                            <w:pPr>
+                              <w:spacing w:after="0"/>
+                              <w:jc w:val="center"/>
+                              <w:rPr>
+                                <w:b/>
+                                <w:bCs/>
+                                <w:color w:val="FF0000"/>
+                                <w:sz w:val="20"/>
+                                <w:szCs w:val="20"/>
+                                <w14:shadow w14:blurRad="50800" w14:dist="38100" w14:dir="2700000" w14:sx="100000" w14:sy="100000" w14:kx="0" w14:ky="0" w14:algn="tl">
+                                  <w14:srgbClr w14:val="000000">
+                                    <w14:alpha w14:val="60000"/>
+                                  </w14:srgbClr>
+                                </w14:shadow>
+                              </w:rPr>
+                            </w:pPr>
+                            <w:r>
+                              <w:rPr>
+                                <w:b/>
+                                <w:bCs/>
+                                <w:color w:val="FF0000"/>
+                                <w:sz w:val="20"/>
+                                <w:szCs w:val="20"/>
+                                <w14:shadow w14:blurRad="50800" w14:dist="38100" w14:dir="2700000" w14:sx="100000" w14:sy="100000" w14:kx="0" w14:ky="0" w14:algn="tl">
+                                  <w14:srgbClr w14:val="000000">
+                                    <w14:alpha w14:val="60000"/>
+                                  </w14:srgbClr>
+                                </w14:shadow>
+                              </w:rPr>
+                              <w:t>Wipers</w:t>
+                            </w:r>
+                          </w:p>
+                        </w:txbxContent>
+                      </v:textbox>
+                    </v:rect>
+                  </w:pict>
+                </mc:Fallback>
+              </mc:AlternateContent>
+            </w:r>
+            <w:r>
+              <w:rPr>
+                <w:noProof/>
+                <w:color w:val="FFFFFF" w:themeColor="background1"/>
+                <w:sz w:val="32"/>
+                <w:szCs w:val="32"/>
+              </w:rPr>
+              <mc:AlternateContent>
+                <mc:Choice Requires="wps">
+                  <w:drawing>
+                    <wp:anchor distT="0" distB="0" distL="114300" distR="114300" simplePos="0" relativeHeight="251676672" behindDoc="0" locked="0" layoutInCell="1" allowOverlap="1" wp14:anchorId="62E3AE57" wp14:editId="6B8CD65D">
+                      <wp:simplePos x="0" y="0"/>
+                      <wp:positionH relativeFrom="column">
+                        <wp:posOffset>2127885</wp:posOffset>
+                      </wp:positionH>
+                      <wp:positionV relativeFrom="paragraph">
+                        <wp:posOffset>1831974</wp:posOffset>
+                      </wp:positionV>
+                      <wp:extent cx="202565" cy="630555"/>
+                      <wp:effectExtent l="0" t="38100" r="64135" b="17145"/>
+                      <wp:wrapNone/>
+                      <wp:docPr id="224703054" name="Straight Arrow Connector 2"/>
+                      <wp:cNvGraphicFramePr/>
+                      <a:graphic xmlns:a="http://schemas.openxmlformats.org/drawingml/2006/main">
+                        <a:graphicData uri="http://schemas.microsoft.com/office/word/2010/wordprocessingShape">
+                          <wps:wsp>
+                            <wps:cNvCnPr/>
+                            <wps:spPr>
+                              <a:xfrm flipV="1">
+                                <a:off x="0" y="0"/>
+                                <a:ext cx="202565" cy="630555"/>
+                              </a:xfrm>
+                              <a:prstGeom prst="straightConnector1">
+                                <a:avLst/>
+                              </a:prstGeom>
+                              <a:ln>
+                                <a:solidFill>
+                                  <a:srgbClr val="FF0000"/>
+                                </a:solidFill>
+                                <a:tailEnd type="triangle"/>
+                              </a:ln>
+                            </wps:spPr>
+                            <wps:style>
+                              <a:lnRef idx="2">
+                                <a:schemeClr val="accent1"/>
+                              </a:lnRef>
+                              <a:fillRef idx="0">
+                                <a:schemeClr val="accent1"/>
+                              </a:fillRef>
+                              <a:effectRef idx="1">
+                                <a:schemeClr val="accent1"/>
+                              </a:effectRef>
+                              <a:fontRef idx="minor">
+                                <a:schemeClr val="tx1"/>
+                              </a:fontRef>
+                            </wps:style>
+                            <wps:bodyPr/>
+                          </wps:wsp>
+                        </a:graphicData>
+                      </a:graphic>
+                      <wp14:sizeRelH relativeFrom="margin">
+                        <wp14:pctWidth>0</wp14:pctWidth>
+                      </wp14:sizeRelH>
+                      <wp14:sizeRelV relativeFrom="margin">
+                        <wp14:pctHeight>0</wp14:pctHeight>
+                      </wp14:sizeRelV>
+                    </wp:anchor>
+                  </w:drawing>
+                </mc:Choice>
+                <mc:Fallback>
+                  <w:pict>
+                    <v:shapetype w14:anchorId="066B55C2" id="_x0000_t32" coordsize="21600,21600" o:spt="32" o:oned="t" path="m,l21600,21600e" filled="f">
+                      <v:path arrowok="t" fillok="f" o:connecttype="none"/>
+                      <o:lock v:ext="edit" shapetype="t"/>
+                    </v:shapetype>
+                    <v:shape id="Straight Arrow Connector 2" o:spid="_x0000_s1026" type="#_x0000_t32" style="position:absolute;margin-left:167.55pt;margin-top:144.25pt;width:15.95pt;height:49.65pt;flip:y;z-index:251676672;visibility:visible;mso-wrap-style:square;mso-width-percent:0;mso-height-percent:0;mso-wrap-distance-left:9pt;mso-wrap-distance-top:0;mso-wrap-distance-right:9pt;mso-wrap-distance-bottom:0;mso-position-horizontal:absolute;mso-position-horizontal-relative:text;mso-position-vertical:absolute;mso-position-vertical-relative:text;mso-width-percent:0;mso-height-percent:0;mso-width-relative:margin;mso-height-relative:margin" o:gfxdata="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" strokecolor="red" strokeweight="1.5pt">
+                      <v:stroke endarrow="block" joinstyle="miter"/>
+                    </v:shape>
+                  </w:pict>
+                </mc:Fallback>
+              </mc:AlternateContent>
+            </w:r>
+            <w:r>
+              <w:rPr>
+                <w:noProof/>
+                <w:color w:val="FFFFFF" w:themeColor="background1"/>
+                <w:sz w:val="32"/>
+                <w:szCs w:val="32"/>
+              </w:rPr>
+              <mc:AlternateContent>
+                <mc:Choice Requires="wps">
+                  <w:drawing>
+                    <wp:anchor distT="0" distB="0" distL="114300" distR="114300" simplePos="0" relativeHeight="251675648" behindDoc="0" locked="0" layoutInCell="1" allowOverlap="1" wp14:anchorId="30B8046B" wp14:editId="15089317">
+                      <wp:simplePos x="0" y="0"/>
+                      <wp:positionH relativeFrom="column">
+                        <wp:posOffset>1824990</wp:posOffset>
+                      </wp:positionH>
+                      <wp:positionV relativeFrom="paragraph">
+                        <wp:posOffset>2464435</wp:posOffset>
+                      </wp:positionV>
+                      <wp:extent cx="611505" cy="215900"/>
+                      <wp:effectExtent l="0" t="0" r="17145" b="12700"/>
+                      <wp:wrapNone/>
+                      <wp:docPr id="906436419" name="Rectangle 1"/>
+                      <wp:cNvGraphicFramePr/>
+                      <a:graphic xmlns:a="http://schemas.openxmlformats.org/drawingml/2006/main">
+                        <a:graphicData uri="http://schemas.microsoft.com/office/word/2010/wordprocessingShape">
+                          <wps:wsp>
+                            <wps:cNvSpPr/>
+                            <wps:spPr>
+                              <a:xfrm>
+                                <a:off x="0" y="0"/>
+                                <a:ext cx="611505" cy="215900"/>
+                              </a:xfrm>
+                              <a:prstGeom prst="rect">
+                                <a:avLst/>
+                              </a:prstGeom>
+                              <a:solidFill>
+                                <a:srgbClr val="000000">
+                                  <a:alpha val="60000"/>
+                                </a:srgbClr>
+                              </a:solidFill>
+                              <a:ln w="12700">
+                                <a:solidFill>
+                                  <a:srgbClr val="FF0000"/>
+                                </a:solidFill>
+                              </a:ln>
+                            </wps:spPr>
+                            <wps:style>
+                              <a:lnRef idx="2">
+                                <a:schemeClr val="accent1">
+                                  <a:shade val="15000"/>
+                                </a:schemeClr>
+                              </a:lnRef>
+                              <a:fillRef idx="1">
+                                <a:schemeClr val="accent1"/>
+                              </a:fillRef>
+                              <a:effectRef idx="0">
+                                <a:schemeClr val="accent1"/>
+                              </a:effectRef>
+                              <a:fontRef idx="minor">
+                                <a:schemeClr val="lt1"/>
+                              </a:fontRef>
+                            </wps:style>
+                            <wps:txbx>
+                              <w:txbxContent>
+                                <w:p>
+                                  <w:pPr>
+                                    <w:spacing w:after="0"/>
+                                    <w:jc w:val="center"/>
+                                    <w:rPr>
+                                      <w:b/>
+                                      <w:bCs/>
+                                      <w:color w:val="FF0000"/>
+                                      <w:sz w:val="20"/>
+                                      <w:szCs w:val="20"/>
+                                      <w14:shadow w14:blurRad="50800" w14:dist="38100" w14:dir="2700000" w14:sx="100000" w14:sy="100000" w14:kx="0" w14:ky="0" w14:algn="tl">
+                                        <w14:srgbClr w14:val="000000">
+                                          <w14:alpha w14:val="60000"/>
+                                        </w14:srgbClr>
+                                      </w14:shadow>
+                                    </w:rPr>
+                                  </w:pPr>
+                                  <w:r>
+                                    <w:rPr>
+                                      <w:b/>
+                                      <w:bCs/>
+                                      <w:color w:val="FF0000"/>
+                                      <w:sz w:val="20"/>
+                                      <w:szCs w:val="20"/>
+                                      <w14:shadow w14:blurRad="50800" w14:dist="38100" w14:dir="2700000" w14:sx="100000" w14:sy="100000" w14:kx="0" w14:ky="0" w14:algn="tl">
+                                        <w14:srgbClr w14:val="000000">
+                                          <w14:alpha w14:val="60000"/>
+                                        </w14:srgbClr>
+                                      </w14:shadow>
+                                    </w:rPr>
+                                    <w:t>Sand</w:t>
+                                  </w:r>
+                                  <w:r>
+                                    <w:rPr>
+                                      <w:b/>
+                                      <w:bCs/>
+                                      <w:color w:val="FF0000"/>
+                                      <w:sz w:val="20"/>
+                                      <w:szCs w:val="20"/>
+                                      <w14:shadow w14:blurRad="50800" w14:dist="38100" w14:dir="2700000" w14:sx="100000" w14:sy="100000" w14:kx="0" w14:ky="0" w14:algn="tl">
+                                        <w14:srgbClr w14:val="000000">
+                                          <w14:alpha w14:val="60000"/>
+                                        </w14:srgbClr>
+                                      </w14:shadow>
+                                    </w:rPr>
+                                    <w:t>er</w:t>
+                                  </w:r>
+                                </w:p>
+                              </w:txbxContent>
+                            </wps:txbx>
+                            <wps:bodyPr rot="0" spcFirstLastPara="0" vertOverflow="overflow" horzOverflow="overflow" vert="horz" wrap="square" lIns="0" tIns="0" rIns="0" bIns="0" numCol="1" spcCol="0" rtlCol="0" fromWordArt="0" anchor="ctr" anchorCtr="0" forceAA="0" compatLnSpc="1">
+                              <a:prstTxWarp prst="textNoShape">
+                                <a:avLst/>
+                              </a:prstTxWarp>
+                              <a:noAutofit/>
+                            </wps:bodyPr>
+                          </wps:wsp>
+                        </a:graphicData>
+                      </a:graphic>
+                      <wp14:sizeRelH relativeFrom="margin">
+                        <wp14:pctWidth>0</wp14:pctWidth>
+                      </wp14:sizeRelH>
+                      <wp14:sizeRelV relativeFrom="margin">
+                        <wp14:pctHeight>0</wp14:pctHeight>
+                      </wp14:sizeRelV>
+                    </wp:anchor>
+                  </w:drawing>
+                </mc:Choice>
+                <mc:Fallback>
+                  <w:pict>
+                    <v:rect w14:anchorId="30B8046B" id="_x0000_s1028" style="position:absolute;left:0;text-align:left;margin-left:143.7pt;margin-top:194.05pt;width:48.15pt;height:17pt;z-index:251675648;visibility:visible;mso-wrap-style:square;mso-width-percent:0;mso-height-percent:0;mso-wrap-distance-left:9pt;mso-wrap-distance-top:0;mso-wrap-distance-right:9pt;mso-wrap-distance-bottom:0;mso-position-horizontal:absolute;mso-position-horizontal-relative:text;mso-position-vertical:absolute;mso-position-vertical-relative:text;mso-width-percent:0;mso-height-percent:0;mso-width-relative:margin;mso-height-relative:margin;v-text-anchor:middle" o:gfxdata="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" fillcolor="black" strokecolor="red" strokeweight="1pt">
+                      <v:fill opacity="39321f"/>
+                      <v:textbox inset="0,0,0,0">
+                        <w:txbxContent>
+                          <w:p>
+                            <w:pPr>
+                              <w:spacing w:after="0"/>
+                              <w:jc w:val="center"/>
+                              <w:rPr>
+                                <w:b/>
+                                <w:bCs/>
+                                <w:color w:val="FF0000"/>
+                                <w:sz w:val="20"/>
+                                <w:szCs w:val="20"/>
+                                <w14:shadow w14:blurRad="50800" w14:dist="38100" w14:dir="2700000" w14:sx="100000" w14:sy="100000" w14:kx="0" w14:ky="0" w14:algn="tl">
+                                  <w14:srgbClr w14:val="000000">
+                                    <w14:alpha w14:val="60000"/>
+                                  </w14:srgbClr>
+                                </w14:shadow>
+                              </w:rPr>
+                            </w:pPr>
+                            <w:r>
+                              <w:rPr>
+                                <w:b/>
+                                <w:bCs/>
+                                <w:color w:val="FF0000"/>
+                                <w:sz w:val="20"/>
+                                <w:szCs w:val="20"/>
+                                <w14:shadow w14:blurRad="50800" w14:dist="38100" w14:dir="2700000" w14:sx="100000" w14:sy="100000" w14:kx="0" w14:ky="0" w14:algn="tl">
+                                  <w14:srgbClr w14:val="000000">
+                                    <w14:alpha w14:val="60000"/>
+                                  </w14:srgbClr>
+                                </w14:shadow>
+                              </w:rPr>
+                              <w:t>Sand</w:t>
+                            </w:r>
+                            <w:r>
+                              <w:rPr>
+                                <w:b/>
+                                <w:bCs/>
+                                <w:color w:val="FF0000"/>
+                                <w:sz w:val="20"/>
+                                <w:szCs w:val="20"/>
+                                <w14:shadow w14:blurRad="50800" w14:dist="38100" w14:dir="2700000" w14:sx="100000" w14:sy="100000" w14:kx="0" w14:ky="0" w14:algn="tl">
+                                  <w14:srgbClr w14:val="000000">
+                                    <w14:alpha w14:val="60000"/>
+                                  </w14:srgbClr>
+                                </w14:shadow>
+                              </w:rPr>
+                              <w:t>er</w:t>
+                            </w:r>
+                          </w:p>
+                        </w:txbxContent>
+                      </v:textbox>
+                    </v:rect>
+                  </w:pict>
+                </mc:Fallback>
+              </mc:AlternateContent>
+            </w:r>
+            <w:r>
+              <w:rPr>
+                <w:noProof/>
+                <w:color w:val="FFFFFF" w:themeColor="background1"/>
+                <w:sz w:val="32"/>
+                <w:szCs w:val="32"/>
+              </w:rPr>
+              <mc:AlternateContent>
+                <mc:Choice Requires="wps">
+                  <w:drawing>
+                    <wp:anchor distT="0" distB="0" distL="114300" distR="114300" simplePos="0" relativeHeight="251698176" behindDoc="0" locked="0" layoutInCell="1" allowOverlap="1" wp14:anchorId="0A5CB297" wp14:editId="04FFA304">
+                      <wp:simplePos x="0" y="0"/>
+                      <wp:positionH relativeFrom="column">
+                        <wp:posOffset>2922270</wp:posOffset>
+                      </wp:positionH>
+                      <wp:positionV relativeFrom="paragraph">
+                        <wp:posOffset>5260975</wp:posOffset>
+                      </wp:positionV>
+                      <wp:extent cx="742950" cy="323850"/>
+                      <wp:effectExtent l="0" t="0" r="19050" b="19050"/>
+                      <wp:wrapNone/>
+                      <wp:docPr id="1728082534" name="Rectangle 1"/>
+                      <wp:cNvGraphicFramePr/>
+                      <a:graphic xmlns:a="http://schemas.openxmlformats.org/drawingml/2006/main">
+                        <a:graphicData uri="http://schemas.microsoft.com/office/word/2010/wordprocessingShape">
+                          <wps:wsp>
+                            <wps:cNvSpPr/>
+                            <wps:spPr>
+                              <a:xfrm>
+                                <a:off x="0" y="0"/>
+                                <a:ext cx="742950" cy="323850"/>
+                              </a:xfrm>
+                              <a:prstGeom prst="rect">
+                                <a:avLst/>
+                              </a:prstGeom>
+                              <a:solidFill>
+                                <a:srgbClr val="000000">
+                                  <a:alpha val="60000"/>
+                                </a:srgbClr>
+                              </a:solidFill>
+                              <a:ln w="12700">
+                                <a:solidFill>
+                                  <a:srgbClr val="FF0000"/>
+                                </a:solidFill>
+                              </a:ln>
+                            </wps:spPr>
+                            <wps:style>
+                              <a:lnRef idx="2">
+                                <a:schemeClr val="accent1">
+                                  <a:shade val="15000"/>
+                                </a:schemeClr>
+                              </a:lnRef>
+                              <a:fillRef idx="1">
+                                <a:schemeClr val="accent1"/>
+                              </a:fillRef>
+                              <a:effectRef idx="0">
+                                <a:schemeClr val="accent1"/>
+                              </a:effectRef>
+                              <a:fontRef idx="minor">
+                                <a:schemeClr val="lt1"/>
+                              </a:fontRef>
+                            </wps:style>
+                            <wps:txbx>
+                              <w:txbxContent>
+                                <w:p>
+                                  <w:pPr>
+                                    <w:spacing w:after="0" w:line="204" w:lineRule="auto"/>
+                                    <w:jc w:val="center"/>
+                                    <w:rPr>
+                                      <w:b/>
+                                      <w:bCs/>
+                                      <w:color w:val="FF0000"/>
+                                      <w:sz w:val="20"/>
+                                      <w:szCs w:val="20"/>
+                                      <w14:shadow w14:blurRad="50800" w14:dist="38100" w14:dir="2700000" w14:sx="100000" w14:sy="100000" w14:kx="0" w14:ky="0" w14:algn="tl">
+                                        <w14:srgbClr w14:val="000000">
+                                          <w14:alpha w14:val="60000"/>
+                                        </w14:srgbClr>
+                                      </w14:shadow>
+                                    </w:rPr>
+                                  </w:pPr>
+                                  <w:r>
+                                    <w:rPr>
+                                      <w:b/>
+                                      <w:bCs/>
+                                      <w:color w:val="FF0000"/>
+                                      <w:sz w:val="20"/>
+                                      <w:szCs w:val="20"/>
+                                      <w14:shadow w14:blurRad="50800" w14:dist="38100" w14:dir="2700000" w14:sx="100000" w14:sy="100000" w14:kx="0" w14:ky="0" w14:algn="tl">
+                                        <w14:srgbClr w14:val="000000">
+                                          <w14:alpha w14:val="60000"/>
+                                        </w14:srgbClr>
+                                      </w14:shadow>
+                                    </w:rPr>
+                                    <w:t>Headlights</w:t>
+                                  </w:r>
+                                  <w:r>
+                                    <w:rPr>
+                                      <w:b/>
+                                      <w:bCs/>
+                                      <w:color w:val="FF0000"/>
+                                      <w:sz w:val="20"/>
+                                      <w:szCs w:val="20"/>
+                                      <w14:shadow w14:blurRad="50800" w14:dist="38100" w14:dir="2700000" w14:sx="100000" w14:sy="100000" w14:kx="0" w14:ky="0" w14:algn="tl">
+                                        <w14:srgbClr w14:val="000000">
+                                          <w14:alpha w14:val="60000"/>
+                                        </w14:srgbClr>
+                                      </w14:shadow>
+                                    </w:rPr>
+                                    <w:br/>
+                                    <w:t>←</w:t>
+                                  </w:r>
+                                  <w:proofErr w:type="gramStart"/>
+                                  <w:r>
+                                    <w:rPr>
+                                      <w:b/>
+                                      <w:bCs/>
+                                      <w:color w:val="FF0000"/>
+                                      <w:sz w:val="20"/>
+                                      <w:szCs w:val="20"/>
+                                      <w14:shadow w14:blurRad="50800" w14:dist="38100" w14:dir="2700000" w14:sx="100000" w14:sy="100000" w14:kx="0" w14:ky="0" w14:algn="tl">
+                                        <w14:srgbClr w14:val="000000">
+                                          <w14:alpha w14:val="60000"/>
+                                        </w14:srgbClr>
+                                      </w14:shadow>
+                                    </w:rPr>
+                                    <w:t xml:space="preserve">dec  </w:t>
+                                  </w:r>
+                                  <w:proofErr w:type="spellStart"/>
+                                  <w:r>
+                                    <w:rPr>
+                                      <w:b/>
+                                      <w:bCs/>
+                                      <w:color w:val="FF0000"/>
+                                      <w:sz w:val="20"/>
+                                      <w:szCs w:val="20"/>
+                                      <w14:shadow w14:blurRad="50800" w14:dist="38100" w14:dir="2700000" w14:sx="100000" w14:sy="100000" w14:kx="0" w14:ky="0" w14:algn="tl">
+                                        <w14:srgbClr w14:val="000000">
+                                          <w14:alpha w14:val="60000"/>
+                                        </w14:srgbClr>
+                                      </w14:shadow>
+                                    </w:rPr>
+                                    <w:t>inc</w:t>
+                                  </w:r>
+                                  <w:proofErr w:type="spellEnd"/>
+                                  <w:proofErr w:type="gramEnd"/>
+                                  <w:r>
+                                    <w:rPr>
+                                      <w:b/>
+                                      <w:bCs/>
+                                      <w:color w:val="FF0000"/>
+                                      <w:sz w:val="20"/>
+                                      <w:szCs w:val="20"/>
+                                      <w14:shadow w14:blurRad="50800" w14:dist="38100" w14:dir="2700000" w14:sx="100000" w14:sy="100000" w14:kx="0" w14:ky="0" w14:algn="tl">
+                                        <w14:srgbClr w14:val="000000">
+                                          <w14:alpha w14:val="60000"/>
+                                        </w14:srgbClr>
+                                      </w14:shadow>
+                                    </w:rPr>
+                                    <w:t>→</w:t>
+                                  </w:r>
+                                </w:p>
+                              </w:txbxContent>
+                            </wps:txbx>
+                            <wps:bodyPr rot="0" spcFirstLastPara="0" vertOverflow="overflow" horzOverflow="overflow" vert="horz" wrap="square" lIns="0" tIns="0" rIns="0" bIns="0" numCol="1" spcCol="0" rtlCol="0" fromWordArt="0" anchor="ctr" anchorCtr="0" forceAA="0" compatLnSpc="1">
+                              <a:prstTxWarp prst="textNoShape">
+                                <a:avLst/>
+                              </a:prstTxWarp>
+                              <a:noAutofit/>
+                            </wps:bodyPr>
+                          </wps:wsp>
+                        </a:graphicData>
+                      </a:graphic>
+                      <wp14:sizeRelH relativeFrom="margin">
+                        <wp14:pctWidth>0</wp14:pctWidth>
+                      </wp14:sizeRelH>
+                      <wp14:sizeRelV relativeFrom="margin">
+                        <wp14:pctHeight>0</wp14:pctHeight>
+                      </wp14:sizeRelV>
+                    </wp:anchor>
+                  </w:drawing>
+                </mc:Choice>
+                <mc:Fallback>
+                  <w:pict>
+                    <v:rect w14:anchorId="0A5CB297" id="_x0000_s1029" style="position:absolute;left:0;text-align:left;margin-left:230.1pt;margin-top:414.25pt;width:58.5pt;height:25.5pt;z-index:251698176;visibility:visible;mso-wrap-style:square;mso-width-percent:0;mso-height-percent:0;mso-wrap-distance-left:9pt;mso-wrap-distance-top:0;mso-wrap-distance-right:9pt;mso-wrap-distance-bottom:0;mso-position-horizontal:absolute;mso-position-horizontal-relative:text;mso-position-vertical:absolute;mso-position-vertical-relative:text;mso-width-percent:0;mso-height-percent:0;mso-width-relative:margin;mso-height-relative:margin;v-text-anchor:middle" o:gfxdata="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" fillcolor="black" strokecolor="red" strokeweight="1pt">
+                      <v:fill opacity="39321f"/>
+                      <v:textbox inset="0,0,0,0">
+                        <w:txbxContent>
+                          <w:p>
+                            <w:pPr>
+                              <w:spacing w:after="0" w:line="204" w:lineRule="auto"/>
+                              <w:jc w:val="center"/>
+                              <w:rPr>
+                                <w:b/>
+                                <w:bCs/>
+                                <w:color w:val="FF0000"/>
+                                <w:sz w:val="20"/>
+                                <w:szCs w:val="20"/>
+                                <w14:shadow w14:blurRad="50800" w14:dist="38100" w14:dir="2700000" w14:sx="100000" w14:sy="100000" w14:kx="0" w14:ky="0" w14:algn="tl">
+                                  <w14:srgbClr w14:val="000000">
+                                    <w14:alpha w14:val="60000"/>
+                                  </w14:srgbClr>
+                                </w14:shadow>
+                              </w:rPr>
+                            </w:pPr>
+                            <w:r>
+                              <w:rPr>
+                                <w:b/>
+                                <w:bCs/>
+                                <w:color w:val="FF0000"/>
+                                <w:sz w:val="20"/>
+                                <w:szCs w:val="20"/>
+                                <w14:shadow w14:blurRad="50800" w14:dist="38100" w14:dir="2700000" w14:sx="100000" w14:sy="100000" w14:kx="0" w14:ky="0" w14:algn="tl">
+                                  <w14:srgbClr w14:val="000000">
+                                    <w14:alpha w14:val="60000"/>
+                                  </w14:srgbClr>
+                                </w14:shadow>
+                              </w:rPr>
+                              <w:t>Headlights</w:t>
+                            </w:r>
+                            <w:r>
+                              <w:rPr>
+                                <w:b/>
+                                <w:bCs/>
+                                <w:color w:val="FF0000"/>
+                                <w:sz w:val="20"/>
+                                <w:szCs w:val="20"/>
+                                <w14:shadow w14:blurRad="50800" w14:dist="38100" w14:dir="2700000" w14:sx="100000" w14:sy="100000" w14:kx="0" w14:ky="0" w14:algn="tl">
+                                  <w14:srgbClr w14:val="000000">
+                                    <w14:alpha w14:val="60000"/>
+                                  </w14:srgbClr>
+                                </w14:shadow>
+                              </w:rPr>
+                              <w:br/>
+                              <w:t>←</w:t>
+                            </w:r>
+                            <w:proofErr w:type="gramStart"/>
+                            <w:r>
+                              <w:rPr>
+                                <w:b/>
+                                <w:bCs/>
+                                <w:color w:val="FF0000"/>
+                                <w:sz w:val="20"/>
+                                <w:szCs w:val="20"/>
+                                <w14:shadow w14:blurRad="50800" w14:dist="38100" w14:dir="2700000" w14:sx="100000" w14:sy="100000" w14:kx="0" w14:ky="0" w14:algn="tl">
+                                  <w14:srgbClr w14:val="000000">
+                                    <w14:alpha w14:val="60000"/>
+                                  </w14:srgbClr>
+                                </w14:shadow>
+                              </w:rPr>
+                              <w:t xml:space="preserve">dec  </w:t>
+                            </w:r>
+                            <w:proofErr w:type="spellStart"/>
+                            <w:r>
+                              <w:rPr>
+                                <w:b/>
+                                <w:bCs/>
+                                <w:color w:val="FF0000"/>
+                                <w:sz w:val="20"/>
+                                <w:szCs w:val="20"/>
+                                <w14:shadow w14:blurRad="50800" w14:dist="38100" w14:dir="2700000" w14:sx="100000" w14:sy="100000" w14:kx="0" w14:ky="0" w14:algn="tl">
+                                  <w14:srgbClr w14:val="000000">
+                                    <w14:alpha w14:val="60000"/>
+                                  </w14:srgbClr>
+                                </w14:shadow>
+                              </w:rPr>
+                              <w:t>inc</w:t>
+                            </w:r>
+                            <w:proofErr w:type="spellEnd"/>
+                            <w:proofErr w:type="gramEnd"/>
+                            <w:r>
+                              <w:rPr>
+                                <w:b/>
+                                <w:bCs/>
+                                <w:color w:val="FF0000"/>
+                                <w:sz w:val="20"/>
+                                <w:szCs w:val="20"/>
+                                <w14:shadow w14:blurRad="50800" w14:dist="38100" w14:dir="2700000" w14:sx="100000" w14:sy="100000" w14:kx="0" w14:ky="0" w14:algn="tl">
+                                  <w14:srgbClr w14:val="000000">
+                                    <w14:alpha w14:val="60000"/>
+                                  </w14:srgbClr>
+                                </w14:shadow>
+                              </w:rPr>
+                              <w:t>→</w:t>
+                            </w:r>
+                          </w:p>
+                        </w:txbxContent>
+                      </v:textbox>
+                    </v:rect>
+                  </w:pict>
+                </mc:Fallback>
+              </mc:AlternateContent>
+            </w:r>
+            <w:r>
+              <w:rPr>
+                <w:noProof/>
+                <w:color w:val="FFFFFF" w:themeColor="background1"/>
+                <w:sz w:val="32"/>
+                <w:szCs w:val="32"/>
+              </w:rPr>
+              <mc:AlternateContent>
+                <mc:Choice Requires="wps">
+                  <w:drawing>
+                    <wp:anchor distT="0" distB="0" distL="114300" distR="114300" simplePos="0" relativeHeight="251696128" behindDoc="0" locked="0" layoutInCell="1" allowOverlap="1" wp14:anchorId="2EAC73DA" wp14:editId="479F5335">
+                      <wp:simplePos x="0" y="0"/>
+                      <wp:positionH relativeFrom="column">
+                        <wp:posOffset>1267460</wp:posOffset>
+                      </wp:positionH>
+                      <wp:positionV relativeFrom="paragraph">
+                        <wp:posOffset>4737100</wp:posOffset>
+                      </wp:positionV>
+                      <wp:extent cx="771525" cy="536575"/>
+                      <wp:effectExtent l="0" t="0" r="28575" b="15875"/>
+                      <wp:wrapNone/>
+                      <wp:docPr id="1629558082" name="Rectangle 1"/>
+                      <wp:cNvGraphicFramePr/>
+                      <a:graphic xmlns:a="http://schemas.openxmlformats.org/drawingml/2006/main">
+                        <a:graphicData uri="http://schemas.microsoft.com/office/word/2010/wordprocessingShape">
+                          <wps:wsp>
+                            <wps:cNvSpPr/>
+                            <wps:spPr>
+                              <a:xfrm>
+                                <a:off x="0" y="0"/>
+                                <a:ext cx="771525" cy="536575"/>
+                              </a:xfrm>
+                              <a:prstGeom prst="rect">
+                                <a:avLst/>
+                              </a:prstGeom>
+                              <a:solidFill>
+                                <a:srgbClr val="000000">
+                                  <a:alpha val="60000"/>
+                                </a:srgbClr>
+                              </a:solidFill>
+                              <a:ln w="12700">
+                                <a:solidFill>
+                                  <a:srgbClr val="FF0000"/>
+                                </a:solidFill>
+                              </a:ln>
+                            </wps:spPr>
+                            <wps:style>
+                              <a:lnRef idx="2">
+                                <a:schemeClr val="accent1">
+                                  <a:shade val="15000"/>
+                                </a:schemeClr>
+                              </a:lnRef>
+                              <a:fillRef idx="1">
+                                <a:schemeClr val="accent1"/>
+                              </a:fillRef>
+                              <a:effectRef idx="0">
+                                <a:schemeClr val="accent1"/>
+                              </a:effectRef>
+                              <a:fontRef idx="minor">
+                                <a:schemeClr val="lt1"/>
+                              </a:fontRef>
+                            </wps:style>
+                            <wps:txbx>
+                              <w:txbxContent>
+                                <w:p>
+                                  <w:pPr>
+                                    <w:spacing w:after="0" w:line="204" w:lineRule="auto"/>
+                                    <w:jc w:val="center"/>
+                                    <w:rPr>
+                                      <w:b/>
+                                      <w:bCs/>
+                                      <w:color w:val="FF0000"/>
+                                      <w:sz w:val="20"/>
+                                      <w:szCs w:val="20"/>
+                                      <w14:shadow w14:blurRad="50800" w14:dist="38100" w14:dir="2700000" w14:sx="100000" w14:sy="100000" w14:kx="0" w14:ky="0" w14:algn="tl">
+                                        <w14:srgbClr w14:val="000000">
+                                          <w14:alpha w14:val="60000"/>
+                                        </w14:srgbClr>
+                                      </w14:shadow>
+                                    </w:rPr>
+                                  </w:pPr>
+                                  <w:r>
+                                    <w:rPr>
+                                      <w:b/>
+                                      <w:bCs/>
+                                      <w:color w:val="FF0000"/>
+                                      <w:sz w:val="20"/>
+                                      <w:szCs w:val="20"/>
+                                      <w14:shadow w14:blurRad="50800" w14:dist="38100" w14:dir="2700000" w14:sx="100000" w14:sy="100000" w14:kx="0" w14:ky="0" w14:algn="tl">
+                                        <w14:srgbClr w14:val="000000">
+                                          <w14:alpha w14:val="60000"/>
+                                        </w14:srgbClr>
+                                      </w14:shadow>
+                                    </w:rPr>
+                                    <w:t>Destination</w:t>
+                                  </w:r>
+                                  <w:r>
+                                    <w:rPr>
+                                      <w:b/>
+                                      <w:bCs/>
+                                      <w:color w:val="FF0000"/>
+                                      <w:sz w:val="20"/>
+                                      <w:szCs w:val="20"/>
+                                      <w14:shadow w14:blurRad="50800" w14:dist="38100" w14:dir="2700000" w14:sx="100000" w14:sy="100000" w14:kx="0" w14:ky="0" w14:algn="tl">
+                                        <w14:srgbClr w14:val="000000">
+                                          <w14:alpha w14:val="60000"/>
+                                        </w14:srgbClr>
+                                      </w14:shadow>
+                                    </w:rPr>
+                                    <w:br/>
+                                    <w:t>boards</w:t>
+                                  </w:r>
+                                  <w:r>
+                                    <w:rPr>
+                                      <w:b/>
+                                      <w:bCs/>
+                                      <w:color w:val="FF0000"/>
+                                      <w:sz w:val="20"/>
+                                      <w:szCs w:val="20"/>
+                                      <w14:shadow w14:blurRad="50800" w14:dist="38100" w14:dir="2700000" w14:sx="100000" w14:sy="100000" w14:kx="0" w14:ky="0" w14:algn="tl">
+                                        <w14:srgbClr w14:val="000000">
+                                          <w14:alpha w14:val="60000"/>
+                                        </w14:srgbClr>
+                                      </w14:shadow>
+                                    </w:rPr>
+                                    <w:br/>
+                                  </w:r>
+                                  <w:r>
+                                    <w:rPr>
+                                      <w:rFonts w:ascii="Cambria Math" w:hAnsi="Cambria Math" w:cs="Cambria Math"/>
+                                      <w:b/>
+                                      <w:bCs/>
+                                      <w:color w:val="FF0000"/>
+                                      <w:sz w:val="20"/>
+                                      <w:szCs w:val="20"/>
+                                      <w14:shadow w14:blurRad="50800" w14:dist="38100" w14:dir="2700000" w14:sx="100000" w14:sy="100000" w14:kx="0" w14:ky="0" w14:algn="tl">
+                                        <w14:srgbClr w14:val="000000">
+                                          <w14:alpha w14:val="60000"/>
+                                        </w14:srgbClr>
+                                      </w14:shadow>
+                                    </w:rPr>
+                                    <w:t>↶</w:t>
+                                  </w:r>
+                                  <w:r>
+                                    <w:rPr>
+                                      <w:rFonts w:cs="Cambria Math"/>
+                                      <w:b/>
+                                      <w:bCs/>
+                                      <w:color w:val="FF0000"/>
+                                      <w:sz w:val="20"/>
+                                      <w:szCs w:val="20"/>
+                                      <w14:shadow w14:blurRad="50800" w14:dist="38100" w14:dir="2700000" w14:sx="100000" w14:sy="100000" w14:kx="0" w14:ky="0" w14:algn="tl">
+                                        <w14:srgbClr w14:val="000000">
+                                          <w14:alpha w14:val="60000"/>
+                                        </w14:srgbClr>
+                                      </w14:shadow>
+                                    </w:rPr>
+                                    <w:t>0/1</w:t>
+                                  </w:r>
+                                  <w:r>
+                                    <w:rPr>
+                                      <w:b/>
+                                      <w:bCs/>
+                                      <w:color w:val="FF0000"/>
+                                      <w:sz w:val="20"/>
+                                      <w:szCs w:val="20"/>
+                                      <w14:shadow w14:blurRad="50800" w14:dist="38100" w14:dir="2700000" w14:sx="100000" w14:sy="100000" w14:kx="0" w14:ky="0" w14:algn="tl">
+                                        <w14:srgbClr w14:val="000000">
+                                          <w14:alpha w14:val="60000"/>
+                                        </w14:srgbClr>
+                                      </w14:shadow>
+                                    </w:rPr>
+                                    <w:t xml:space="preserve">   3/4</w:t>
+                                  </w:r>
+                                  <w:r>
+                                    <w:rPr>
+                                      <w:rFonts w:ascii="Cambria Math" w:hAnsi="Cambria Math" w:cs="Cambria Math"/>
+                                      <w:b/>
+                                      <w:bCs/>
+                                      <w:color w:val="FF0000"/>
+                                      <w:sz w:val="20"/>
+                                      <w:szCs w:val="20"/>
+                                      <w14:shadow w14:blurRad="50800" w14:dist="38100" w14:dir="2700000" w14:sx="100000" w14:sy="100000" w14:kx="0" w14:ky="0" w14:algn="tl">
+                                        <w14:srgbClr w14:val="000000">
+                                          <w14:alpha w14:val="60000"/>
+                                        </w14:srgbClr>
+                                      </w14:shadow>
+                                    </w:rPr>
+                                    <w:t>↷</w:t>
+                                  </w:r>
+                                </w:p>
+                              </w:txbxContent>
+                            </wps:txbx>
+                            <wps:bodyPr rot="0" spcFirstLastPara="0" vertOverflow="overflow" horzOverflow="overflow" vert="horz" wrap="square" lIns="0" tIns="0" rIns="0" bIns="0" numCol="1" spcCol="0" rtlCol="0" fromWordArt="0" anchor="ctr" anchorCtr="0" forceAA="0" compatLnSpc="1">
+                              <a:prstTxWarp prst="textNoShape">
+                                <a:avLst/>
+                              </a:prstTxWarp>
+                              <a:noAutofit/>
+                            </wps:bodyPr>
+                          </wps:wsp>
+                        </a:graphicData>
+                      </a:graphic>
+                      <wp14:sizeRelH relativeFrom="margin">
+                        <wp14:pctWidth>0</wp14:pctWidth>
+                      </wp14:sizeRelH>
+                      <wp14:sizeRelV relativeFrom="margin">
+                        <wp14:pctHeight>0</wp14:pctHeight>
+                      </wp14:sizeRelV>
+                    </wp:anchor>
+                  </w:drawing>
+                </mc:Choice>
+                <mc:Fallback>
+                  <w:pict>
+                    <v:rect w14:anchorId="2EAC73DA" id="_x0000_s1030" style="position:absolute;left:0;text-align:left;margin-left:99.8pt;margin-top:373pt;width:60.75pt;height:42.25pt;z-index:251696128;visibility:visible;mso-wrap-style:square;mso-width-percent:0;mso-height-percent:0;mso-wrap-distance-left:9pt;mso-wrap-distance-top:0;mso-wrap-distance-right:9pt;mso-wrap-distance-bottom:0;mso-position-horizontal:absolute;mso-position-horizontal-relative:text;mso-position-vertical:absolute;mso-position-vertical-relative:text;mso-width-percent:0;mso-height-percent:0;mso-width-relative:margin;mso-height-relative:margin;v-text-anchor:middle" o:gfxdata="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" fillcolor="black" strokecolor="red" strokeweight="1pt">
+                      <v:fill opacity="39321f"/>
+                      <v:textbox inset="0,0,0,0">
+                        <w:txbxContent>
+                          <w:p>
+                            <w:pPr>
+                              <w:spacing w:after="0" w:line="204" w:lineRule="auto"/>
+                              <w:jc w:val="center"/>
+                              <w:rPr>
+                                <w:b/>
+                                <w:bCs/>
+                                <w:color w:val="FF0000"/>
+                                <w:sz w:val="20"/>
+                                <w:szCs w:val="20"/>
+                                <w14:shadow w14:blurRad="50800" w14:dist="38100" w14:dir="2700000" w14:sx="100000" w14:sy="100000" w14:kx="0" w14:ky="0" w14:algn="tl">
+                                  <w14:srgbClr w14:val="000000">
+                                    <w14:alpha w14:val="60000"/>
+                                  </w14:srgbClr>
+                                </w14:shadow>
+                              </w:rPr>
+                            </w:pPr>
+                            <w:r>
+                              <w:rPr>
+                                <w:b/>
+                                <w:bCs/>
+                                <w:color w:val="FF0000"/>
+                                <w:sz w:val="20"/>
+                                <w:szCs w:val="20"/>
+                                <w14:shadow w14:blurRad="50800" w14:dist="38100" w14:dir="2700000" w14:sx="100000" w14:sy="100000" w14:kx="0" w14:ky="0" w14:algn="tl">
+                                  <w14:srgbClr w14:val="000000">
+                                    <w14:alpha w14:val="60000"/>
+                                  </w14:srgbClr>
+                                </w14:shadow>
+                              </w:rPr>
+                              <w:t>Destination</w:t>
+                            </w:r>
+                            <w:r>
+                              <w:rPr>
+                                <w:b/>
+                                <w:bCs/>
+                                <w:color w:val="FF0000"/>
+                                <w:sz w:val="20"/>
+                                <w:szCs w:val="20"/>
+                                <w14:shadow w14:blurRad="50800" w14:dist="38100" w14:dir="2700000" w14:sx="100000" w14:sy="100000" w14:kx="0" w14:ky="0" w14:algn="tl">
+                                  <w14:srgbClr w14:val="000000">
+                                    <w14:alpha w14:val="60000"/>
+                                  </w14:srgbClr>
+                                </w14:shadow>
+                              </w:rPr>
+                              <w:br/>
+                              <w:t>boards</w:t>
+                            </w:r>
+                            <w:r>
+                              <w:rPr>
+                                <w:b/>
+                                <w:bCs/>
+                                <w:color w:val="FF0000"/>
+                                <w:sz w:val="20"/>
+                                <w:szCs w:val="20"/>
+                                <w14:shadow w14:blurRad="50800" w14:dist="38100" w14:dir="2700000" w14:sx="100000" w14:sy="100000" w14:kx="0" w14:ky="0" w14:algn="tl">
+                                  <w14:srgbClr w14:val="000000">
+                                    <w14:alpha w14:val="60000"/>
+                                  </w14:srgbClr>
+                                </w14:shadow>
+                              </w:rPr>
+                              <w:br/>
+                            </w:r>
+                            <w:r>
+                              <w:rPr>
+                                <w:rFonts w:ascii="Cambria Math" w:hAnsi="Cambria Math" w:cs="Cambria Math"/>
+                                <w:b/>
+                                <w:bCs/>
+                                <w:color w:val="FF0000"/>
+                                <w:sz w:val="20"/>
+                                <w:szCs w:val="20"/>
+                                <w14:shadow w14:blurRad="50800" w14:dist="38100" w14:dir="2700000" w14:sx="100000" w14:sy="100000" w14:kx="0" w14:ky="0" w14:algn="tl">
+                                  <w14:srgbClr w14:val="000000">
+                                    <w14:alpha w14:val="60000"/>
+                                  </w14:srgbClr>
+                                </w14:shadow>
+                              </w:rPr>
+                              <w:t>↶</w:t>
+                            </w:r>
+                            <w:r>
+                              <w:rPr>
+                                <w:rFonts w:cs="Cambria Math"/>
+                                <w:b/>
+                                <w:bCs/>
+                                <w:color w:val="FF0000"/>
+                                <w:sz w:val="20"/>
+                                <w:szCs w:val="20"/>
+                                <w14:shadow w14:blurRad="50800" w14:dist="38100" w14:dir="2700000" w14:sx="100000" w14:sy="100000" w14:kx="0" w14:ky="0" w14:algn="tl">
+                                  <w14:srgbClr w14:val="000000">
+                                    <w14:alpha w14:val="60000"/>
+                                  </w14:srgbClr>
+                                </w14:shadow>
+                              </w:rPr>
+                              <w:t>0/1</w:t>
+                            </w:r>
+                            <w:r>
+                              <w:rPr>
+                                <w:b/>
+                                <w:bCs/>
+                                <w:color w:val="FF0000"/>
+                                <w:sz w:val="20"/>
+                                <w:szCs w:val="20"/>
+                                <w14:shadow w14:blurRad="50800" w14:dist="38100" w14:dir="2700000" w14:sx="100000" w14:sy="100000" w14:kx="0" w14:ky="0" w14:algn="tl">
+                                  <w14:srgbClr w14:val="000000">
+                                    <w14:alpha w14:val="60000"/>
+                                  </w14:srgbClr>
+                                </w14:shadow>
+                              </w:rPr>
+                              <w:t xml:space="preserve">   3/4</w:t>
+                            </w:r>
+                            <w:r>
+                              <w:rPr>
+                                <w:rFonts w:ascii="Cambria Math" w:hAnsi="Cambria Math" w:cs="Cambria Math"/>
+                                <w:b/>
+                                <w:bCs/>
+                                <w:color w:val="FF0000"/>
+                                <w:sz w:val="20"/>
+                                <w:szCs w:val="20"/>
+                                <w14:shadow w14:blurRad="50800" w14:dist="38100" w14:dir="2700000" w14:sx="100000" w14:sy="100000" w14:kx="0" w14:ky="0" w14:algn="tl">
+                                  <w14:srgbClr w14:val="000000">
+                                    <w14:alpha w14:val="60000"/>
+                                  </w14:srgbClr>
+                                </w14:shadow>
+                              </w:rPr>
+                              <w:t>↷</w:t>
+                            </w:r>
+                          </w:p>
+                        </w:txbxContent>
+                      </v:textbox>
+                    </v:rect>
+                  </w:pict>
+                </mc:Fallback>
+              </mc:AlternateContent>
+            </w:r>
+            <w:r>
+              <w:rPr>
+                <w:noProof/>
+                <w:color w:val="FFFFFF" w:themeColor="background1"/>
+                <w:sz w:val="32"/>
+                <w:szCs w:val="32"/>
+              </w:rPr>
+              <mc:AlternateContent>
+                <mc:Choice Requires="wps">
+                  <w:drawing>
+                    <wp:anchor distT="0" distB="0" distL="114300" distR="114300" simplePos="0" relativeHeight="251692032" behindDoc="0" locked="0" layoutInCell="1" allowOverlap="1" wp14:anchorId="5011B118" wp14:editId="74FD1FC7">
+                      <wp:simplePos x="0" y="0"/>
+                      <wp:positionH relativeFrom="column">
+                        <wp:posOffset>4922520</wp:posOffset>
+                      </wp:positionH>
+                      <wp:positionV relativeFrom="paragraph">
+                        <wp:posOffset>4178300</wp:posOffset>
+                      </wp:positionV>
+                      <wp:extent cx="497205" cy="323850"/>
+                      <wp:effectExtent l="0" t="0" r="17145" b="19050"/>
+                      <wp:wrapNone/>
+                      <wp:docPr id="7998109" name="Rectangle 1"/>
+                      <wp:cNvGraphicFramePr/>
+                      <a:graphic xmlns:a="http://schemas.openxmlformats.org/drawingml/2006/main">
+                        <a:graphicData uri="http://schemas.microsoft.com/office/word/2010/wordprocessingShape">
+                          <wps:wsp>
+                            <wps:cNvSpPr/>
+                            <wps:spPr>
+                              <a:xfrm>
+                                <a:off x="0" y="0"/>
+                                <a:ext cx="497205" cy="323850"/>
+                              </a:xfrm>
+                              <a:prstGeom prst="rect">
+                                <a:avLst/>
+                              </a:prstGeom>
+                              <a:solidFill>
+                                <a:srgbClr val="000000">
+                                  <a:alpha val="60000"/>
+                                </a:srgbClr>
+                              </a:solidFill>
+                              <a:ln w="12700">
+                                <a:solidFill>
+                                  <a:srgbClr val="FF0000"/>
+                                </a:solidFill>
+                              </a:ln>
+                            </wps:spPr>
+                            <wps:style>
+                              <a:lnRef idx="2">
+                                <a:schemeClr val="accent1">
+                                  <a:shade val="15000"/>
+                                </a:schemeClr>
+                              </a:lnRef>
+                              <a:fillRef idx="1">
+                                <a:schemeClr val="accent1"/>
+                              </a:fillRef>
+                              <a:effectRef idx="0">
+                                <a:schemeClr val="accent1"/>
+                              </a:effectRef>
+                              <a:fontRef idx="minor">
+                                <a:schemeClr val="lt1"/>
+                              </a:fontRef>
+                            </wps:style>
+                            <wps:txbx>
+                              <w:txbxContent>
+                                <w:p>
+                                  <w:pPr>
+                                    <w:spacing w:after="0" w:line="204" w:lineRule="auto"/>
+                                    <w:jc w:val="center"/>
+                                    <w:rPr>
+                                      <w:b/>
+                                      <w:bCs/>
+                                      <w:color w:val="FF0000"/>
+                                      <w:sz w:val="20"/>
+                                      <w:szCs w:val="20"/>
+                                      <w14:shadow w14:blurRad="50800" w14:dist="38100" w14:dir="2700000" w14:sx="100000" w14:sy="100000" w14:kx="0" w14:ky="0" w14:algn="tl">
+                                        <w14:srgbClr w14:val="000000">
+                                          <w14:alpha w14:val="60000"/>
+                                        </w14:srgbClr>
+                                      </w14:shadow>
+                                    </w:rPr>
+                                  </w:pPr>
+                                  <w:r>
+                                    <w:rPr>
+                                      <w:b/>
+                                      <w:bCs/>
+                                      <w:color w:val="FF0000"/>
+                                      <w:sz w:val="20"/>
+                                      <w:szCs w:val="20"/>
+                                      <w14:shadow w14:blurRad="50800" w14:dist="38100" w14:dir="2700000" w14:sx="100000" w14:sy="100000" w14:kx="0" w14:ky="0" w14:algn="tl">
+                                        <w14:srgbClr w14:val="000000">
+                                          <w14:alpha w14:val="60000"/>
+                                        </w14:srgbClr>
+                                      </w14:shadow>
+                                    </w:rPr>
+                                    <w:t>Doors</w:t>
+                                  </w:r>
+                                  <w:r>
+                                    <w:rPr>
+                                      <w:b/>
+                                      <w:bCs/>
+                                      <w:color w:val="FF0000"/>
+                                      <w:sz w:val="20"/>
+                                      <w:szCs w:val="20"/>
+                                      <w14:shadow w14:blurRad="50800" w14:dist="38100" w14:dir="2700000" w14:sx="100000" w14:sy="100000" w14:kx="0" w14:ky="0" w14:algn="tl">
+                                        <w14:srgbClr w14:val="000000">
+                                          <w14:alpha w14:val="60000"/>
+                                        </w14:srgbClr>
+                                      </w14:shadow>
+                                    </w:rPr>
+                                    <w:br/>
+                                    <w:t>←</w:t>
+                                  </w:r>
+                                  <w:proofErr w:type="gramStart"/>
+                                  <w:r>
+                                    <w:rPr>
+                                      <w:b/>
+                                      <w:bCs/>
+                                      <w:color w:val="FF0000"/>
+                                      <w:sz w:val="20"/>
+                                      <w:szCs w:val="20"/>
+                                      <w14:shadow w14:blurRad="50800" w14:dist="38100" w14:dir="2700000" w14:sx="100000" w14:sy="100000" w14:kx="0" w14:ky="0" w14:algn="tl">
+                                        <w14:srgbClr w14:val="000000">
+                                          <w14:alpha w14:val="60000"/>
+                                        </w14:srgbClr>
+                                      </w14:shadow>
+                                    </w:rPr>
+                                    <w:t>L  R</w:t>
+                                  </w:r>
+                                  <w:proofErr w:type="gramEnd"/>
+                                  <w:r>
+                                    <w:rPr>
+                                      <w:b/>
+                                      <w:bCs/>
+                                      <w:color w:val="FF0000"/>
+                                      <w:sz w:val="20"/>
+                                      <w:szCs w:val="20"/>
+                                      <w14:shadow w14:blurRad="50800" w14:dist="38100" w14:dir="2700000" w14:sx="100000" w14:sy="100000" w14:kx="0" w14:ky="0" w14:algn="tl">
+                                        <w14:srgbClr w14:val="000000">
+                                          <w14:alpha w14:val="60000"/>
+                                        </w14:srgbClr>
+                                      </w14:shadow>
+                                    </w:rPr>
+                                    <w:t>→</w:t>
+                                  </w:r>
+                                </w:p>
+                              </w:txbxContent>
+                            </wps:txbx>
+                            <wps:bodyPr rot="0" spcFirstLastPara="0" vertOverflow="overflow" horzOverflow="overflow" vert="horz" wrap="square" lIns="0" tIns="0" rIns="0" bIns="0" numCol="1" spcCol="0" rtlCol="0" fromWordArt="0" anchor="ctr" anchorCtr="0" forceAA="0" compatLnSpc="1">
+                              <a:prstTxWarp prst="textNoShape">
+                                <a:avLst/>
+                              </a:prstTxWarp>
+                              <a:noAutofit/>
+                            </wps:bodyPr>
+                          </wps:wsp>
+                        </a:graphicData>
+                      </a:graphic>
+                      <wp14:sizeRelH relativeFrom="margin">
+                        <wp14:pctWidth>0</wp14:pctWidth>
+                      </wp14:sizeRelH>
+                      <wp14:sizeRelV relativeFrom="margin">
+                        <wp14:pctHeight>0</wp14:pctHeight>
+                      </wp14:sizeRelV>
+                    </wp:anchor>
+                  </w:drawing>
+                </mc:Choice>
+                <mc:Fallback>
+                  <w:pict>
+                    <v:rect w14:anchorId="5011B118" id="_x0000_s1031" style="position:absolute;left:0;text-align:left;margin-left:387.6pt;margin-top:329pt;width:39.15pt;height:25.5pt;z-index:251692032;visibility:visible;mso-wrap-style:square;mso-width-percent:0;mso-height-percent:0;mso-wrap-distance-left:9pt;mso-wrap-distance-top:0;mso-wrap-distance-right:9pt;mso-wrap-distance-bottom:0;mso-position-horizontal:absolute;mso-position-horizontal-relative:text;mso-position-vertical:absolute;mso-position-vertical-relative:text;mso-width-percent:0;mso-height-percent:0;mso-width-relative:margin;mso-height-relative:margin;v-text-anchor:middle" o:gfxdata="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" fillcolor="black" strokecolor="red" strokeweight="1pt">
+                      <v:fill opacity="39321f"/>
+                      <v:textbox inset="0,0,0,0">
+                        <w:txbxContent>
+                          <w:p>
+                            <w:pPr>
+                              <w:spacing w:after="0" w:line="204" w:lineRule="auto"/>
+                              <w:jc w:val="center"/>
+                              <w:rPr>
+                                <w:b/>
+                                <w:bCs/>
+                                <w:color w:val="FF0000"/>
+                                <w:sz w:val="20"/>
+                                <w:szCs w:val="20"/>
+                                <w14:shadow w14:blurRad="50800" w14:dist="38100" w14:dir="2700000" w14:sx="100000" w14:sy="100000" w14:kx="0" w14:ky="0" w14:algn="tl">
+                                  <w14:srgbClr w14:val="000000">
+                                    <w14:alpha w14:val="60000"/>
+                                  </w14:srgbClr>
+                                </w14:shadow>
+                              </w:rPr>
+                            </w:pPr>
+                            <w:r>
+                              <w:rPr>
+                                <w:b/>
+                                <w:bCs/>
+                                <w:color w:val="FF0000"/>
+                                <w:sz w:val="20"/>
+                                <w:szCs w:val="20"/>
+                                <w14:shadow w14:blurRad="50800" w14:dist="38100" w14:dir="2700000" w14:sx="100000" w14:sy="100000" w14:kx="0" w14:ky="0" w14:algn="tl">
+                                  <w14:srgbClr w14:val="000000">
+                                    <w14:alpha w14:val="60000"/>
+                                  </w14:srgbClr>
+                                </w14:shadow>
+                              </w:rPr>
+                              <w:t>Doors</w:t>
+                            </w:r>
+                            <w:r>
+                              <w:rPr>
+                                <w:b/>
+                                <w:bCs/>
+                                <w:color w:val="FF0000"/>
+                                <w:sz w:val="20"/>
+                                <w:szCs w:val="20"/>
+                                <w14:shadow w14:blurRad="50800" w14:dist="38100" w14:dir="2700000" w14:sx="100000" w14:sy="100000" w14:kx="0" w14:ky="0" w14:algn="tl">
+                                  <w14:srgbClr w14:val="000000">
+                                    <w14:alpha w14:val="60000"/>
+                                  </w14:srgbClr>
+                                </w14:shadow>
+                              </w:rPr>
+                              <w:br/>
+                              <w:t>←</w:t>
+                            </w:r>
+                            <w:proofErr w:type="gramStart"/>
+                            <w:r>
+                              <w:rPr>
+                                <w:b/>
+                                <w:bCs/>
+                                <w:color w:val="FF0000"/>
+                                <w:sz w:val="20"/>
+                                <w:szCs w:val="20"/>
+                                <w14:shadow w14:blurRad="50800" w14:dist="38100" w14:dir="2700000" w14:sx="100000" w14:sy="100000" w14:kx="0" w14:ky="0" w14:algn="tl">
+                                  <w14:srgbClr w14:val="000000">
+                                    <w14:alpha w14:val="60000"/>
+                                  </w14:srgbClr>
+                                </w14:shadow>
+                              </w:rPr>
+                              <w:t>L  R</w:t>
+                            </w:r>
+                            <w:proofErr w:type="gramEnd"/>
+                            <w:r>
+                              <w:rPr>
+                                <w:b/>
+                                <w:bCs/>
+                                <w:color w:val="FF0000"/>
+                                <w:sz w:val="20"/>
+                                <w:szCs w:val="20"/>
+                                <w14:shadow w14:blurRad="50800" w14:dist="38100" w14:dir="2700000" w14:sx="100000" w14:sy="100000" w14:kx="0" w14:ky="0" w14:algn="tl">
+                                  <w14:srgbClr w14:val="000000">
+                                    <w14:alpha w14:val="60000"/>
+                                  </w14:srgbClr>
+                                </w14:shadow>
+                              </w:rPr>
+                              <w:t>→</w:t>
+                            </w:r>
+                          </w:p>
+                        </w:txbxContent>
+                      </v:textbox>
+                    </v:rect>
+                  </w:pict>
+                </mc:Fallback>
+              </mc:AlternateContent>
+            </w:r>
+            <w:r>
+              <w:rPr>
+                <w:noProof/>
+                <w:color w:val="FFFFFF" w:themeColor="background1"/>
+                <w:sz w:val="32"/>
+                <w:szCs w:val="32"/>
+              </w:rPr>
+              <mc:AlternateContent>
+                <mc:Choice Requires="wps">
+                  <w:drawing>
+                    <wp:anchor distT="0" distB="0" distL="114300" distR="114300" simplePos="0" relativeHeight="251688960" behindDoc="0" locked="0" layoutInCell="1" allowOverlap="1" wp14:anchorId="2CBDD507" wp14:editId="2DB900D1">
+                      <wp:simplePos x="0" y="0"/>
+                      <wp:positionH relativeFrom="column">
+                        <wp:posOffset>3928745</wp:posOffset>
+                      </wp:positionH>
+                      <wp:positionV relativeFrom="paragraph">
+                        <wp:posOffset>3648075</wp:posOffset>
+                      </wp:positionV>
+                      <wp:extent cx="756000" cy="215900"/>
+                      <wp:effectExtent l="0" t="0" r="25400" b="12700"/>
+                      <wp:wrapNone/>
+                      <wp:docPr id="1377470921" name="Rectangle 1"/>
+                      <wp:cNvGraphicFramePr/>
+                      <a:graphic xmlns:a="http://schemas.openxmlformats.org/drawingml/2006/main">
+                        <a:graphicData uri="http://schemas.microsoft.com/office/word/2010/wordprocessingShape">
+                          <wps:wsp>
+                            <wps:cNvSpPr/>
+                            <wps:spPr>
+                              <a:xfrm>
+                                <a:off x="0" y="0"/>
+                                <a:ext cx="756000" cy="215900"/>
+                              </a:xfrm>
+                              <a:prstGeom prst="rect">
+                                <a:avLst/>
+                              </a:prstGeom>
+                              <a:solidFill>
+                                <a:srgbClr val="000000">
+                                  <a:alpha val="60000"/>
+                                </a:srgbClr>
+                              </a:solidFill>
+                              <a:ln w="12700">
+                                <a:solidFill>
+                                  <a:srgbClr val="FF0000"/>
+                                </a:solidFill>
+                              </a:ln>
+                            </wps:spPr>
+                            <wps:style>
+                              <a:lnRef idx="2">
+                                <a:schemeClr val="accent1">
+                                  <a:shade val="15000"/>
+                                </a:schemeClr>
+                              </a:lnRef>
+                              <a:fillRef idx="1">
+                                <a:schemeClr val="accent1"/>
+                              </a:fillRef>
+                              <a:effectRef idx="0">
+                                <a:schemeClr val="accent1"/>
+                              </a:effectRef>
+                              <a:fontRef idx="minor">
+                                <a:schemeClr val="lt1"/>
+                              </a:fontRef>
+                            </wps:style>
+                            <wps:txbx>
+                              <w:txbxContent>
+                                <w:p>
+                                  <w:pPr>
+                                    <w:spacing w:after="0"/>
+                                    <w:jc w:val="center"/>
+                                    <w:rPr>
+                                      <w:b/>
+                                      <w:bCs/>
+                                      <w:color w:val="FF0000"/>
+                                      <w:sz w:val="20"/>
+                                      <w:szCs w:val="20"/>
+                                      <w14:shadow w14:blurRad="50800" w14:dist="38100" w14:dir="2700000" w14:sx="100000" w14:sy="100000" w14:kx="0" w14:ky="0" w14:algn="tl">
+                                        <w14:srgbClr w14:val="000000">
+                                          <w14:alpha w14:val="60000"/>
+                                        </w14:srgbClr>
+                                      </w14:shadow>
+                                    </w:rPr>
+                                  </w:pPr>
+                                  <w:r>
+                                    <w:rPr>
+                                      <w:b/>
+                                      <w:bCs/>
+                                      <w:color w:val="FF0000"/>
+                                      <w:sz w:val="20"/>
+                                      <w:szCs w:val="20"/>
+                                      <w14:shadow w14:blurRad="50800" w14:dist="38100" w14:dir="2700000" w14:sx="100000" w14:sy="100000" w14:kx="0" w14:ky="0" w14:algn="tl">
+                                        <w14:srgbClr w14:val="000000">
+                                          <w14:alpha w14:val="60000"/>
+                                        </w14:srgbClr>
+                                      </w14:shadow>
+                                    </w:rPr>
+                                    <w:t>Meter lights</w:t>
+                                  </w:r>
+                                </w:p>
+                              </w:txbxContent>
+                            </wps:txbx>
+                            <wps:bodyPr rot="0" spcFirstLastPara="0" vertOverflow="overflow" horzOverflow="overflow" vert="horz" wrap="square" lIns="0" tIns="0" rIns="0" bIns="0" numCol="1" spcCol="0" rtlCol="0" fromWordArt="0" anchor="ctr" anchorCtr="0" forceAA="0" compatLnSpc="1">
+                              <a:prstTxWarp prst="textNoShape">
+                                <a:avLst/>
+                              </a:prstTxWarp>
+                              <a:noAutofit/>
+                            </wps:bodyPr>
+                          </wps:wsp>
+                        </a:graphicData>
+                      </a:graphic>
+                      <wp14:sizeRelH relativeFrom="margin">
+                        <wp14:pctWidth>0</wp14:pctWidth>
+                      </wp14:sizeRelH>
+                      <wp14:sizeRelV relativeFrom="margin">
+                        <wp14:pctHeight>0</wp14:pctHeight>
+                      </wp14:sizeRelV>
+                    </wp:anchor>
+                  </w:drawing>
+                </mc:Choice>
+                <mc:Fallback>
+                  <w:pict>
+                    <v:rect w14:anchorId="2CBDD507" id="_x0000_s1032" style="position:absolute;left:0;text-align:left;margin-left:309.35pt;margin-top:287.25pt;width:59.55pt;height:17pt;z-index:251688960;visibility:visible;mso-wrap-style:square;mso-width-percent:0;mso-height-percent:0;mso-wrap-distance-left:9pt;mso-wrap-distance-top:0;mso-wrap-distance-right:9pt;mso-wrap-distance-bottom:0;mso-position-horizontal:absolute;mso-position-horizontal-relative:text;mso-position-vertical:absolute;mso-position-vertical-relative:text;mso-width-percent:0;mso-height-percent:0;mso-width-relative:margin;mso-height-relative:margin;v-text-anchor:middle" o:gfxdata="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" fillcolor="black" strokecolor="red" strokeweight="1pt">
+                      <v:fill opacity="39321f"/>
+                      <v:textbox inset="0,0,0,0">
+                        <w:txbxContent>
+                          <w:p>
+                            <w:pPr>
+                              <w:spacing w:after="0"/>
+                              <w:jc w:val="center"/>
+                              <w:rPr>
+                                <w:b/>
+                                <w:bCs/>
+                                <w:color w:val="FF0000"/>
+                                <w:sz w:val="20"/>
+                                <w:szCs w:val="20"/>
+                                <w14:shadow w14:blurRad="50800" w14:dist="38100" w14:dir="2700000" w14:sx="100000" w14:sy="100000" w14:kx="0" w14:ky="0" w14:algn="tl">
+                                  <w14:srgbClr w14:val="000000">
+                                    <w14:alpha w14:val="60000"/>
+                                  </w14:srgbClr>
+                                </w14:shadow>
+                              </w:rPr>
+                            </w:pPr>
+                            <w:r>
+                              <w:rPr>
+                                <w:b/>
+                                <w:bCs/>
+                                <w:color w:val="FF0000"/>
+                                <w:sz w:val="20"/>
+                                <w:szCs w:val="20"/>
+                                <w14:shadow w14:blurRad="50800" w14:dist="38100" w14:dir="2700000" w14:sx="100000" w14:sy="100000" w14:kx="0" w14:ky="0" w14:algn="tl">
+                                  <w14:srgbClr w14:val="000000">
+                                    <w14:alpha w14:val="60000"/>
+                                  </w14:srgbClr>
+                                </w14:shadow>
+                              </w:rPr>
+                              <w:t>Meter lights</w:t>
+                            </w:r>
+                          </w:p>
+                        </w:txbxContent>
+                      </v:textbox>
+                    </v:rect>
+                  </w:pict>
+                </mc:Fallback>
+              </mc:AlternateContent>
+            </w:r>
+            <w:r>
+              <w:rPr>
+                <w:noProof/>
+                <w:color w:val="FFFFFF" w:themeColor="background1"/>
+                <w:sz w:val="32"/>
+                <w:szCs w:val="32"/>
+              </w:rPr>
+              <mc:AlternateContent>
+                <mc:Choice Requires="wps">
+                  <w:drawing>
+                    <wp:anchor distT="0" distB="0" distL="114300" distR="114300" simplePos="0" relativeHeight="251689984" behindDoc="0" locked="0" layoutInCell="1" allowOverlap="1" wp14:anchorId="2F3507D2" wp14:editId="2D611E94">
+                      <wp:simplePos x="0" y="0"/>
+                      <wp:positionH relativeFrom="column">
+                        <wp:posOffset>4376420</wp:posOffset>
+                      </wp:positionH>
+                      <wp:positionV relativeFrom="paragraph">
+                        <wp:posOffset>3863974</wp:posOffset>
+                      </wp:positionV>
+                      <wp:extent cx="317500" cy="288925"/>
+                      <wp:effectExtent l="0" t="0" r="82550" b="53975"/>
+                      <wp:wrapNone/>
+                      <wp:docPr id="633066866" name="Straight Arrow Connector 2"/>
+                      <wp:cNvGraphicFramePr/>
+                      <a:graphic xmlns:a="http://schemas.openxmlformats.org/drawingml/2006/main">
+                        <a:graphicData uri="http://schemas.microsoft.com/office/word/2010/wordprocessingShape">
+                          <wps:wsp>
+                            <wps:cNvCnPr/>
+                            <wps:spPr>
+                              <a:xfrm>
+                                <a:off x="0" y="0"/>
+                                <a:ext cx="317500" cy="288925"/>
+                              </a:xfrm>
+                              <a:prstGeom prst="straightConnector1">
+                                <a:avLst/>
+                              </a:prstGeom>
+                              <a:ln>
+                                <a:solidFill>
+                                  <a:srgbClr val="FF0000"/>
+                                </a:solidFill>
+                                <a:tailEnd type="triangle"/>
+                              </a:ln>
+                            </wps:spPr>
+                            <wps:style>
+                              <a:lnRef idx="2">
+                                <a:schemeClr val="accent1"/>
+                              </a:lnRef>
+                              <a:fillRef idx="0">
+                                <a:schemeClr val="accent1"/>
+                              </a:fillRef>
+                              <a:effectRef idx="1">
+                                <a:schemeClr val="accent1"/>
+                              </a:effectRef>
+                              <a:fontRef idx="minor">
+                                <a:schemeClr val="tx1"/>
+                              </a:fontRef>
+                            </wps:style>
+                            <wps:bodyPr/>
+                          </wps:wsp>
+                        </a:graphicData>
+                      </a:graphic>
+                      <wp14:sizeRelH relativeFrom="margin">
+                        <wp14:pctWidth>0</wp14:pctWidth>
+                      </wp14:sizeRelH>
+                      <wp14:sizeRelV relativeFrom="margin">
+                        <wp14:pctHeight>0</wp14:pctHeight>
+                      </wp14:sizeRelV>
+                    </wp:anchor>
+                  </w:drawing>
+                </mc:Choice>
+                <mc:Fallback>
+                  <w:pict>
+                    <v:shape w14:anchorId="7261C684" id="Straight Arrow Connector 2" o:spid="_x0000_s1026" type="#_x0000_t32" style="position:absolute;margin-left:344.6pt;margin-top:304.25pt;width:25pt;height:22.75pt;z-index:251689984;visibility:visible;mso-wrap-style:square;mso-width-percent:0;mso-height-percent:0;mso-wrap-distance-left:9pt;mso-wrap-distance-top:0;mso-wrap-distance-right:9pt;mso-wrap-distance-bottom:0;mso-position-horizontal:absolute;mso-position-horizontal-relative:text;mso-position-vertical:absolute;mso-position-vertical-relative:text;mso-width-percent:0;mso-height-percent:0;mso-width-relative:margin;mso-height-relative:margin" o:gfxdata="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" strokecolor="red" strokeweight="1.5pt">
+                      <v:stroke endarrow="block" joinstyle="miter"/>
+                    </v:shape>
+                  </w:pict>
+                </mc:Fallback>
+              </mc:AlternateContent>
+            </w:r>
+            <w:r>
+              <w:rPr>
+                <w:noProof/>
+                <w:color w:val="FFFFFF" w:themeColor="background1"/>
+                <w:sz w:val="32"/>
+                <w:szCs w:val="32"/>
+              </w:rPr>
+              <mc:AlternateContent>
+                <mc:Choice Requires="wps">
+                  <w:drawing>
+                    <wp:anchor distT="0" distB="0" distL="114300" distR="114300" simplePos="0" relativeHeight="251682816" behindDoc="0" locked="0" layoutInCell="1" allowOverlap="1" wp14:anchorId="189BDC66" wp14:editId="01DEE6A4">
+                      <wp:simplePos x="0" y="0"/>
+                      <wp:positionH relativeFrom="column">
+                        <wp:posOffset>3617595</wp:posOffset>
+                      </wp:positionH>
+                      <wp:positionV relativeFrom="paragraph">
+                        <wp:posOffset>4899025</wp:posOffset>
+                      </wp:positionV>
+                      <wp:extent cx="611505" cy="323850"/>
+                      <wp:effectExtent l="0" t="0" r="17145" b="19050"/>
+                      <wp:wrapNone/>
+                      <wp:docPr id="1249089609" name="Rectangle 1"/>
+                      <wp:cNvGraphicFramePr/>
+                      <a:graphic xmlns:a="http://schemas.openxmlformats.org/drawingml/2006/main">
+                        <a:graphicData uri="http://schemas.microsoft.com/office/word/2010/wordprocessingShape">
+                          <wps:wsp>
+                            <wps:cNvSpPr/>
+                            <wps:spPr>
+                              <a:xfrm>
+                                <a:off x="0" y="0"/>
+                                <a:ext cx="611505" cy="323850"/>
+                              </a:xfrm>
+                              <a:prstGeom prst="rect">
+                                <a:avLst/>
+                              </a:prstGeom>
+                              <a:solidFill>
+                                <a:srgbClr val="000000">
+                                  <a:alpha val="60000"/>
+                                </a:srgbClr>
+                              </a:solidFill>
+                              <a:ln w="12700">
+                                <a:solidFill>
+                                  <a:srgbClr val="FF0000"/>
+                                </a:solidFill>
+                              </a:ln>
+                            </wps:spPr>
+                            <wps:style>
+                              <a:lnRef idx="2">
+                                <a:schemeClr val="accent1">
+                                  <a:shade val="15000"/>
+                                </a:schemeClr>
+                              </a:lnRef>
+                              <a:fillRef idx="1">
+                                <a:schemeClr val="accent1"/>
+                              </a:fillRef>
+                              <a:effectRef idx="0">
+                                <a:schemeClr val="accent1"/>
+                              </a:effectRef>
+                              <a:fontRef idx="minor">
+                                <a:schemeClr val="lt1"/>
+                              </a:fontRef>
+                            </wps:style>
+                            <wps:txbx>
+                              <w:txbxContent>
+                                <w:p>
+                                  <w:pPr>
+                                    <w:spacing w:after="0" w:line="204" w:lineRule="auto"/>
+                                    <w:jc w:val="center"/>
+                                    <w:rPr>
+                                      <w:b/>
+                                      <w:bCs/>
+                                      <w:color w:val="FF0000"/>
+                                      <w:sz w:val="20"/>
+                                      <w:szCs w:val="20"/>
+                                      <w14:shadow w14:blurRad="50800" w14:dist="38100" w14:dir="2700000" w14:sx="100000" w14:sy="100000" w14:kx="0" w14:ky="0" w14:algn="tl">
+                                        <w14:srgbClr w14:val="000000">
+                                          <w14:alpha w14:val="60000"/>
+                                        </w14:srgbClr>
+                                      </w14:shadow>
+                                    </w:rPr>
+                                  </w:pPr>
+                                  <w:r>
+                                    <w:rPr>
+                                      <w:b/>
+                                      <w:bCs/>
+                                      <w:color w:val="FF0000"/>
+                                      <w:sz w:val="20"/>
+                                      <w:szCs w:val="20"/>
+                                      <w14:shadow w14:blurRad="50800" w14:dist="38100" w14:dir="2700000" w14:sx="100000" w14:sy="100000" w14:kx="0" w14:ky="0" w14:algn="tl">
+                                        <w14:srgbClr w14:val="000000">
+                                          <w14:alpha w14:val="60000"/>
+                                        </w14:srgbClr>
+                                      </w14:shadow>
+                                    </w:rPr>
+                                    <w:t>Deadman I/O</w:t>
+                                  </w:r>
+                                </w:p>
+                              </w:txbxContent>
+                            </wps:txbx>
+                            <wps:bodyPr rot="0" spcFirstLastPara="0" vertOverflow="overflow" horzOverflow="overflow" vert="horz" wrap="square" lIns="0" tIns="0" rIns="0" bIns="0" numCol="1" spcCol="0" rtlCol="0" fromWordArt="0" anchor="ctr" anchorCtr="0" forceAA="0" compatLnSpc="1">
+                              <a:prstTxWarp prst="textNoShape">
+                                <a:avLst/>
+                              </a:prstTxWarp>
+                              <a:noAutofit/>
+                            </wps:bodyPr>
+                          </wps:wsp>
+                        </a:graphicData>
+                      </a:graphic>
+                      <wp14:sizeRelH relativeFrom="margin">
+                        <wp14:pctWidth>0</wp14:pctWidth>
+                      </wp14:sizeRelH>
+                      <wp14:sizeRelV relativeFrom="margin">
+                        <wp14:pctHeight>0</wp14:pctHeight>
+                      </wp14:sizeRelV>
+                    </wp:anchor>
+                  </w:drawing>
+                </mc:Choice>
+                <mc:Fallback>
+                  <w:pict>
+                    <v:rect w14:anchorId="189BDC66" id="_x0000_s1033" style="position:absolute;left:0;text-align:left;margin-left:284.85pt;margin-top:385.75pt;width:48.15pt;height:25.5pt;z-index:251682816;visibility:visible;mso-wrap-style:square;mso-width-percent:0;mso-height-percent:0;mso-wrap-distance-left:9pt;mso-wrap-distance-top:0;mso-wrap-distance-right:9pt;mso-wrap-distance-bottom:0;mso-position-horizontal:absolute;mso-position-horizontal-relative:text;mso-position-vertical:absolute;mso-position-vertical-relative:text;mso-width-percent:0;mso-height-percent:0;mso-width-relative:margin;mso-height-relative:margin;v-text-anchor:middle" o:gfxdata="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" fillcolor="black" strokecolor="red" strokeweight="1pt">
+                      <v:fill opacity="39321f"/>
+                      <v:textbox inset="0,0,0,0">
+                        <w:txbxContent>
+                          <w:p>
+                            <w:pPr>
+                              <w:spacing w:after="0" w:line="204" w:lineRule="auto"/>
+                              <w:jc w:val="center"/>
+                              <w:rPr>
+                                <w:b/>
+                                <w:bCs/>
+                                <w:color w:val="FF0000"/>
+                                <w:sz w:val="20"/>
+                                <w:szCs w:val="20"/>
+                                <w14:shadow w14:blurRad="50800" w14:dist="38100" w14:dir="2700000" w14:sx="100000" w14:sy="100000" w14:kx="0" w14:ky="0" w14:algn="tl">
+                                  <w14:srgbClr w14:val="000000">
+                                    <w14:alpha w14:val="60000"/>
+                                  </w14:srgbClr>
+                                </w14:shadow>
+                              </w:rPr>
+                            </w:pPr>
+                            <w:r>
+                              <w:rPr>
+                                <w:b/>
+                                <w:bCs/>
+                                <w:color w:val="FF0000"/>
+                                <w:sz w:val="20"/>
+                                <w:szCs w:val="20"/>
+                                <w14:shadow w14:blurRad="50800" w14:dist="38100" w14:dir="2700000" w14:sx="100000" w14:sy="100000" w14:kx="0" w14:ky="0" w14:algn="tl">
+                                  <w14:srgbClr w14:val="000000">
+                                    <w14:alpha w14:val="60000"/>
+                                  </w14:srgbClr>
+                                </w14:shadow>
+                              </w:rPr>
+                              <w:t>Deadman I/O</w:t>
+                            </w:r>
+                          </w:p>
+                        </w:txbxContent>
+                      </v:textbox>
+                    </v:rect>
+                  </w:pict>
+                </mc:Fallback>
+              </mc:AlternateContent>
+            </w:r>
+            <w:r>
+              <w:rPr>
+                <w:noProof/>
+                <w:color w:val="FFFFFF" w:themeColor="background1"/>
+                <w:sz w:val="32"/>
+                <w:szCs w:val="32"/>
+              </w:rPr>
+              <mc:AlternateContent>
+                <mc:Choice Requires="wps">
+                  <w:drawing>
+                    <wp:anchor distT="0" distB="0" distL="114300" distR="114300" simplePos="0" relativeHeight="251684864" behindDoc="0" locked="0" layoutInCell="1" allowOverlap="1" wp14:anchorId="52C438C6" wp14:editId="5F42D102">
+                      <wp:simplePos x="0" y="0"/>
+                      <wp:positionH relativeFrom="column">
+                        <wp:posOffset>2325370</wp:posOffset>
+                      </wp:positionH>
+                      <wp:positionV relativeFrom="paragraph">
+                        <wp:posOffset>4899025</wp:posOffset>
+                      </wp:positionV>
+                      <wp:extent cx="611505" cy="323850"/>
+                      <wp:effectExtent l="0" t="0" r="17145" b="19050"/>
+                      <wp:wrapNone/>
+                      <wp:docPr id="1709059837" name="Rectangle 1"/>
+                      <wp:cNvGraphicFramePr/>
+                      <a:graphic xmlns:a="http://schemas.openxmlformats.org/drawingml/2006/main">
+                        <a:graphicData uri="http://schemas.microsoft.com/office/word/2010/wordprocessingShape">
+                          <wps:wsp>
+                            <wps:cNvSpPr/>
+                            <wps:spPr>
+                              <a:xfrm>
+                                <a:off x="0" y="0"/>
+                                <a:ext cx="611505" cy="323850"/>
+                              </a:xfrm>
+                              <a:prstGeom prst="rect">
+                                <a:avLst/>
+                              </a:prstGeom>
+                              <a:solidFill>
+                                <a:srgbClr val="000000">
+                                  <a:alpha val="60000"/>
+                                </a:srgbClr>
+                              </a:solidFill>
+                              <a:ln w="12700">
+                                <a:solidFill>
+                                  <a:srgbClr val="FF0000"/>
+                                </a:solidFill>
+                              </a:ln>
+                            </wps:spPr>
+                            <wps:style>
+                              <a:lnRef idx="2">
+                                <a:schemeClr val="accent1">
+                                  <a:shade val="15000"/>
+                                </a:schemeClr>
+                              </a:lnRef>
+                              <a:fillRef idx="1">
+                                <a:schemeClr val="accent1"/>
+                              </a:fillRef>
+                              <a:effectRef idx="0">
+                                <a:schemeClr val="accent1"/>
+                              </a:effectRef>
+                              <a:fontRef idx="minor">
+                                <a:schemeClr val="lt1"/>
+                              </a:fontRef>
+                            </wps:style>
+                            <wps:txbx>
+                              <w:txbxContent>
+                                <w:p>
+                                  <w:pPr>
+                                    <w:spacing w:after="0" w:line="204" w:lineRule="auto"/>
+                                    <w:jc w:val="center"/>
+                                    <w:rPr>
+                                      <w:b/>
+                                      <w:bCs/>
+                                      <w:color w:val="FF0000"/>
+                                      <w:sz w:val="20"/>
+                                      <w:szCs w:val="20"/>
+                                      <w14:shadow w14:blurRad="50800" w14:dist="38100" w14:dir="2700000" w14:sx="100000" w14:sy="100000" w14:kx="0" w14:ky="0" w14:algn="tl">
+                                        <w14:srgbClr w14:val="000000">
+                                          <w14:alpha w14:val="60000"/>
+                                        </w14:srgbClr>
+                                      </w14:shadow>
+                                    </w:rPr>
+                                  </w:pPr>
+                                  <w:r>
+                                    <w:rPr>
+                                      <w:b/>
+                                      <w:bCs/>
+                                      <w:color w:val="FF0000"/>
+                                      <w:sz w:val="20"/>
+                                      <w:szCs w:val="20"/>
+                                      <w14:shadow w14:blurRad="50800" w14:dist="38100" w14:dir="2700000" w14:sx="100000" w14:sy="100000" w14:kx="0" w14:ky="0" w14:algn="tl">
+                                        <w14:srgbClr w14:val="000000">
+                                          <w14:alpha w14:val="60000"/>
+                                        </w14:srgbClr>
+                                      </w14:shadow>
+                                    </w:rPr>
+                                    <w:t>ATB</w:t>
+                                  </w:r>
+                                  <w:r>
+                                    <w:rPr>
+                                      <w:b/>
+                                      <w:bCs/>
+                                      <w:color w:val="FF0000"/>
+                                      <w:sz w:val="20"/>
+                                      <w:szCs w:val="20"/>
+                                      <w14:shadow w14:blurRad="50800" w14:dist="38100" w14:dir="2700000" w14:sx="100000" w14:sy="100000" w14:kx="0" w14:ky="0" w14:algn="tl">
+                                        <w14:srgbClr w14:val="000000">
+                                          <w14:alpha w14:val="60000"/>
+                                        </w14:srgbClr>
+                                      </w14:shadow>
+                                    </w:rPr>
+                                    <w:br/>
+                                    <w:t>I/O</w:t>
+                                  </w:r>
+                                </w:p>
+                              </w:txbxContent>
+                            </wps:txbx>
+                            <wps:bodyPr rot="0" spcFirstLastPara="0" vertOverflow="overflow" horzOverflow="overflow" vert="horz" wrap="square" lIns="0" tIns="0" rIns="0" bIns="0" numCol="1" spcCol="0" rtlCol="0" fromWordArt="0" anchor="ctr" anchorCtr="0" forceAA="0" compatLnSpc="1">
+                              <a:prstTxWarp prst="textNoShape">
+                                <a:avLst/>
+                              </a:prstTxWarp>
+                              <a:noAutofit/>
+                            </wps:bodyPr>
+                          </wps:wsp>
+                        </a:graphicData>
+                      </a:graphic>
+                      <wp14:sizeRelH relativeFrom="margin">
+                        <wp14:pctWidth>0</wp14:pctWidth>
+                      </wp14:sizeRelH>
+                      <wp14:sizeRelV relativeFrom="margin">
+                        <wp14:pctHeight>0</wp14:pctHeight>
+                      </wp14:sizeRelV>
+                    </wp:anchor>
+                  </w:drawing>
+                </mc:Choice>
+                <mc:Fallback>
+                  <w:pict>
+                    <v:rect w14:anchorId="52C438C6" id="_x0000_s1034" style="position:absolute;left:0;text-align:left;margin-left:183.1pt;margin-top:385.75pt;width:48.15pt;height:25.5pt;z-index:251684864;visibility:visible;mso-wrap-style:square;mso-width-percent:0;mso-height-percent:0;mso-wrap-distance-left:9pt;mso-wrap-distance-top:0;mso-wrap-distance-right:9pt;mso-wrap-distance-bottom:0;mso-position-horizontal:absolute;mso-position-horizontal-relative:text;mso-position-vertical:absolute;mso-position-vertical-relative:text;mso-width-percent:0;mso-height-percent:0;mso-width-relative:margin;mso-height-relative:margin;v-text-anchor:middle" o:gfxdata="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" fillcolor="black" strokecolor="red" strokeweight="1pt">
+                      <v:fill opacity="39321f"/>
+                      <v:textbox inset="0,0,0,0">
+                        <w:txbxContent>
+                          <w:p>
+                            <w:pPr>
+                              <w:spacing w:after="0" w:line="204" w:lineRule="auto"/>
+                              <w:jc w:val="center"/>
+                              <w:rPr>
+                                <w:b/>
+                                <w:bCs/>
+                                <w:color w:val="FF0000"/>
+                                <w:sz w:val="20"/>
+                                <w:szCs w:val="20"/>
+                                <w14:shadow w14:blurRad="50800" w14:dist="38100" w14:dir="2700000" w14:sx="100000" w14:sy="100000" w14:kx="0" w14:ky="0" w14:algn="tl">
+                                  <w14:srgbClr w14:val="000000">
+                                    <w14:alpha w14:val="60000"/>
+                                  </w14:srgbClr>
+                                </w14:shadow>
+                              </w:rPr>
+                            </w:pPr>
+                            <w:r>
+                              <w:rPr>
+                                <w:b/>
+                                <w:bCs/>
+                                <w:color w:val="FF0000"/>
+                                <w:sz w:val="20"/>
+                                <w:szCs w:val="20"/>
+                                <w14:shadow w14:blurRad="50800" w14:dist="38100" w14:dir="2700000" w14:sx="100000" w14:sy="100000" w14:kx="0" w14:ky="0" w14:algn="tl">
+                                  <w14:srgbClr w14:val="000000">
+                                    <w14:alpha w14:val="60000"/>
+                                  </w14:srgbClr>
+                                </w14:shadow>
+                              </w:rPr>
+                              <w:t>ATB</w:t>
+                            </w:r>
+                            <w:r>
+                              <w:rPr>
+                                <w:b/>
+                                <w:bCs/>
+                                <w:color w:val="FF0000"/>
+                                <w:sz w:val="20"/>
+                                <w:szCs w:val="20"/>
+                                <w14:shadow w14:blurRad="50800" w14:dist="38100" w14:dir="2700000" w14:sx="100000" w14:sy="100000" w14:kx="0" w14:ky="0" w14:algn="tl">
+                                  <w14:srgbClr w14:val="000000">
+                                    <w14:alpha w14:val="60000"/>
+                                  </w14:srgbClr>
+                                </w14:shadow>
+                              </w:rPr>
+                              <w:br/>
+                              <w:t>I/O</w:t>
+                            </w:r>
+                          </w:p>
+                        </w:txbxContent>
+                      </v:textbox>
+                    </v:rect>
+                  </w:pict>
+                </mc:Fallback>
+              </mc:AlternateContent>
+            </w:r>
+            <w:r>
+              <w:rPr>
+                <w:noProof/>
+                <w:color w:val="FFFFFF" w:themeColor="background1"/>
+                <w:sz w:val="32"/>
+                <w:szCs w:val="32"/>
+              </w:rPr>
+              <mc:AlternateContent>
+                <mc:Choice Requires="wps">
+                  <w:drawing>
+                    <wp:anchor distT="0" distB="0" distL="114300" distR="114300" simplePos="0" relativeHeight="251678720" behindDoc="0" locked="0" layoutInCell="1" allowOverlap="1" wp14:anchorId="71AA84E9" wp14:editId="215912BF">
+                      <wp:simplePos x="0" y="0"/>
+                      <wp:positionH relativeFrom="column">
+                        <wp:posOffset>2567305</wp:posOffset>
+                      </wp:positionH>
+                      <wp:positionV relativeFrom="paragraph">
+                        <wp:posOffset>4323715</wp:posOffset>
+                      </wp:positionV>
+                      <wp:extent cx="431800" cy="323850"/>
+                      <wp:effectExtent l="0" t="0" r="25400" b="19050"/>
+                      <wp:wrapNone/>
+                      <wp:docPr id="777598180" name="Rectangle 1"/>
+                      <wp:cNvGraphicFramePr/>
+                      <a:graphic xmlns:a="http://schemas.openxmlformats.org/drawingml/2006/main">
+                        <a:graphicData uri="http://schemas.microsoft.com/office/word/2010/wordprocessingShape">
+                          <wps:wsp>
+                            <wps:cNvSpPr/>
+                            <wps:spPr>
+                              <a:xfrm>
+                                <a:off x="0" y="0"/>
+                                <a:ext cx="431800" cy="323850"/>
+                              </a:xfrm>
+                              <a:prstGeom prst="rect">
+                                <a:avLst/>
+                              </a:prstGeom>
+                              <a:solidFill>
+                                <a:srgbClr val="000000">
+                                  <a:alpha val="60000"/>
+                                </a:srgbClr>
+                              </a:solidFill>
+                              <a:ln w="12700">
+                                <a:solidFill>
+                                  <a:srgbClr val="FF0000"/>
+                                </a:solidFill>
+                              </a:ln>
+                            </wps:spPr>
+                            <wps:style>
+                              <a:lnRef idx="2">
+                                <a:schemeClr val="accent1">
+                                  <a:shade val="15000"/>
+                                </a:schemeClr>
+                              </a:lnRef>
+                              <a:fillRef idx="1">
+                                <a:schemeClr val="accent1"/>
+                              </a:fillRef>
+                              <a:effectRef idx="0">
+                                <a:schemeClr val="accent1"/>
+                              </a:effectRef>
+                              <a:fontRef idx="minor">
+                                <a:schemeClr val="lt1"/>
+                              </a:fontRef>
+                            </wps:style>
+                            <wps:txbx>
+                              <w:txbxContent>
+                                <w:p>
+                                  <w:pPr>
+                                    <w:spacing w:after="0" w:line="204" w:lineRule="auto"/>
+                                    <w:jc w:val="center"/>
+                                    <w:rPr>
+                                      <w:b/>
+                                      <w:bCs/>
+                                      <w:color w:val="FF0000"/>
+                                      <w:sz w:val="20"/>
+                                      <w:szCs w:val="20"/>
+                                      <w14:shadow w14:blurRad="50800" w14:dist="38100" w14:dir="2700000" w14:sx="100000" w14:sy="100000" w14:kx="0" w14:ky="0" w14:algn="tl">
+                                        <w14:srgbClr w14:val="000000">
+                                          <w14:alpha w14:val="60000"/>
+                                        </w14:srgbClr>
+                                      </w14:shadow>
+                                    </w:rPr>
+                                  </w:pPr>
+                                  <w:r>
+                                    <w:rPr>
+                                      <w:b/>
+                                      <w:bCs/>
+                                      <w:color w:val="FF0000"/>
+                                      <w:sz w:val="20"/>
+                                      <w:szCs w:val="20"/>
+                                      <w14:shadow w14:blurRad="50800" w14:dist="38100" w14:dir="2700000" w14:sx="100000" w14:sy="100000" w14:kx="0" w14:ky="0" w14:algn="tl">
+                                        <w14:srgbClr w14:val="000000">
+                                          <w14:alpha w14:val="60000"/>
+                                        </w14:srgbClr>
+                                      </w14:shadow>
+                                    </w:rPr>
+                                    <w:t>Horn Low</w:t>
+                                  </w:r>
+                                </w:p>
+                              </w:txbxContent>
+                            </wps:txbx>
+                            <wps:bodyPr rot="0" spcFirstLastPara="0" vertOverflow="overflow" horzOverflow="overflow" vert="horz" wrap="square" lIns="0" tIns="0" rIns="0" bIns="0" numCol="1" spcCol="0" rtlCol="0" fromWordArt="0" anchor="ctr" anchorCtr="0" forceAA="0" compatLnSpc="1">
+                              <a:prstTxWarp prst="textNoShape">
+                                <a:avLst/>
+                              </a:prstTxWarp>
+                              <a:noAutofit/>
+                            </wps:bodyPr>
+                          </wps:wsp>
+                        </a:graphicData>
+                      </a:graphic>
+                      <wp14:sizeRelH relativeFrom="margin">
+                        <wp14:pctWidth>0</wp14:pctWidth>
+                      </wp14:sizeRelH>
+                      <wp14:sizeRelV relativeFrom="margin">
+                        <wp14:pctHeight>0</wp14:pctHeight>
+                      </wp14:sizeRelV>
+                    </wp:anchor>
+                  </w:drawing>
+                </mc:Choice>
+                <mc:Fallback>
+                  <w:pict>
+                    <v:rect w14:anchorId="71AA84E9" id="_x0000_s1035" style="position:absolute;left:0;text-align:left;margin-left:202.15pt;margin-top:340.45pt;width:34pt;height:25.5pt;z-index:251678720;visibility:visible;mso-wrap-style:square;mso-width-percent:0;mso-height-percent:0;mso-wrap-distance-left:9pt;mso-wrap-distance-top:0;mso-wrap-distance-right:9pt;mso-wrap-distance-bottom:0;mso-position-horizontal:absolute;mso-position-horizontal-relative:text;mso-position-vertical:absolute;mso-position-vertical-relative:text;mso-width-percent:0;mso-height-percent:0;mso-width-relative:margin;mso-height-relative:margin;v-text-anchor:middle" o:gfxdata="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" fillcolor="black" strokecolor="red" strokeweight="1pt">
+                      <v:fill opacity="39321f"/>
+                      <v:textbox inset="0,0,0,0">
+                        <w:txbxContent>
+                          <w:p>
+                            <w:pPr>
+                              <w:spacing w:after="0" w:line="204" w:lineRule="auto"/>
+                              <w:jc w:val="center"/>
+                              <w:rPr>
+                                <w:b/>
+                                <w:bCs/>
+                                <w:color w:val="FF0000"/>
+                                <w:sz w:val="20"/>
+                                <w:szCs w:val="20"/>
+                                <w14:shadow w14:blurRad="50800" w14:dist="38100" w14:dir="2700000" w14:sx="100000" w14:sy="100000" w14:kx="0" w14:ky="0" w14:algn="tl">
+                                  <w14:srgbClr w14:val="000000">
+                                    <w14:alpha w14:val="60000"/>
+                                  </w14:srgbClr>
+                                </w14:shadow>
+                              </w:rPr>
+                            </w:pPr>
+                            <w:r>
+                              <w:rPr>
+                                <w:b/>
+                                <w:bCs/>
+                                <w:color w:val="FF0000"/>
+                                <w:sz w:val="20"/>
+                                <w:szCs w:val="20"/>
+                                <w14:shadow w14:blurRad="50800" w14:dist="38100" w14:dir="2700000" w14:sx="100000" w14:sy="100000" w14:kx="0" w14:ky="0" w14:algn="tl">
+                                  <w14:srgbClr w14:val="000000">
+                                    <w14:alpha w14:val="60000"/>
+                                  </w14:srgbClr>
+                                </w14:shadow>
+                              </w:rPr>
+                              <w:t>Horn Low</w:t>
+                            </w:r>
+                          </w:p>
+                        </w:txbxContent>
+                      </v:textbox>
+                    </v:rect>
+                  </w:pict>
+                </mc:Fallback>
+              </mc:AlternateContent>
+            </w:r>
+            <w:r>
+              <w:rPr>
+                <w:noProof/>
+                <w:color w:val="FFFFFF" w:themeColor="background1"/>
+                <w:sz w:val="32"/>
+                <w:szCs w:val="32"/>
+              </w:rPr>
+              <mc:AlternateContent>
+                <mc:Choice Requires="wps">
+                  <w:drawing>
+                    <wp:anchor distT="0" distB="0" distL="114300" distR="114300" simplePos="0" relativeHeight="251686912" behindDoc="0" locked="0" layoutInCell="1" allowOverlap="1" wp14:anchorId="5A88F8DE" wp14:editId="7130EBC5">
+                      <wp:simplePos x="0" y="0"/>
+                      <wp:positionH relativeFrom="column">
+                        <wp:posOffset>3576320</wp:posOffset>
+                      </wp:positionH>
+                      <wp:positionV relativeFrom="paragraph">
+                        <wp:posOffset>4324350</wp:posOffset>
+                      </wp:positionV>
+                      <wp:extent cx="431800" cy="323850"/>
+                      <wp:effectExtent l="0" t="0" r="25400" b="19050"/>
+                      <wp:wrapNone/>
+                      <wp:docPr id="42527342" name="Rectangle 1"/>
+                      <wp:cNvGraphicFramePr/>
+                      <a:graphic xmlns:a="http://schemas.openxmlformats.org/drawingml/2006/main">
+                        <a:graphicData uri="http://schemas.microsoft.com/office/word/2010/wordprocessingShape">
+                          <wps:wsp>
+                            <wps:cNvSpPr/>
+                            <wps:spPr>
+                              <a:xfrm>
+                                <a:off x="0" y="0"/>
+                                <a:ext cx="431800" cy="323850"/>
+                              </a:xfrm>
+                              <a:prstGeom prst="rect">
+                                <a:avLst/>
+                              </a:prstGeom>
+                              <a:solidFill>
+                                <a:srgbClr val="000000">
+                                  <a:alpha val="60000"/>
+                                </a:srgbClr>
+                              </a:solidFill>
+                              <a:ln w="12700">
+                                <a:solidFill>
+                                  <a:srgbClr val="FF0000"/>
+                                </a:solidFill>
+                              </a:ln>
+                            </wps:spPr>
+                            <wps:style>
+                              <a:lnRef idx="2">
+                                <a:schemeClr val="accent1">
+                                  <a:shade val="15000"/>
+                                </a:schemeClr>
+                              </a:lnRef>
+                              <a:fillRef idx="1">
+                                <a:schemeClr val="accent1"/>
+                              </a:fillRef>
+                              <a:effectRef idx="0">
+                                <a:schemeClr val="accent1"/>
+                              </a:effectRef>
+                              <a:fontRef idx="minor">
+                                <a:schemeClr val="lt1"/>
+                              </a:fontRef>
+                            </wps:style>
+                            <wps:txbx>
+                              <w:txbxContent>
+                                <w:p>
+                                  <w:pPr>
+                                    <w:spacing w:after="0" w:line="204" w:lineRule="auto"/>
+                                    <w:jc w:val="center"/>
+                                    <w:rPr>
+                                      <w:b/>
+                                      <w:bCs/>
+                                      <w:color w:val="FF0000"/>
+                                      <w:sz w:val="20"/>
+                                      <w:szCs w:val="20"/>
+                                      <w14:shadow w14:blurRad="50800" w14:dist="38100" w14:dir="2700000" w14:sx="100000" w14:sy="100000" w14:kx="0" w14:ky="0" w14:algn="tl">
+                                        <w14:srgbClr w14:val="000000">
+                                          <w14:alpha w14:val="60000"/>
+                                        </w14:srgbClr>
+                                      </w14:shadow>
+                                    </w:rPr>
+                                  </w:pPr>
+                                  <w:r>
+                                    <w:rPr>
+                                      <w:b/>
+                                      <w:bCs/>
+                                      <w:color w:val="FF0000"/>
+                                      <w:sz w:val="20"/>
+                                      <w:szCs w:val="20"/>
+                                      <w14:shadow w14:blurRad="50800" w14:dist="38100" w14:dir="2700000" w14:sx="100000" w14:sy="100000" w14:kx="0" w14:ky="0" w14:algn="tl">
+                                        <w14:srgbClr w14:val="000000">
+                                          <w14:alpha w14:val="60000"/>
+                                        </w14:srgbClr>
+                                      </w14:shadow>
+                                    </w:rPr>
+                                    <w:t>Horn High</w:t>
+                                  </w:r>
+                                </w:p>
+                              </w:txbxContent>
+                            </wps:txbx>
+                            <wps:bodyPr rot="0" spcFirstLastPara="0" vertOverflow="overflow" horzOverflow="overflow" vert="horz" wrap="square" lIns="0" tIns="0" rIns="0" bIns="0" numCol="1" spcCol="0" rtlCol="0" fromWordArt="0" anchor="ctr" anchorCtr="0" forceAA="0" compatLnSpc="1">
+                              <a:prstTxWarp prst="textNoShape">
+                                <a:avLst/>
+                              </a:prstTxWarp>
+                              <a:noAutofit/>
+                            </wps:bodyPr>
+                          </wps:wsp>
+                        </a:graphicData>
+                      </a:graphic>
+                      <wp14:sizeRelH relativeFrom="margin">
+                        <wp14:pctWidth>0</wp14:pctWidth>
+                      </wp14:sizeRelH>
+                      <wp14:sizeRelV relativeFrom="margin">
+                        <wp14:pctHeight>0</wp14:pctHeight>
+                      </wp14:sizeRelV>
+                    </wp:anchor>
+                  </w:drawing>
+                </mc:Choice>
+                <mc:Fallback>
+                  <w:pict>
+                    <v:rect w14:anchorId="5A88F8DE" id="_x0000_s1036" style="position:absolute;left:0;text-align:left;margin-left:281.6pt;margin-top:340.5pt;width:34pt;height:25.5pt;z-index:251686912;visibility:visible;mso-wrap-style:square;mso-width-percent:0;mso-height-percent:0;mso-wrap-distance-left:9pt;mso-wrap-distance-top:0;mso-wrap-distance-right:9pt;mso-wrap-distance-bottom:0;mso-position-horizontal:absolute;mso-position-horizontal-relative:text;mso-position-vertical:absolute;mso-position-vertical-relative:text;mso-width-percent:0;mso-height-percent:0;mso-width-relative:margin;mso-height-relative:margin;v-text-anchor:middle" o:gfxdata="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" fillcolor="black" strokecolor="red" strokeweight="1pt">
+                      <v:fill opacity="39321f"/>
+                      <v:textbox inset="0,0,0,0">
+                        <w:txbxContent>
+                          <w:p>
+                            <w:pPr>
+                              <w:spacing w:after="0" w:line="204" w:lineRule="auto"/>
+                              <w:jc w:val="center"/>
+                              <w:rPr>
+                                <w:b/>
+                                <w:bCs/>
+                                <w:color w:val="FF0000"/>
+                                <w:sz w:val="20"/>
+                                <w:szCs w:val="20"/>
+                                <w14:shadow w14:blurRad="50800" w14:dist="38100" w14:dir="2700000" w14:sx="100000" w14:sy="100000" w14:kx="0" w14:ky="0" w14:algn="tl">
+                                  <w14:srgbClr w14:val="000000">
+                                    <w14:alpha w14:val="60000"/>
+                                  </w14:srgbClr>
+                                </w14:shadow>
+                              </w:rPr>
+                            </w:pPr>
+                            <w:r>
+                              <w:rPr>
+                                <w:b/>
+                                <w:bCs/>
+                                <w:color w:val="FF0000"/>
+                                <w:sz w:val="20"/>
+                                <w:szCs w:val="20"/>
+                                <w14:shadow w14:blurRad="50800" w14:dist="38100" w14:dir="2700000" w14:sx="100000" w14:sy="100000" w14:kx="0" w14:ky="0" w14:algn="tl">
+                                  <w14:srgbClr w14:val="000000">
+                                    <w14:alpha w14:val="60000"/>
+                                  </w14:srgbClr>
+                                </w14:shadow>
+                              </w:rPr>
+                              <w:t>Horn High</w:t>
+                            </w:r>
+                          </w:p>
+                        </w:txbxContent>
+                      </v:textbox>
+                    </v:rect>
+                  </w:pict>
+                </mc:Fallback>
+              </mc:AlternateContent>
+            </w:r>
+            <w:r>
+              <w:rPr>
+                <w:noProof/>
+                <w:color w:val="FFFFFF" w:themeColor="background1"/>
+                <w:sz w:val="32"/>
+                <w:szCs w:val="32"/>
+              </w:rPr>
+              <mc:AlternateContent>
+                <mc:Choice Requires="wps">
+                  <w:drawing>
+                    <wp:anchor distT="0" distB="0" distL="114300" distR="114300" simplePos="0" relativeHeight="251673600" behindDoc="0" locked="0" layoutInCell="1" allowOverlap="1" wp14:anchorId="6F9D1902" wp14:editId="7CD1E238">
+                      <wp:simplePos x="0" y="0"/>
+                      <wp:positionH relativeFrom="column">
+                        <wp:posOffset>3553460</wp:posOffset>
+                      </wp:positionH>
+                      <wp:positionV relativeFrom="paragraph">
+                        <wp:posOffset>1667510</wp:posOffset>
+                      </wp:positionV>
+                      <wp:extent cx="611505" cy="215900"/>
+                      <wp:effectExtent l="0" t="0" r="17145" b="12700"/>
+                      <wp:wrapNone/>
+                      <wp:docPr id="1542962977" name="Rectangle 1"/>
+                      <wp:cNvGraphicFramePr/>
+                      <a:graphic xmlns:a="http://schemas.openxmlformats.org/drawingml/2006/main">
+                        <a:graphicData uri="http://schemas.microsoft.com/office/word/2010/wordprocessingShape">
+                          <wps:wsp>
+                            <wps:cNvSpPr/>
+                            <wps:spPr>
+                              <a:xfrm>
+                                <a:off x="0" y="0"/>
+                                <a:ext cx="611505" cy="215900"/>
+                              </a:xfrm>
+                              <a:prstGeom prst="rect">
+                                <a:avLst/>
+                              </a:prstGeom>
+                              <a:solidFill>
+                                <a:srgbClr val="000000">
+                                  <a:alpha val="60000"/>
+                                </a:srgbClr>
+                              </a:solidFill>
+                              <a:ln w="12700" cap="flat" cmpd="sng" algn="ctr">
+                                <a:solidFill>
+                                  <a:srgbClr val="FF0000"/>
+                                </a:solidFill>
+                                <a:prstDash val="solid"/>
+                                <a:miter lim="800000"/>
+                              </a:ln>
+                              <a:effectLst/>
+                            </wps:spPr>
+                            <wps:txbx>
+                              <w:txbxContent>
+                                <w:p>
+                                  <w:pPr>
+                                    <w:spacing w:after="0"/>
+                                    <w:jc w:val="center"/>
+                                    <w:rPr>
+                                      <w:b/>
+                                      <w:bCs/>
+                                      <w:color w:val="FF0000"/>
+                                      <w:sz w:val="20"/>
+                                      <w:szCs w:val="20"/>
+                                      <w14:shadow w14:blurRad="50800" w14:dist="38100" w14:dir="2700000" w14:sx="100000" w14:sy="100000" w14:kx="0" w14:ky="0" w14:algn="tl">
+                                        <w14:srgbClr w14:val="000000">
+                                          <w14:alpha w14:val="60000"/>
+                                        </w14:srgbClr>
+                                      </w14:shadow>
+                                    </w:rPr>
+                                  </w:pPr>
+                                  <w:r>
+                                    <w:rPr>
+                                      <w:b/>
+                                      <w:bCs/>
+                                      <w:color w:val="FF0000"/>
+                                      <w:sz w:val="20"/>
+                                      <w:szCs w:val="20"/>
+                                      <w14:shadow w14:blurRad="50800" w14:dist="38100" w14:dir="2700000" w14:sx="100000" w14:sy="100000" w14:kx="0" w14:ky="0" w14:algn="tl">
+                                        <w14:srgbClr w14:val="000000">
+                                          <w14:alpha w14:val="60000"/>
+                                        </w14:srgbClr>
+                                      </w14:shadow>
+                                    </w:rPr>
+                                    <w:t>Brake</w:t>
+                                  </w:r>
+                                </w:p>
+                              </w:txbxContent>
+                            </wps:txbx>
+                            <wps:bodyPr rot="0" spcFirstLastPara="0" vertOverflow="overflow" horzOverflow="overflow" vert="horz" wrap="square" lIns="0" tIns="0" rIns="0" bIns="0" numCol="1" spcCol="0" rtlCol="0" fromWordArt="0" anchor="ctr" anchorCtr="0" forceAA="0" compatLnSpc="1">
+                              <a:prstTxWarp prst="textNoShape">
+                                <a:avLst/>
+                              </a:prstTxWarp>
+                              <a:noAutofit/>
+                            </wps:bodyPr>
+                          </wps:wsp>
+                        </a:graphicData>
+                      </a:graphic>
+                      <wp14:sizeRelH relativeFrom="margin">
+                        <wp14:pctWidth>0</wp14:pctWidth>
+                      </wp14:sizeRelH>
+                      <wp14:sizeRelV relativeFrom="margin">
+                        <wp14:pctHeight>0</wp14:pctHeight>
+                      </wp14:sizeRelV>
+                    </wp:anchor>
+                  </w:drawing>
+                </mc:Choice>
+                <mc:Fallback>
+                  <w:pict>
+                    <v:rect w14:anchorId="6F9D1902" id="_x0000_s1037" style="position:absolute;left:0;text-align:left;margin-left:279.8pt;margin-top:131.3pt;width:48.15pt;height:17pt;z-index:251673600;visibility:visible;mso-wrap-style:square;mso-width-percent:0;mso-height-percent:0;mso-wrap-distance-left:9pt;mso-wrap-distance-top:0;mso-wrap-distance-right:9pt;mso-wrap-distance-bottom:0;mso-position-horizontal:absolute;mso-position-horizontal-relative:text;mso-position-vertical:absolute;mso-position-vertical-relative:text;mso-width-percent:0;mso-height-percent:0;mso-width-relative:margin;mso-height-relative:margin;v-text-anchor:middle" o:gfxdata="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" fillcolor="black" strokecolor="red" strokeweight="1pt">
+                      <v:fill opacity="39321f"/>
+                      <v:textbox inset="0,0,0,0">
+                        <w:txbxContent>
+                          <w:p>
+                            <w:pPr>
+                              <w:spacing w:after="0"/>
+                              <w:jc w:val="center"/>
+                              <w:rPr>
+                                <w:b/>
+                                <w:bCs/>
+                                <w:color w:val="FF0000"/>
+                                <w:sz w:val="20"/>
+                                <w:szCs w:val="20"/>
+                                <w14:shadow w14:blurRad="50800" w14:dist="38100" w14:dir="2700000" w14:sx="100000" w14:sy="100000" w14:kx="0" w14:ky="0" w14:algn="tl">
+                                  <w14:srgbClr w14:val="000000">
+                                    <w14:alpha w14:val="60000"/>
+                                  </w14:srgbClr>
+                                </w14:shadow>
+                              </w:rPr>
+                            </w:pPr>
+                            <w:r>
+                              <w:rPr>
+                                <w:b/>
+                                <w:bCs/>
+                                <w:color w:val="FF0000"/>
+                                <w:sz w:val="20"/>
+                                <w:szCs w:val="20"/>
+                                <w14:shadow w14:blurRad="50800" w14:dist="38100" w14:dir="2700000" w14:sx="100000" w14:sy="100000" w14:kx="0" w14:ky="0" w14:algn="tl">
+                                  <w14:srgbClr w14:val="000000">
+                                    <w14:alpha w14:val="60000"/>
+                                  </w14:srgbClr>
+                                </w14:shadow>
+                              </w:rPr>
+                              <w:t>Brake</w:t>
+                            </w:r>
+                          </w:p>
+                        </w:txbxContent>
+                      </v:textbox>
+                    </v:rect>
+                  </w:pict>
+                </mc:Fallback>
+              </mc:AlternateContent>
+            </w:r>
+            <w:r>
+              <w:rPr>
+                <w:noProof/>
+                <w:color w:val="FFFFFF" w:themeColor="background1"/>
+                <w:sz w:val="32"/>
+                <w:szCs w:val="32"/>
+              </w:rPr>
+              <mc:AlternateContent>
+                <mc:Choice Requires="wps">
+                  <w:drawing>
+                    <wp:anchor distT="0" distB="0" distL="114300" distR="114300" simplePos="0" relativeHeight="251671552" behindDoc="0" locked="0" layoutInCell="1" allowOverlap="1" wp14:anchorId="39CCF745" wp14:editId="1AE06FB6">
+                      <wp:simplePos x="0" y="0"/>
+                      <wp:positionH relativeFrom="column">
+                        <wp:posOffset>2514600</wp:posOffset>
+                      </wp:positionH>
+                      <wp:positionV relativeFrom="paragraph">
+                        <wp:posOffset>1667510</wp:posOffset>
+                      </wp:positionV>
+                      <wp:extent cx="611505" cy="215900"/>
+                      <wp:effectExtent l="0" t="0" r="17145" b="12700"/>
+                      <wp:wrapNone/>
+                      <wp:docPr id="2062025466" name="Rectangle 1"/>
+                      <wp:cNvGraphicFramePr/>
+                      <a:graphic xmlns:a="http://schemas.openxmlformats.org/drawingml/2006/main">
+                        <a:graphicData uri="http://schemas.microsoft.com/office/word/2010/wordprocessingShape">
+                          <wps:wsp>
+                            <wps:cNvSpPr/>
+                            <wps:spPr>
+                              <a:xfrm>
+                                <a:off x="0" y="0"/>
+                                <a:ext cx="611505" cy="215900"/>
+                              </a:xfrm>
+                              <a:prstGeom prst="rect">
+                                <a:avLst/>
+                              </a:prstGeom>
+                              <a:solidFill>
+                                <a:srgbClr val="000000">
+                                  <a:alpha val="60000"/>
+                                </a:srgbClr>
+                              </a:solidFill>
+                              <a:ln w="12700" cap="flat" cmpd="sng" algn="ctr">
+                                <a:solidFill>
+                                  <a:srgbClr val="FF0000"/>
+                                </a:solidFill>
+                                <a:prstDash val="solid"/>
+                                <a:miter lim="800000"/>
+                              </a:ln>
+                              <a:effectLst/>
+                            </wps:spPr>
+                            <wps:txbx>
+                              <w:txbxContent>
+                                <w:p>
+                                  <w:pPr>
+                                    <w:spacing w:after="0"/>
+                                    <w:jc w:val="center"/>
+                                    <w:rPr>
+                                      <w:b/>
+                                      <w:bCs/>
+                                      <w:color w:val="FF0000"/>
+                                      <w:sz w:val="20"/>
+                                      <w:szCs w:val="20"/>
+                                      <w14:shadow w14:blurRad="50800" w14:dist="38100" w14:dir="2700000" w14:sx="100000" w14:sy="100000" w14:kx="0" w14:ky="0" w14:algn="tl">
+                                        <w14:srgbClr w14:val="000000">
+                                          <w14:alpha w14:val="60000"/>
+                                        </w14:srgbClr>
+                                      </w14:shadow>
+                                    </w:rPr>
+                                  </w:pPr>
+                                  <w:r>
+                                    <w:rPr>
+                                      <w:b/>
+                                      <w:bCs/>
+                                      <w:color w:val="FF0000"/>
+                                      <w:sz w:val="20"/>
+                                      <w:szCs w:val="20"/>
+                                      <w14:shadow w14:blurRad="50800" w14:dist="38100" w14:dir="2700000" w14:sx="100000" w14:sy="100000" w14:kx="0" w14:ky="0" w14:algn="tl">
+                                        <w14:srgbClr w14:val="000000">
+                                          <w14:alpha w14:val="60000"/>
+                                        </w14:srgbClr>
+                                      </w14:shadow>
+                                    </w:rPr>
+                                    <w:t>Throttle</w:t>
+                                  </w:r>
+                                </w:p>
+                              </w:txbxContent>
+                            </wps:txbx>
+                            <wps:bodyPr rot="0" spcFirstLastPara="0" vertOverflow="overflow" horzOverflow="overflow" vert="horz" wrap="square" lIns="0" tIns="0" rIns="0" bIns="0" numCol="1" spcCol="0" rtlCol="0" fromWordArt="0" anchor="ctr" anchorCtr="0" forceAA="0" compatLnSpc="1">
+                              <a:prstTxWarp prst="textNoShape">
+                                <a:avLst/>
+                              </a:prstTxWarp>
+                              <a:noAutofit/>
+                            </wps:bodyPr>
+                          </wps:wsp>
+                        </a:graphicData>
+                      </a:graphic>
+                      <wp14:sizeRelH relativeFrom="margin">
+                        <wp14:pctWidth>0</wp14:pctWidth>
+                      </wp14:sizeRelH>
+                      <wp14:sizeRelV relativeFrom="margin">
+                        <wp14:pctHeight>0</wp14:pctHeight>
+                      </wp14:sizeRelV>
+                    </wp:anchor>
+                  </w:drawing>
+                </mc:Choice>
+                <mc:Fallback>
+                  <w:pict>
+                    <v:rect w14:anchorId="39CCF745" id="_x0000_s1038" style="position:absolute;left:0;text-align:left;margin-left:198pt;margin-top:131.3pt;width:48.15pt;height:17pt;z-index:251671552;visibility:visible;mso-wrap-style:square;mso-width-percent:0;mso-height-percent:0;mso-wrap-distance-left:9pt;mso-wrap-distance-top:0;mso-wrap-distance-right:9pt;mso-wrap-distance-bottom:0;mso-position-horizontal:absolute;mso-position-horizontal-relative:text;mso-position-vertical:absolute;mso-position-vertical-relative:text;mso-width-percent:0;mso-height-percent:0;mso-width-relative:margin;mso-height-relative:margin;v-text-anchor:middle" o:gfxdata="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" fillcolor="black" strokecolor="red" strokeweight="1pt">
+                      <v:fill opacity="39321f"/>
+                      <v:textbox inset="0,0,0,0">
+                        <w:txbxContent>
+                          <w:p>
+                            <w:pPr>
+                              <w:spacing w:after="0"/>
+                              <w:jc w:val="center"/>
+                              <w:rPr>
+                                <w:b/>
+                                <w:bCs/>
+                                <w:color w:val="FF0000"/>
+                                <w:sz w:val="20"/>
+                                <w:szCs w:val="20"/>
+                                <w14:shadow w14:blurRad="50800" w14:dist="38100" w14:dir="2700000" w14:sx="100000" w14:sy="100000" w14:kx="0" w14:ky="0" w14:algn="tl">
+                                  <w14:srgbClr w14:val="000000">
+                                    <w14:alpha w14:val="60000"/>
+                                  </w14:srgbClr>
+                                </w14:shadow>
+                              </w:rPr>
+                            </w:pPr>
+                            <w:r>
+                              <w:rPr>
+                                <w:b/>
+                                <w:bCs/>
+                                <w:color w:val="FF0000"/>
+                                <w:sz w:val="20"/>
+                                <w:szCs w:val="20"/>
+                                <w14:shadow w14:blurRad="50800" w14:dist="38100" w14:dir="2700000" w14:sx="100000" w14:sy="100000" w14:kx="0" w14:ky="0" w14:algn="tl">
+                                  <w14:srgbClr w14:val="000000">
+                                    <w14:alpha w14:val="60000"/>
+                                  </w14:srgbClr>
+                                </w14:shadow>
+                              </w:rPr>
+                              <w:t>Throttle</w:t>
+                            </w:r>
+                          </w:p>
+                        </w:txbxContent>
+                      </v:textbox>
+                    </v:rect>
+                  </w:pict>
+                </mc:Fallback>
+              </mc:AlternateContent>
+            </w:r>
+            <w:r>
+              <w:rPr>
+                <w:noProof/>
+                <w:color w:val="FFFFFF" w:themeColor="background1"/>
+                <w:sz w:val="32"/>
+                <w:szCs w:val="32"/>
+              </w:rPr>
+              <mc:AlternateContent>
+                <mc:Choice Requires="wps">
+                  <w:drawing>
+                    <wp:anchor distT="0" distB="0" distL="114300" distR="114300" simplePos="0" relativeHeight="251669504" behindDoc="0" locked="0" layoutInCell="1" allowOverlap="1" wp14:anchorId="0B986780" wp14:editId="2F2A6C37">
+                      <wp:simplePos x="0" y="0"/>
+                      <wp:positionH relativeFrom="column">
+                        <wp:posOffset>1351280</wp:posOffset>
+                      </wp:positionH>
+                      <wp:positionV relativeFrom="paragraph">
+                        <wp:posOffset>1667510</wp:posOffset>
+                      </wp:positionV>
+                      <wp:extent cx="611505" cy="215900"/>
+                      <wp:effectExtent l="0" t="0" r="17145" b="12700"/>
+                      <wp:wrapNone/>
+                      <wp:docPr id="397081854" name="Rectangle 1"/>
+                      <wp:cNvGraphicFramePr/>
+                      <a:graphic xmlns:a="http://schemas.openxmlformats.org/drawingml/2006/main">
+                        <a:graphicData uri="http://schemas.microsoft.com/office/word/2010/wordprocessingShape">
+                          <wps:wsp>
+                            <wps:cNvSpPr/>
+                            <wps:spPr>
+                              <a:xfrm>
+                                <a:off x="0" y="0"/>
+                                <a:ext cx="611505" cy="215900"/>
+                              </a:xfrm>
+                              <a:prstGeom prst="rect">
+                                <a:avLst/>
+                              </a:prstGeom>
+                              <a:solidFill>
+                                <a:srgbClr val="000000">
+                                  <a:alpha val="60000"/>
+                                </a:srgbClr>
+                              </a:solidFill>
+                              <a:ln w="12700">
+                                <a:solidFill>
+                                  <a:srgbClr val="FF0000"/>
+                                </a:solidFill>
+                              </a:ln>
+                            </wps:spPr>
+                            <wps:style>
+                              <a:lnRef idx="2">
+                                <a:schemeClr val="accent1">
+                                  <a:shade val="15000"/>
+                                </a:schemeClr>
+                              </a:lnRef>
+                              <a:fillRef idx="1">
+                                <a:schemeClr val="accent1"/>
+                              </a:fillRef>
+                              <a:effectRef idx="0">
+                                <a:schemeClr val="accent1"/>
+                              </a:effectRef>
+                              <a:fontRef idx="minor">
+                                <a:schemeClr val="lt1"/>
+                              </a:fontRef>
+                            </wps:style>
+                            <wps:txbx>
+                              <w:txbxContent>
+                                <w:p>
+                                  <w:pPr>
+                                    <w:spacing w:after="0"/>
+                                    <w:jc w:val="center"/>
+                                    <w:rPr>
+                                      <w:b/>
+                                      <w:bCs/>
+                                      <w:color w:val="FF0000"/>
+                                      <w:sz w:val="20"/>
+                                      <w:szCs w:val="20"/>
+                                      <w14:shadow w14:blurRad="50800" w14:dist="38100" w14:dir="2700000" w14:sx="100000" w14:sy="100000" w14:kx="0" w14:ky="0" w14:algn="tl">
+                                        <w14:srgbClr w14:val="000000">
+                                          <w14:alpha w14:val="60000"/>
+                                        </w14:srgbClr>
+                                      </w14:shadow>
+                                    </w:rPr>
+                                  </w:pPr>
+                                  <w:r>
+                                    <w:rPr>
+                                      <w:b/>
+                                      <w:bCs/>
+                                      <w:color w:val="FF0000"/>
+                                      <w:sz w:val="20"/>
+                                      <w:szCs w:val="20"/>
+                                      <w14:shadow w14:blurRad="50800" w14:dist="38100" w14:dir="2700000" w14:sx="100000" w14:sy="100000" w14:kx="0" w14:ky="0" w14:algn="tl">
+                                        <w14:srgbClr w14:val="000000">
+                                          <w14:alpha w14:val="60000"/>
+                                        </w14:srgbClr>
+                                      </w14:shadow>
+                                    </w:rPr>
+                                    <w:t>Reverser</w:t>
+                                  </w:r>
+                                </w:p>
+                              </w:txbxContent>
+                            </wps:txbx>
+                            <wps:bodyPr rot="0" spcFirstLastPara="0" vertOverflow="overflow" horzOverflow="overflow" vert="horz" wrap="square" lIns="0" tIns="0" rIns="0" bIns="0" numCol="1" spcCol="0" rtlCol="0" fromWordArt="0" anchor="ctr" anchorCtr="0" forceAA="0" compatLnSpc="1">
+                              <a:prstTxWarp prst="textNoShape">
+                                <a:avLst/>
+                              </a:prstTxWarp>
+                              <a:noAutofit/>
+                            </wps:bodyPr>
+                          </wps:wsp>
+                        </a:graphicData>
+                      </a:graphic>
+                      <wp14:sizeRelH relativeFrom="margin">
+                        <wp14:pctWidth>0</wp14:pctWidth>
+                      </wp14:sizeRelH>
+                      <wp14:sizeRelV relativeFrom="margin">
+                        <wp14:pctHeight>0</wp14:pctHeight>
+                      </wp14:sizeRelV>
+                    </wp:anchor>
+                  </w:drawing>
+                </mc:Choice>
+                <mc:Fallback>
+                  <w:pict>
+                    <v:rect w14:anchorId="0B986780" id="_x0000_s1039" style="position:absolute;left:0;text-align:left;margin-left:106.4pt;margin-top:131.3pt;width:48.15pt;height:17pt;z-index:251669504;visibility:visible;mso-wrap-style:square;mso-width-percent:0;mso-height-percent:0;mso-wrap-distance-left:9pt;mso-wrap-distance-top:0;mso-wrap-distance-right:9pt;mso-wrap-distance-bottom:0;mso-position-horizontal:absolute;mso-position-horizontal-relative:text;mso-position-vertical:absolute;mso-position-vertical-relative:text;mso-width-percent:0;mso-height-percent:0;mso-width-relative:margin;mso-height-relative:margin;v-text-anchor:middle" o:gfxdata="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" fillcolor="black" strokecolor="red" strokeweight="1pt">
+                      <v:fill opacity="39321f"/>
+                      <v:textbox inset="0,0,0,0">
+                        <w:txbxContent>
+                          <w:p>
+                            <w:pPr>
+                              <w:spacing w:after="0"/>
+                              <w:jc w:val="center"/>
+                              <w:rPr>
+                                <w:b/>
+                                <w:bCs/>
+                                <w:color w:val="FF0000"/>
+                                <w:sz w:val="20"/>
+                                <w:szCs w:val="20"/>
+                                <w14:shadow w14:blurRad="50800" w14:dist="38100" w14:dir="2700000" w14:sx="100000" w14:sy="100000" w14:kx="0" w14:ky="0" w14:algn="tl">
+                                  <w14:srgbClr w14:val="000000">
+                                    <w14:alpha w14:val="60000"/>
+                                  </w14:srgbClr>
+                                </w14:shadow>
+                              </w:rPr>
+                            </w:pPr>
+                            <w:r>
+                              <w:rPr>
+                                <w:b/>
+                                <w:bCs/>
+                                <w:color w:val="FF0000"/>
+                                <w:sz w:val="20"/>
+                                <w:szCs w:val="20"/>
+                                <w14:shadow w14:blurRad="50800" w14:dist="38100" w14:dir="2700000" w14:sx="100000" w14:sy="100000" w14:kx="0" w14:ky="0" w14:algn="tl">
+                                  <w14:srgbClr w14:val="000000">
+                                    <w14:alpha w14:val="60000"/>
+                                  </w14:srgbClr>
+                                </w14:shadow>
+                              </w:rPr>
+                              <w:t>Reverser</w:t>
+                            </w:r>
+                          </w:p>
+                        </w:txbxContent>
+                      </v:textbox>
+                    </v:rect>
+                  </w:pict>
+                </mc:Fallback>
+              </mc:AlternateContent>
+            </w:r>
+            <w:r>
+              <w:rPr>
+                <w:noProof/>
+                <w:color w:val="FFFFFF" w:themeColor="background1"/>
+                <w:sz w:val="32"/>
+                <w:szCs w:val="32"/>
+              </w:rPr>
               <w:drawing>
-                <wp:inline distT="0" distB="0" distL="0" distR="0" wp14:anchorId="1BD0CD1B" wp14:editId="76AF74B0">
-                  <wp:extent cx="5041900" cy="6067044"/>
+                <wp:inline distT="0" distB="0" distL="0" distR="0" wp14:anchorId="47FD71C7" wp14:editId="71EA760D">
+                  <wp:extent cx="4975906" cy="5987632"/>
                   <wp:effectExtent l="0" t="0" r="0" b="0"/>
-                  <wp:docPr id="1511177760" name="Picture 1"/>
+                  <wp:docPr id="1388703815" name="Picture 1"/>
                   <wp:cNvGraphicFramePr>
                     <a:graphicFrameLocks xmlns:a="http://schemas.openxmlformats.org/drawingml/2006/main" noChangeAspect="1"/>
                   </wp:cNvGraphicFramePr>
@@ -468,7 +3378,7 @@
                     <a:graphicData uri="http://schemas.openxmlformats.org/drawingml/2006/picture">
                       <pic:pic xmlns:pic="http://schemas.openxmlformats.org/drawingml/2006/picture">
                         <pic:nvPicPr>
-                          <pic:cNvPr id="1511177760" name=""/>
+                          <pic:cNvPr id="1388703815" name=""/>
                           <pic:cNvPicPr/>
                         </pic:nvPicPr>
                         <pic:blipFill>
@@ -478,41 +3388,60 @@
                                 <a14:imgProps xmlns:a14="http://schemas.microsoft.com/office/drawing/2010/main">
                                   <a14:imgLayer r:embed="rId12">
                                     <a14:imgEffect>
-                                      <a14:backgroundRemoval t="4560" b="93161" l="6110" r="90524">
-                                        <a14:foregroundMark x1="7731" y1="4663" x2="24439" y2="13161"/>
-                                        <a14:foregroundMark x1="24439" y1="13161" x2="45137" y2="13368"/>
-                                        <a14:foregroundMark x1="45137" y1="13368" x2="44763" y2="13368"/>
-                                        <a14:foregroundMark x1="22070" y1="12021" x2="47257" y2="8601"/>
-                                        <a14:foregroundMark x1="47257" y1="8601" x2="80050" y2="14508"/>
-                                        <a14:foregroundMark x1="80050" y1="14508" x2="86409" y2="25389"/>
-                                        <a14:foregroundMark x1="86409" y1="25389" x2="79426" y2="40104"/>
-                                        <a14:foregroundMark x1="79426" y1="40104" x2="56110" y2="44767"/>
-                                        <a14:foregroundMark x1="33791" y1="30777" x2="18080" y2="50052"/>
-                                        <a14:foregroundMark x1="18080" y1="50052" x2="19202" y2="31813"/>
-                                        <a14:foregroundMark x1="19202" y1="31813" x2="6234" y2="20000"/>
-                                        <a14:foregroundMark x1="6234" y1="20000" x2="6234" y2="54922"/>
-                                        <a14:foregroundMark x1="8105" y1="23005" x2="16334" y2="60829"/>
-                                        <a14:foregroundMark x1="16334" y1="60829" x2="39776" y2="21347"/>
-                                        <a14:foregroundMark x1="39776" y1="21347" x2="32294" y2="44974"/>
-                                        <a14:foregroundMark x1="32294" y1="44974" x2="51372" y2="48290"/>
-                                        <a14:foregroundMark x1="51372" y1="48290" x2="62095" y2="42280"/>
-                                        <a14:foregroundMark x1="62095" y1="42280" x2="72943" y2="64974"/>
-                                        <a14:foregroundMark x1="72943" y1="64974" x2="82419" y2="54922"/>
-                                        <a14:foregroundMark x1="82419" y1="54922" x2="86284" y2="78342"/>
-                                        <a14:foregroundMark x1="86284" y1="78342" x2="84165" y2="74922"/>
-                                        <a14:foregroundMark x1="90648" y1="23005" x2="88903" y2="50674"/>
-                                        <a14:foregroundMark x1="88903" y1="50674" x2="87781" y2="53057"/>
-                                        <a14:foregroundMark x1="8105" y1="93161" x2="43392" y2="93472"/>
-                                        <a14:foregroundMark x1="43392" y1="93472" x2="62344" y2="93368"/>
-                                        <a14:foregroundMark x1="62344" y1="93368" x2="73691" y2="93679"/>
-                                        <a14:foregroundMark x1="73691" y1="93679" x2="85037" y2="93161"/>
-                                        <a14:foregroundMark x1="85037" y1="93161" x2="90025" y2="90570"/>
-                                        <a14:backgroundMark x1="10973" y1="1451" x2="40399" y2="2591"/>
-                                        <a14:backgroundMark x1="40399" y1="2591" x2="60599" y2="1451"/>
-                                        <a14:backgroundMark x1="60599" y1="1451" x2="92893" y2="2487"/>
-                                        <a14:backgroundMark x1="92893" y1="2487" x2="95761" y2="7772"/>
-                                        <a14:backgroundMark x1="4988" y1="2280" x2="374" y2="6321"/>
-                                        <a14:backgroundMark x1="2868" y1="2694" x2="11845" y2="1554"/>
+                                      <a14:backgroundRemoval t="5596" b="92850" l="5237" r="93516">
+                                        <a14:foregroundMark x1="6484" y1="5389" x2="12469" y2="43420"/>
+                                        <a14:foregroundMark x1="12469" y1="43420" x2="38279" y2="50570"/>
+                                        <a14:foregroundMark x1="38279" y1="50570" x2="63965" y2="50259"/>
+                                        <a14:foregroundMark x1="63965" y1="50259" x2="77057" y2="51295"/>
+                                        <a14:foregroundMark x1="77057" y1="51295" x2="89776" y2="50155"/>
+                                        <a14:foregroundMark x1="89776" y1="50155" x2="92643" y2="41451"/>
+                                        <a14:foregroundMark x1="92643" y1="41451" x2="91022" y2="8497"/>
+                                        <a14:foregroundMark x1="91022" y1="8497" x2="18204" y2="6528"/>
+                                        <a14:foregroundMark x1="18204" y1="6528" x2="11970" y2="20622"/>
+                                        <a14:foregroundMark x1="11970" y1="20622" x2="49751" y2="16062"/>
+                                        <a14:foregroundMark x1="49751" y1="16062" x2="51496" y2="34819"/>
+                                        <a14:foregroundMark x1="51496" y1="34819" x2="60224" y2="47358"/>
+                                        <a14:foregroundMark x1="60224" y1="47358" x2="55985" y2="48187"/>
+                                        <a14:foregroundMark x1="5237" y1="6943" x2="5736" y2="47047"/>
+                                        <a14:foregroundMark x1="66833" y1="40518" x2="68703" y2="43938"/>
+                                        <a14:foregroundMark x1="85910" y1="46528" x2="85536" y2="47358"/>
+                                        <a14:foregroundMark x1="47631" y1="9534" x2="52120" y2="9119"/>
+                                        <a14:foregroundMark x1="44140" y1="5389" x2="54364" y2="5907"/>
+                                        <a14:foregroundMark x1="54364" y1="5907" x2="55611" y2="5803"/>
+                                        <a14:foregroundMark x1="5736" y1="57824" x2="5985" y2="87047"/>
+                                        <a14:foregroundMark x1="5985" y1="87047" x2="15212" y2="93679"/>
+                                        <a14:foregroundMark x1="15212" y1="93679" x2="31796" y2="92746"/>
+                                        <a14:foregroundMark x1="31796" y1="92746" x2="56359" y2="94197"/>
+                                        <a14:foregroundMark x1="56359" y1="94197" x2="91521" y2="92021"/>
+                                        <a14:foregroundMark x1="91521" y1="92021" x2="91272" y2="62176"/>
+                                        <a14:foregroundMark x1="91272" y1="62176" x2="19950" y2="58549"/>
+                                        <a14:foregroundMark x1="19950" y1="58549" x2="9726" y2="60415"/>
+                                        <a14:foregroundMark x1="9726" y1="60415" x2="66085" y2="66010"/>
+                                        <a14:foregroundMark x1="66085" y1="66010" x2="80923" y2="65803"/>
+                                        <a14:foregroundMark x1="80923" y1="65803" x2="9975" y2="65285"/>
+                                        <a14:foregroundMark x1="9975" y1="65285" x2="17830" y2="70052"/>
+                                        <a14:foregroundMark x1="17830" y1="70052" x2="59850" y2="71917"/>
+                                        <a14:foregroundMark x1="59850" y1="71917" x2="74688" y2="69534"/>
+                                        <a14:foregroundMark x1="74688" y1="69534" x2="18703" y2="70984"/>
+                                        <a14:foregroundMark x1="18703" y1="70984" x2="63217" y2="77306"/>
+                                        <a14:foregroundMark x1="63217" y1="77306" x2="79676" y2="76477"/>
+                                        <a14:foregroundMark x1="79676" y1="76477" x2="87157" y2="86839"/>
+                                        <a14:foregroundMark x1="87157" y1="86839" x2="25935" y2="90984"/>
+                                        <a14:foregroundMark x1="25935" y1="90984" x2="11222" y2="86528"/>
+                                        <a14:foregroundMark x1="11222" y1="86528" x2="10848" y2="78446"/>
+                                        <a14:foregroundMark x1="10848" y1="78446" x2="23566" y2="82073"/>
+                                        <a14:foregroundMark x1="23566" y1="82073" x2="32045" y2="87876"/>
+                                        <a14:foregroundMark x1="32045" y1="87876" x2="43890" y2="83005"/>
+                                        <a14:foregroundMark x1="43890" y1="83005" x2="78928" y2="84145"/>
+                                        <a14:foregroundMark x1="78928" y1="84145" x2="79052" y2="73679"/>
+                                        <a14:foregroundMark x1="79052" y1="73679" x2="68454" y2="69326"/>
+                                        <a14:foregroundMark x1="68454" y1="69326" x2="38529" y2="74197"/>
+                                        <a14:foregroundMark x1="38529" y1="74197" x2="28678" y2="68497"/>
+                                        <a14:foregroundMark x1="28678" y1="68497" x2="45885" y2="69534"/>
+                                        <a14:foregroundMark x1="45885" y1="69534" x2="39900" y2="72435"/>
+                                        <a14:foregroundMark x1="5237" y1="89119" x2="11845" y2="92953"/>
+                                        <a14:foregroundMark x1="93142" y1="17513" x2="90898" y2="32021"/>
+                                        <a14:foregroundMark x1="90898" y1="32021" x2="93516" y2="42487"/>
                                       </a14:backgroundRemoval>
                                     </a14:imgEffect>
                                   </a14:imgLayer>
@@ -527,7 +3456,7 @@
                         <pic:spPr>
                           <a:xfrm>
                             <a:off x="0" y="0"/>
-                            <a:ext cx="5048369" cy="6074828"/>
+                            <a:ext cx="5000866" cy="6017667"/>
                           </a:xfrm>
                           <a:prstGeom prst="rect">
                             <a:avLst/>
@@ -552,7 +3481,7 @@
         <mc:AlternateContent>
           <mc:Choice Requires="wps">
             <w:drawing>
-              <wp:anchor distT="0" distB="0" distL="114300" distR="114300" simplePos="0" relativeHeight="251666432" behindDoc="1" locked="0" layoutInCell="1" allowOverlap="1" wp14:anchorId="32174439" wp14:editId="4DC247E9">
+              <wp:anchor distT="0" distB="0" distL="114300" distR="114300" simplePos="0" relativeHeight="251666432" behindDoc="1" locked="0" layoutInCell="1" allowOverlap="1" wp14:anchorId="32174439" wp14:editId="4140C947">
                 <wp:simplePos x="0" y="0"/>
                 <wp:positionH relativeFrom="page">
                   <wp:align>left</wp:align>
@@ -588,7 +3517,7 @@
                             <a:gs pos="0">
                               <a:srgbClr val="FFCC33"/>
                             </a:gs>
-                            <a:gs pos="11000">
+                            <a:gs pos="12000">
                               <a:srgbClr val="FFCC33"/>
                             </a:gs>
                             <a:gs pos="90000">
@@ -640,8 +3569,8 @@
           </mc:Choice>
           <mc:Fallback>
             <w:pict>
-              <v:rect w14:anchorId="36D02984" id="Rectangle 3" o:spid="_x0000_s1026" style="position:absolute;margin-left:0;margin-top:0;width:594.95pt;height:693pt;z-index:-251650048;visibility:visible;mso-wrap-style:square;mso-width-percent:0;mso-height-percent:0;mso-wrap-distance-left:9pt;mso-wrap-distance-top:0;mso-wrap-distance-right:9pt;mso-wrap-distance-bottom:0;mso-position-horizontal:left;mso-position-horizontal-relative:page;mso-position-vertical:top;mso-position-vertical-relative:page;mso-width-percent:0;mso-height-percent:0;mso-width-relative:margin;mso-height-relative:margin;v-text-anchor:middle" o:gfxdata="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" fillcolor="#fc3" stroked="f" strokeweight="1.5pt">
-                <v:fill color2="#003082" colors="0 #fc3;7209f #fc3;9830f white;19661f white;58982f #003082;1 #003082" focus="100%" type="gradient"/>
+              <v:rect w14:anchorId="5D7B285E" id="Rectangle 3" o:spid="_x0000_s1026" style="position:absolute;margin-left:0;margin-top:0;width:594.95pt;height:693pt;z-index:-251650048;visibility:visible;mso-wrap-style:square;mso-width-percent:0;mso-height-percent:0;mso-wrap-distance-left:9pt;mso-wrap-distance-top:0;mso-wrap-distance-right:9pt;mso-wrap-distance-bottom:0;mso-position-horizontal:left;mso-position-horizontal-relative:page;mso-position-vertical:top;mso-position-vertical-relative:page;mso-width-percent:0;mso-height-percent:0;mso-width-relative:margin;mso-height-relative:margin;v-text-anchor:middle" o:gfxdata="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" fillcolor="#fc3" stroked="f" strokeweight="1.5pt">
+                <v:fill color2="#003082" colors="0 #fc3;7864f #fc3;9830f white;19661f white;58982f #003082;1 #003082" focus="100%" type="gradient"/>
                 <w10:wrap anchorx="page" anchory="page"/>
               </v:rect>
             </w:pict>
@@ -1112,7 +4041,23 @@
                 <w:sz w:val="16"/>
                 <w:szCs w:val="16"/>
               </w:rPr>
-              <w:t xml:space="preserve"> version 1 </w:t>
+              <w:t xml:space="preserve"> </w:t>
+            </w:r>
+            <w:r>
+              <w:rPr>
+                <w:color w:val="FFFFFF" w:themeColor="background1"/>
+                <w:sz w:val="16"/>
+                <w:szCs w:val="16"/>
+              </w:rPr>
+              <w:t xml:space="preserve">NS Mat’64 </w:t>
+            </w:r>
+            <w:r>
+              <w:rPr>
+                <w:color w:val="FFFFFF" w:themeColor="background1"/>
+                <w:sz w:val="16"/>
+                <w:szCs w:val="16"/>
+              </w:rPr>
+              <w:t xml:space="preserve">version 1 </w:t>
             </w:r>
             <w:hyperlink r:id="rId13" w:history="1">
               <w:r>

</xml_diff>

<commit_message>
Updated doc with recommended initial states of levers and knobs
</commit_message>
<xml_diff>
--- a/profiles/mat64_ct_tsc_thejag.docx
+++ b/profiles/mat64_ct_tsc_thejag.docx
@@ -109,7 +109,7 @@
                 <w:noProof/>
               </w:rPr>
               <w:drawing>
-                <wp:inline distT="0" distB="0" distL="0" distR="0" wp14:anchorId="6543BDCD" wp14:editId="52CFD69B">
+                <wp:inline distT="0" distB="0" distL="0" distR="0" wp14:anchorId="6543BDCD" wp14:editId="4BA35ABD">
                   <wp:extent cx="532932" cy="324844"/>
                   <wp:effectExtent l="0" t="0" r="635" b="0"/>
                   <wp:docPr id="1708481258" name="Picture 1" descr="Android Apps by Nederlandse Spoorwegen ..."/>
@@ -179,7 +179,6 @@
                 <w:szCs w:val="32"/>
               </w:rPr>
             </w:pPr>
-            <w:proofErr w:type="spellStart"/>
             <w:r>
               <w:rPr>
                 <w:rFonts w:asciiTheme="majorHAnsi" w:hAnsiTheme="majorHAnsi"/>
@@ -189,19 +188,7 @@
                 <w:sz w:val="36"/>
                 <w:szCs w:val="36"/>
               </w:rPr>
-              <w:t>ChrisTrains</w:t>
-            </w:r>
-            <w:proofErr w:type="spellEnd"/>
-            <w:r>
-              <w:rPr>
-                <w:rFonts w:asciiTheme="majorHAnsi" w:hAnsiTheme="majorHAnsi"/>
-                <w:b/>
-                <w:bCs/>
-                <w:color w:val="003082"/>
-                <w:sz w:val="36"/>
-                <w:szCs w:val="36"/>
-              </w:rPr>
-              <w:t xml:space="preserve"> NS </w:t>
+              <w:t xml:space="preserve">ChrisTrains NS </w:t>
             </w:r>
             <w:r>
               <w:rPr>
@@ -340,7 +327,7 @@
                 <w:noProof/>
               </w:rPr>
               <w:drawing>
-                <wp:inline distT="0" distB="0" distL="0" distR="0" wp14:anchorId="620BEBDD" wp14:editId="3FA25EE6">
+                <wp:inline distT="0" distB="0" distL="0" distR="0" wp14:anchorId="620BEBDD" wp14:editId="66AB181E">
                   <wp:extent cx="6840000" cy="240506"/>
                   <wp:effectExtent l="0" t="0" r="0" b="7620"/>
                   <wp:docPr id="1452356147" name="Picture 2"/>
@@ -458,187 +445,197 @@
                 <w:szCs w:val="32"/>
               </w:rPr>
               <mc:AlternateContent>
-                <mc:Choice Requires="wps">
+                <mc:Choice Requires="wpg">
                   <w:drawing>
-                    <wp:anchor distT="0" distB="0" distL="114300" distR="114300" simplePos="0" relativeHeight="251694080" behindDoc="0" locked="0" layoutInCell="1" allowOverlap="1" wp14:anchorId="01FDE6F4" wp14:editId="176AEA1E">
+                    <wp:anchor distT="0" distB="0" distL="114300" distR="114300" simplePos="0" relativeHeight="251715584" behindDoc="0" locked="0" layoutInCell="1" allowOverlap="1" wp14:anchorId="0E037F5D" wp14:editId="608726D9">
                       <wp:simplePos x="0" y="0"/>
                       <wp:positionH relativeFrom="column">
-                        <wp:posOffset>1313612</wp:posOffset>
+                        <wp:posOffset>3355340</wp:posOffset>
                       </wp:positionH>
                       <wp:positionV relativeFrom="paragraph">
-                        <wp:posOffset>4053985</wp:posOffset>
+                        <wp:posOffset>5734524</wp:posOffset>
                       </wp:positionV>
-                      <wp:extent cx="660203" cy="323850"/>
-                      <wp:effectExtent l="0" t="0" r="26035" b="19050"/>
+                      <wp:extent cx="2266315" cy="223520"/>
+                      <wp:effectExtent l="0" t="0" r="0" b="5080"/>
                       <wp:wrapNone/>
-                      <wp:docPr id="2094956401" name="Rectangle 1"/>
+                      <wp:docPr id="533692793" name="Group 2"/>
                       <wp:cNvGraphicFramePr/>
                       <a:graphic xmlns:a="http://schemas.openxmlformats.org/drawingml/2006/main">
-                        <a:graphicData uri="http://schemas.microsoft.com/office/word/2010/wordprocessingShape">
-                          <wps:wsp>
-                            <wps:cNvSpPr/>
-                            <wps:spPr>
+                        <a:graphicData uri="http://schemas.microsoft.com/office/word/2010/wordprocessingGroup">
+                          <wpg:wgp>
+                            <wpg:cNvGrpSpPr/>
+                            <wpg:grpSpPr>
                               <a:xfrm>
                                 <a:off x="0" y="0"/>
-                                <a:ext cx="660203" cy="323850"/>
+                                <a:ext cx="2266315" cy="223520"/>
+                                <a:chOff x="0" y="9526"/>
+                                <a:chExt cx="2266949" cy="223837"/>
                               </a:xfrm>
-                              <a:prstGeom prst="rect">
-                                <a:avLst/>
-                              </a:prstGeom>
-                              <a:solidFill>
-                                <a:srgbClr val="000000">
-                                  <a:alpha val="60000"/>
-                                </a:srgbClr>
-                              </a:solidFill>
-                              <a:ln w="12700">
+                            </wpg:grpSpPr>
+                            <wps:wsp>
+                              <wps:cNvPr id="522613170" name="Oval 1"/>
+                              <wps:cNvSpPr/>
+                              <wps:spPr>
+                                <a:xfrm>
+                                  <a:off x="0" y="76201"/>
+                                  <a:ext cx="95250" cy="95250"/>
+                                </a:xfrm>
+                                <a:prstGeom prst="ellipse">
+                                  <a:avLst/>
+                                </a:prstGeom>
                                 <a:solidFill>
-                                  <a:srgbClr val="FF0000"/>
+                                  <a:srgbClr val="00B050"/>
                                 </a:solidFill>
-                              </a:ln>
-                            </wps:spPr>
-                            <wps:style>
-                              <a:lnRef idx="2">
-                                <a:schemeClr val="accent1">
-                                  <a:shade val="15000"/>
-                                </a:schemeClr>
-                              </a:lnRef>
-                              <a:fillRef idx="1">
-                                <a:schemeClr val="accent1"/>
-                              </a:fillRef>
-                              <a:effectRef idx="0">
-                                <a:schemeClr val="accent1"/>
-                              </a:effectRef>
-                              <a:fontRef idx="minor">
-                                <a:schemeClr val="lt1"/>
-                              </a:fontRef>
-                            </wps:style>
-                            <wps:txbx>
-                              <w:txbxContent>
-                                <w:p>
-                                  <w:pPr>
-                                    <w:spacing w:after="0" w:line="204" w:lineRule="auto"/>
-                                    <w:jc w:val="center"/>
-                                    <w:rPr>
-                                      <w:b/>
-                                      <w:bCs/>
-                                      <w:color w:val="FF0000"/>
-                                      <w:sz w:val="20"/>
-                                      <w:szCs w:val="20"/>
-                                      <w14:shadow w14:blurRad="50800" w14:dist="38100" w14:dir="2700000" w14:sx="100000" w14:sy="100000" w14:kx="0" w14:ky="0" w14:algn="tl">
-                                        <w14:srgbClr w14:val="000000">
-                                          <w14:alpha w14:val="60000"/>
-                                        </w14:srgbClr>
-                                      </w14:shadow>
-                                    </w:rPr>
-                                  </w:pPr>
-                                  <w:r>
-                                    <w:rPr>
-                                      <w:b/>
-                                      <w:bCs/>
-                                      <w:color w:val="FF0000"/>
-                                      <w:sz w:val="20"/>
-                                      <w:szCs w:val="20"/>
-                                      <w14:shadow w14:blurRad="50800" w14:dist="38100" w14:dir="2700000" w14:sx="100000" w14:sy="100000" w14:kx="0" w14:ky="0" w14:algn="tl">
-                                        <w14:srgbClr w14:val="000000">
-                                          <w14:alpha w14:val="60000"/>
-                                        </w14:srgbClr>
-                                      </w14:shadow>
-                                    </w:rPr>
-                                    <w:t xml:space="preserve">Deadman </w:t>
-                                  </w:r>
-                                  <w:r>
-                                    <w:rPr>
-                                      <w:b/>
-                                      <w:bCs/>
-                                      <w:color w:val="FF0000"/>
-                                      <w:sz w:val="20"/>
-                                      <w:szCs w:val="20"/>
-                                      <w14:shadow w14:blurRad="50800" w14:dist="38100" w14:dir="2700000" w14:sx="100000" w14:sy="100000" w14:kx="0" w14:ky="0" w14:algn="tl">
-                                        <w14:srgbClr w14:val="000000">
-                                          <w14:alpha w14:val="60000"/>
-                                        </w14:srgbClr>
-                                      </w14:shadow>
-                                    </w:rPr>
-                                    <w:t>reset</w:t>
-                                  </w:r>
-                                </w:p>
-                              </w:txbxContent>
-                            </wps:txbx>
-                            <wps:bodyPr rot="0" spcFirstLastPara="0" vertOverflow="overflow" horzOverflow="overflow" vert="horz" wrap="square" lIns="0" tIns="0" rIns="0" bIns="0" numCol="1" spcCol="0" rtlCol="0" fromWordArt="0" anchor="ctr" anchorCtr="0" forceAA="0" compatLnSpc="1">
-                              <a:prstTxWarp prst="textNoShape">
-                                <a:avLst/>
-                              </a:prstTxWarp>
-                              <a:noAutofit/>
-                            </wps:bodyPr>
-                          </wps:wsp>
+                                <a:ln w="9525">
+                                  <a:solidFill>
+                                    <a:schemeClr val="bg1"/>
+                                  </a:solidFill>
+                                </a:ln>
+                              </wps:spPr>
+                              <wps:style>
+                                <a:lnRef idx="2">
+                                  <a:schemeClr val="accent6">
+                                    <a:shade val="15000"/>
+                                  </a:schemeClr>
+                                </a:lnRef>
+                                <a:fillRef idx="1">
+                                  <a:schemeClr val="accent6"/>
+                                </a:fillRef>
+                                <a:effectRef idx="0">
+                                  <a:schemeClr val="accent6"/>
+                                </a:effectRef>
+                                <a:fontRef idx="minor">
+                                  <a:schemeClr val="lt1"/>
+                                </a:fontRef>
+                              </wps:style>
+                              <wps:bodyPr rot="0" spcFirstLastPara="0" vertOverflow="overflow" horzOverflow="overflow" vert="horz" wrap="square" lIns="91440" tIns="45720" rIns="91440" bIns="45720" numCol="1" spcCol="0" rtlCol="0" fromWordArt="0" anchor="ctr" anchorCtr="0" forceAA="0" compatLnSpc="1">
+                                <a:prstTxWarp prst="textNoShape">
+                                  <a:avLst/>
+                                </a:prstTxWarp>
+                                <a:noAutofit/>
+                              </wps:bodyPr>
+                            </wps:wsp>
+                            <wps:wsp>
+                              <wps:cNvPr id="217" name="Text Box 2"/>
+                              <wps:cNvSpPr txBox="1">
+                                <a:spLocks noChangeArrowheads="1"/>
+                              </wps:cNvSpPr>
+                              <wps:spPr bwMode="auto">
+                                <a:xfrm>
+                                  <a:off x="52370" y="9526"/>
+                                  <a:ext cx="2214579" cy="223837"/>
+                                </a:xfrm>
+                                <a:prstGeom prst="rect">
+                                  <a:avLst/>
+                                </a:prstGeom>
+                                <a:noFill/>
+                                <a:ln w="9525">
+                                  <a:noFill/>
+                                  <a:miter lim="800000"/>
+                                  <a:headEnd/>
+                                  <a:tailEnd/>
+                                </a:ln>
+                              </wps:spPr>
+                              <wps:txbx>
+                                <w:txbxContent>
+                                  <w:p>
+                                    <w:pPr>
+                                      <w:rPr>
+                                        <w:color w:val="FFFFFF" w:themeColor="background1"/>
+                                        <w:sz w:val="16"/>
+                                        <w:szCs w:val="16"/>
+                                      </w:rPr>
+                                    </w:pPr>
+                                    <w:r>
+                                      <w:rPr>
+                                        <w:color w:val="FFFFFF" w:themeColor="background1"/>
+                                        <w:sz w:val="16"/>
+                                        <w:szCs w:val="16"/>
+                                      </w:rPr>
+                                      <w:t xml:space="preserve">Recommended initial </w:t>
+                                    </w:r>
+                                    <w:r>
+                                      <w:rPr>
+                                        <w:color w:val="FFFFFF" w:themeColor="background1"/>
+                                        <w:sz w:val="16"/>
+                                        <w:szCs w:val="16"/>
+                                      </w:rPr>
+                                      <w:t>position</w:t>
+                                    </w:r>
+                                    <w:r>
+                                      <w:rPr>
+                                        <w:color w:val="FFFFFF" w:themeColor="background1"/>
+                                        <w:sz w:val="16"/>
+                                        <w:szCs w:val="16"/>
+                                      </w:rPr>
+                                      <w:t xml:space="preserve"> of lever / knob</w:t>
+                                    </w:r>
+                                  </w:p>
+                                </w:txbxContent>
+                              </wps:txbx>
+                              <wps:bodyPr rot="0" vert="horz" wrap="square" lIns="91440" tIns="45720" rIns="91440" bIns="45720" anchor="t" anchorCtr="0">
+                                <a:noAutofit/>
+                              </wps:bodyPr>
+                            </wps:wsp>
+                          </wpg:wgp>
                         </a:graphicData>
                       </a:graphic>
                       <wp14:sizeRelH relativeFrom="margin">
                         <wp14:pctWidth>0</wp14:pctWidth>
                       </wp14:sizeRelH>
-                      <wp14:sizeRelV relativeFrom="margin">
-                        <wp14:pctHeight>0</wp14:pctHeight>
-                      </wp14:sizeRelV>
                     </wp:anchor>
                   </w:drawing>
                 </mc:Choice>
                 <mc:Fallback>
                   <w:pict>
-                    <v:rect w14:anchorId="01FDE6F4" id="Rectangle 1" o:spid="_x0000_s1026" style="position:absolute;left:0;text-align:left;margin-left:103.45pt;margin-top:319.2pt;width:52pt;height:25.5pt;z-index:251694080;visibility:visible;mso-wrap-style:square;mso-width-percent:0;mso-height-percent:0;mso-wrap-distance-left:9pt;mso-wrap-distance-top:0;mso-wrap-distance-right:9pt;mso-wrap-distance-bottom:0;mso-position-horizontal:absolute;mso-position-horizontal-relative:text;mso-position-vertical:absolute;mso-position-vertical-relative:text;mso-width-percent:0;mso-height-percent:0;mso-width-relative:margin;mso-height-relative:margin;v-text-anchor:middle" o:gfxdata="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" fillcolor="black" strokecolor="red" strokeweight="1pt">
-                      <v:fill opacity="39321f"/>
-                      <v:textbox inset="0,0,0,0">
-                        <w:txbxContent>
-                          <w:p>
-                            <w:pPr>
-                              <w:spacing w:after="0" w:line="204" w:lineRule="auto"/>
-                              <w:jc w:val="center"/>
-                              <w:rPr>
-                                <w:b/>
-                                <w:bCs/>
-                                <w:color w:val="FF0000"/>
-                                <w:sz w:val="20"/>
-                                <w:szCs w:val="20"/>
-                                <w14:shadow w14:blurRad="50800" w14:dist="38100" w14:dir="2700000" w14:sx="100000" w14:sy="100000" w14:kx="0" w14:ky="0" w14:algn="tl">
-                                  <w14:srgbClr w14:val="000000">
-                                    <w14:alpha w14:val="60000"/>
-                                  </w14:srgbClr>
-                                </w14:shadow>
-                              </w:rPr>
-                            </w:pPr>
-                            <w:r>
-                              <w:rPr>
-                                <w:b/>
-                                <w:bCs/>
-                                <w:color w:val="FF0000"/>
-                                <w:sz w:val="20"/>
-                                <w:szCs w:val="20"/>
-                                <w14:shadow w14:blurRad="50800" w14:dist="38100" w14:dir="2700000" w14:sx="100000" w14:sy="100000" w14:kx="0" w14:ky="0" w14:algn="tl">
-                                  <w14:srgbClr w14:val="000000">
-                                    <w14:alpha w14:val="60000"/>
-                                  </w14:srgbClr>
-                                </w14:shadow>
-                              </w:rPr>
-                              <w:t xml:space="preserve">Deadman </w:t>
-                            </w:r>
-                            <w:r>
-                              <w:rPr>
-                                <w:b/>
-                                <w:bCs/>
-                                <w:color w:val="FF0000"/>
-                                <w:sz w:val="20"/>
-                                <w:szCs w:val="20"/>
-                                <w14:shadow w14:blurRad="50800" w14:dist="38100" w14:dir="2700000" w14:sx="100000" w14:sy="100000" w14:kx="0" w14:ky="0" w14:algn="tl">
-                                  <w14:srgbClr w14:val="000000">
-                                    <w14:alpha w14:val="60000"/>
-                                  </w14:srgbClr>
-                                </w14:shadow>
-                              </w:rPr>
-                              <w:t>reset</w:t>
-                            </w:r>
-                          </w:p>
-                        </w:txbxContent>
-                      </v:textbox>
-                    </v:rect>
+                    <v:group w14:anchorId="0E037F5D" id="Group 2" o:spid="_x0000_s1026" style="position:absolute;left:0;text-align:left;margin-left:264.2pt;margin-top:451.55pt;width:178.45pt;height:17.6pt;z-index:251715584;mso-width-relative:margin" coordorigin=",95" coordsize="22669,2238" o:gfxdata="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">
+                      <v:oval id="_x0000_s1027" style="position:absolute;top:762;width:952;height:952;visibility:visible;mso-wrap-style:square;v-text-anchor:middle" o:gfxdata="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" fillcolor="#00b050" strokecolor="white [3212]">
+                        <v:stroke joinstyle="miter"/>
+                      </v:oval>
+                      <v:shapetype id="_x0000_t202" coordsize="21600,21600" o:spt="202" path="m,l,21600r21600,l21600,xe">
+                        <v:stroke joinstyle="miter"/>
+                        <v:path gradientshapeok="t" o:connecttype="rect"/>
+                      </v:shapetype>
+                      <v:shape id="_x0000_s1028" type="#_x0000_t202" style="position:absolute;left:523;top:95;width:22146;height:2238;visibility:visible;mso-wrap-style:square;v-text-anchor:top" o:gfxdata="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" filled="f" stroked="f">
+                        <v:textbox>
+                          <w:txbxContent>
+                            <w:p>
+                              <w:pPr>
+                                <w:rPr>
+                                  <w:color w:val="FFFFFF" w:themeColor="background1"/>
+                                  <w:sz w:val="16"/>
+                                  <w:szCs w:val="16"/>
+                                </w:rPr>
+                              </w:pPr>
+                              <w:r>
+                                <w:rPr>
+                                  <w:color w:val="FFFFFF" w:themeColor="background1"/>
+                                  <w:sz w:val="16"/>
+                                  <w:szCs w:val="16"/>
+                                </w:rPr>
+                                <w:t xml:space="preserve">Recommended initial </w:t>
+                              </w:r>
+                              <w:r>
+                                <w:rPr>
+                                  <w:color w:val="FFFFFF" w:themeColor="background1"/>
+                                  <w:sz w:val="16"/>
+                                  <w:szCs w:val="16"/>
+                                </w:rPr>
+                                <w:t>position</w:t>
+                              </w:r>
+                              <w:r>
+                                <w:rPr>
+                                  <w:color w:val="FFFFFF" w:themeColor="background1"/>
+                                  <w:sz w:val="16"/>
+                                  <w:szCs w:val="16"/>
+                                </w:rPr>
+                                <w:t xml:space="preserve"> of lever / knob</w:t>
+                              </w:r>
+                            </w:p>
+                          </w:txbxContent>
+                        </v:textbox>
+                      </v:shape>
+                    </v:group>
                   </w:pict>
                 </mc:Fallback>
               </mc:AlternateContent>
@@ -653,250 +650,18 @@
               <mc:AlternateContent>
                 <mc:Choice Requires="wps">
                   <w:drawing>
-                    <wp:anchor distT="0" distB="0" distL="114300" distR="114300" simplePos="0" relativeHeight="251700224" behindDoc="0" locked="0" layoutInCell="1" allowOverlap="1" wp14:anchorId="7B697D34" wp14:editId="682EEED2">
+                    <wp:anchor distT="0" distB="0" distL="114300" distR="114300" simplePos="0" relativeHeight="251668480" behindDoc="0" locked="0" layoutInCell="1" allowOverlap="1" wp14:anchorId="0B986780" wp14:editId="7A872D1F">
                       <wp:simplePos x="0" y="0"/>
                       <wp:positionH relativeFrom="column">
-                        <wp:posOffset>4622673</wp:posOffset>
+                        <wp:posOffset>1355725</wp:posOffset>
                       </wp:positionH>
                       <wp:positionV relativeFrom="paragraph">
-                        <wp:posOffset>4975809</wp:posOffset>
+                        <wp:posOffset>1720850</wp:posOffset>
                       </wp:positionV>
                       <wp:extent cx="611505" cy="215900"/>
                       <wp:effectExtent l="0" t="0" r="17145" b="12700"/>
                       <wp:wrapNone/>
-                      <wp:docPr id="974760974" name="Rectangle 1"/>
-                      <wp:cNvGraphicFramePr/>
-                      <a:graphic xmlns:a="http://schemas.openxmlformats.org/drawingml/2006/main">
-                        <a:graphicData uri="http://schemas.microsoft.com/office/word/2010/wordprocessingShape">
-                          <wps:wsp>
-                            <wps:cNvSpPr/>
-                            <wps:spPr>
-                              <a:xfrm>
-                                <a:off x="0" y="0"/>
-                                <a:ext cx="611505" cy="215900"/>
-                              </a:xfrm>
-                              <a:prstGeom prst="rect">
-                                <a:avLst/>
-                              </a:prstGeom>
-                              <a:solidFill>
-                                <a:srgbClr val="000000">
-                                  <a:alpha val="60000"/>
-                                </a:srgbClr>
-                              </a:solidFill>
-                              <a:ln w="12700" cap="flat" cmpd="sng" algn="ctr">
-                                <a:solidFill>
-                                  <a:srgbClr val="FF0000"/>
-                                </a:solidFill>
-                                <a:prstDash val="solid"/>
-                                <a:miter lim="800000"/>
-                              </a:ln>
-                              <a:effectLst/>
-                            </wps:spPr>
-                            <wps:txbx>
-                              <w:txbxContent>
-                                <w:p>
-                                  <w:pPr>
-                                    <w:spacing w:after="0"/>
-                                    <w:jc w:val="center"/>
-                                    <w:rPr>
-                                      <w:b/>
-                                      <w:bCs/>
-                                      <w:color w:val="FF0000"/>
-                                      <w:sz w:val="20"/>
-                                      <w:szCs w:val="20"/>
-                                      <w14:shadow w14:blurRad="50800" w14:dist="38100" w14:dir="2700000" w14:sx="100000" w14:sy="100000" w14:kx="0" w14:ky="0" w14:algn="tl">
-                                        <w14:srgbClr w14:val="000000">
-                                          <w14:alpha w14:val="60000"/>
-                                        </w14:srgbClr>
-                                      </w14:shadow>
-                                    </w:rPr>
-                                  </w:pPr>
-                                  <w:r>
-                                    <w:rPr>
-                                      <w:b/>
-                                      <w:bCs/>
-                                      <w:color w:val="FF0000"/>
-                                      <w:sz w:val="20"/>
-                                      <w:szCs w:val="20"/>
-                                      <w14:shadow w14:blurRad="50800" w14:dist="38100" w14:dir="2700000" w14:sx="100000" w14:sy="100000" w14:kx="0" w14:ky="0" w14:algn="tl">
-                                        <w14:srgbClr w14:val="000000">
-                                          <w14:alpha w14:val="60000"/>
-                                        </w14:srgbClr>
-                                      </w14:shadow>
-                                    </w:rPr>
-                                    <w:t>Wipers</w:t>
-                                  </w:r>
-                                </w:p>
-                              </w:txbxContent>
-                            </wps:txbx>
-                            <wps:bodyPr rot="0" spcFirstLastPara="0" vertOverflow="overflow" horzOverflow="overflow" vert="horz" wrap="square" lIns="0" tIns="0" rIns="0" bIns="0" numCol="1" spcCol="0" rtlCol="0" fromWordArt="0" anchor="ctr" anchorCtr="0" forceAA="0" compatLnSpc="1">
-                              <a:prstTxWarp prst="textNoShape">
-                                <a:avLst/>
-                              </a:prstTxWarp>
-                              <a:noAutofit/>
-                            </wps:bodyPr>
-                          </wps:wsp>
-                        </a:graphicData>
-                      </a:graphic>
-                      <wp14:sizeRelH relativeFrom="margin">
-                        <wp14:pctWidth>0</wp14:pctWidth>
-                      </wp14:sizeRelH>
-                      <wp14:sizeRelV relativeFrom="margin">
-                        <wp14:pctHeight>0</wp14:pctHeight>
-                      </wp14:sizeRelV>
-                    </wp:anchor>
-                  </w:drawing>
-                </mc:Choice>
-                <mc:Fallback>
-                  <w:pict>
-                    <v:rect w14:anchorId="7B697D34" id="_x0000_s1027" style="position:absolute;left:0;text-align:left;margin-left:364pt;margin-top:391.8pt;width:48.15pt;height:17pt;z-index:251700224;visibility:visible;mso-wrap-style:square;mso-width-percent:0;mso-height-percent:0;mso-wrap-distance-left:9pt;mso-wrap-distance-top:0;mso-wrap-distance-right:9pt;mso-wrap-distance-bottom:0;mso-position-horizontal:absolute;mso-position-horizontal-relative:text;mso-position-vertical:absolute;mso-position-vertical-relative:text;mso-width-percent:0;mso-height-percent:0;mso-width-relative:margin;mso-height-relative:margin;v-text-anchor:middle" o:gfxdata="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" fillcolor="black" strokecolor="red" strokeweight="1pt">
-                      <v:fill opacity="39321f"/>
-                      <v:textbox inset="0,0,0,0">
-                        <w:txbxContent>
-                          <w:p>
-                            <w:pPr>
-                              <w:spacing w:after="0"/>
-                              <w:jc w:val="center"/>
-                              <w:rPr>
-                                <w:b/>
-                                <w:bCs/>
-                                <w:color w:val="FF0000"/>
-                                <w:sz w:val="20"/>
-                                <w:szCs w:val="20"/>
-                                <w14:shadow w14:blurRad="50800" w14:dist="38100" w14:dir="2700000" w14:sx="100000" w14:sy="100000" w14:kx="0" w14:ky="0" w14:algn="tl">
-                                  <w14:srgbClr w14:val="000000">
-                                    <w14:alpha w14:val="60000"/>
-                                  </w14:srgbClr>
-                                </w14:shadow>
-                              </w:rPr>
-                            </w:pPr>
-                            <w:r>
-                              <w:rPr>
-                                <w:b/>
-                                <w:bCs/>
-                                <w:color w:val="FF0000"/>
-                                <w:sz w:val="20"/>
-                                <w:szCs w:val="20"/>
-                                <w14:shadow w14:blurRad="50800" w14:dist="38100" w14:dir="2700000" w14:sx="100000" w14:sy="100000" w14:kx="0" w14:ky="0" w14:algn="tl">
-                                  <w14:srgbClr w14:val="000000">
-                                    <w14:alpha w14:val="60000"/>
-                                  </w14:srgbClr>
-                                </w14:shadow>
-                              </w:rPr>
-                              <w:t>Wipers</w:t>
-                            </w:r>
-                          </w:p>
-                        </w:txbxContent>
-                      </v:textbox>
-                    </v:rect>
-                  </w:pict>
-                </mc:Fallback>
-              </mc:AlternateContent>
-            </w:r>
-            <w:r>
-              <w:rPr>
-                <w:noProof/>
-                <w:color w:val="FFFFFF" w:themeColor="background1"/>
-                <w:sz w:val="32"/>
-                <w:szCs w:val="32"/>
-              </w:rPr>
-              <mc:AlternateContent>
-                <mc:Choice Requires="wps">
-                  <w:drawing>
-                    <wp:anchor distT="0" distB="0" distL="114300" distR="114300" simplePos="0" relativeHeight="251676672" behindDoc="0" locked="0" layoutInCell="1" allowOverlap="1" wp14:anchorId="62E3AE57" wp14:editId="6B8CD65D">
-                      <wp:simplePos x="0" y="0"/>
-                      <wp:positionH relativeFrom="column">
-                        <wp:posOffset>2127885</wp:posOffset>
-                      </wp:positionH>
-                      <wp:positionV relativeFrom="paragraph">
-                        <wp:posOffset>1831974</wp:posOffset>
-                      </wp:positionV>
-                      <wp:extent cx="202565" cy="630555"/>
-                      <wp:effectExtent l="0" t="38100" r="64135" b="17145"/>
-                      <wp:wrapNone/>
-                      <wp:docPr id="224703054" name="Straight Arrow Connector 2"/>
-                      <wp:cNvGraphicFramePr/>
-                      <a:graphic xmlns:a="http://schemas.openxmlformats.org/drawingml/2006/main">
-                        <a:graphicData uri="http://schemas.microsoft.com/office/word/2010/wordprocessingShape">
-                          <wps:wsp>
-                            <wps:cNvCnPr/>
-                            <wps:spPr>
-                              <a:xfrm flipV="1">
-                                <a:off x="0" y="0"/>
-                                <a:ext cx="202565" cy="630555"/>
-                              </a:xfrm>
-                              <a:prstGeom prst="straightConnector1">
-                                <a:avLst/>
-                              </a:prstGeom>
-                              <a:ln>
-                                <a:solidFill>
-                                  <a:srgbClr val="FF0000"/>
-                                </a:solidFill>
-                                <a:tailEnd type="triangle"/>
-                              </a:ln>
-                            </wps:spPr>
-                            <wps:style>
-                              <a:lnRef idx="2">
-                                <a:schemeClr val="accent1"/>
-                              </a:lnRef>
-                              <a:fillRef idx="0">
-                                <a:schemeClr val="accent1"/>
-                              </a:fillRef>
-                              <a:effectRef idx="1">
-                                <a:schemeClr val="accent1"/>
-                              </a:effectRef>
-                              <a:fontRef idx="minor">
-                                <a:schemeClr val="tx1"/>
-                              </a:fontRef>
-                            </wps:style>
-                            <wps:bodyPr/>
-                          </wps:wsp>
-                        </a:graphicData>
-                      </a:graphic>
-                      <wp14:sizeRelH relativeFrom="margin">
-                        <wp14:pctWidth>0</wp14:pctWidth>
-                      </wp14:sizeRelH>
-                      <wp14:sizeRelV relativeFrom="margin">
-                        <wp14:pctHeight>0</wp14:pctHeight>
-                      </wp14:sizeRelV>
-                    </wp:anchor>
-                  </w:drawing>
-                </mc:Choice>
-                <mc:Fallback>
-                  <w:pict>
-                    <v:shapetype w14:anchorId="066B55C2" id="_x0000_t32" coordsize="21600,21600" o:spt="32" o:oned="t" path="m,l21600,21600e" filled="f">
-                      <v:path arrowok="t" fillok="f" o:connecttype="none"/>
-                      <o:lock v:ext="edit" shapetype="t"/>
-                    </v:shapetype>
-                    <v:shape id="Straight Arrow Connector 2" o:spid="_x0000_s1026" type="#_x0000_t32" style="position:absolute;margin-left:167.55pt;margin-top:144.25pt;width:15.95pt;height:49.65pt;flip:y;z-index:251676672;visibility:visible;mso-wrap-style:square;mso-width-percent:0;mso-height-percent:0;mso-wrap-distance-left:9pt;mso-wrap-distance-top:0;mso-wrap-distance-right:9pt;mso-wrap-distance-bottom:0;mso-position-horizontal:absolute;mso-position-horizontal-relative:text;mso-position-vertical:absolute;mso-position-vertical-relative:text;mso-width-percent:0;mso-height-percent:0;mso-width-relative:margin;mso-height-relative:margin" o:gfxdata="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" strokecolor="red" strokeweight="1.5pt">
-                      <v:stroke endarrow="block" joinstyle="miter"/>
-                    </v:shape>
-                  </w:pict>
-                </mc:Fallback>
-              </mc:AlternateContent>
-            </w:r>
-            <w:r>
-              <w:rPr>
-                <w:noProof/>
-                <w:color w:val="FFFFFF" w:themeColor="background1"/>
-                <w:sz w:val="32"/>
-                <w:szCs w:val="32"/>
-              </w:rPr>
-              <mc:AlternateContent>
-                <mc:Choice Requires="wps">
-                  <w:drawing>
-                    <wp:anchor distT="0" distB="0" distL="114300" distR="114300" simplePos="0" relativeHeight="251675648" behindDoc="0" locked="0" layoutInCell="1" allowOverlap="1" wp14:anchorId="30B8046B" wp14:editId="15089317">
-                      <wp:simplePos x="0" y="0"/>
-                      <wp:positionH relativeFrom="column">
-                        <wp:posOffset>1824990</wp:posOffset>
-                      </wp:positionH>
-                      <wp:positionV relativeFrom="paragraph">
-                        <wp:posOffset>2464435</wp:posOffset>
-                      </wp:positionV>
-                      <wp:extent cx="611505" cy="215900"/>
-                      <wp:effectExtent l="0" t="0" r="17145" b="12700"/>
-                      <wp:wrapNone/>
-                      <wp:docPr id="906436419" name="Rectangle 1"/>
+                      <wp:docPr id="397081854" name="Rectangle 1"/>
                       <wp:cNvGraphicFramePr/>
                       <a:graphic xmlns:a="http://schemas.openxmlformats.org/drawingml/2006/main">
                         <a:graphicData uri="http://schemas.microsoft.com/office/word/2010/wordprocessingShape">
@@ -969,22 +734,7 @@
                                         </w14:srgbClr>
                                       </w14:shadow>
                                     </w:rPr>
-                                    <w:t>Sand</w:t>
-                                  </w:r>
-                                  <w:r>
-                                    <w:rPr>
-                                      <w:b/>
-                                      <w:bCs/>
-                                      <w:color w:val="FF0000"/>
-                                      <w:sz w:val="20"/>
-                                      <w:szCs w:val="20"/>
-                                      <w14:shadow w14:blurRad="50800" w14:dist="38100" w14:dir="2700000" w14:sx="100000" w14:sy="100000" w14:kx="0" w14:ky="0" w14:algn="tl">
-                                        <w14:srgbClr w14:val="000000">
-                                          <w14:alpha w14:val="60000"/>
-                                        </w14:srgbClr>
-                                      </w14:shadow>
-                                    </w:rPr>
-                                    <w:t>er</w:t>
+                                    <w:t>Reverser</w:t>
                                   </w:r>
                                 </w:p>
                               </w:txbxContent>
@@ -1009,7 +759,7 @@
                 </mc:Choice>
                 <mc:Fallback>
                   <w:pict>
-                    <v:rect w14:anchorId="30B8046B" id="_x0000_s1028" style="position:absolute;left:0;text-align:left;margin-left:143.7pt;margin-top:194.05pt;width:48.15pt;height:17pt;z-index:251675648;visibility:visible;mso-wrap-style:square;mso-width-percent:0;mso-height-percent:0;mso-wrap-distance-left:9pt;mso-wrap-distance-top:0;mso-wrap-distance-right:9pt;mso-wrap-distance-bottom:0;mso-position-horizontal:absolute;mso-position-horizontal-relative:text;mso-position-vertical:absolute;mso-position-vertical-relative:text;mso-width-percent:0;mso-height-percent:0;mso-width-relative:margin;mso-height-relative:margin;v-text-anchor:middle" o:gfxdata="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" fillcolor="black" strokecolor="red" strokeweight="1pt">
+                    <v:rect w14:anchorId="0B986780" id="Rectangle 1" o:spid="_x0000_s1029" style="position:absolute;left:0;text-align:left;margin-left:106.75pt;margin-top:135.5pt;width:48.15pt;height:17pt;z-index:251668480;visibility:visible;mso-wrap-style:square;mso-width-percent:0;mso-height-percent:0;mso-wrap-distance-left:9pt;mso-wrap-distance-top:0;mso-wrap-distance-right:9pt;mso-wrap-distance-bottom:0;mso-position-horizontal:absolute;mso-position-horizontal-relative:text;mso-position-vertical:absolute;mso-position-vertical-relative:text;mso-width-percent:0;mso-height-percent:0;mso-width-relative:margin;mso-height-relative:margin;v-text-anchor:middle" o:gfxdata="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" fillcolor="black" strokecolor="red" strokeweight="1pt">
                       <v:fill opacity="39321f"/>
                       <v:textbox inset="0,0,0,0">
                         <w:txbxContent>
@@ -1043,22 +793,7 @@
                                   </w14:srgbClr>
                                 </w14:shadow>
                               </w:rPr>
-                              <w:t>Sand</w:t>
-                            </w:r>
-                            <w:r>
-                              <w:rPr>
-                                <w:b/>
-                                <w:bCs/>
-                                <w:color w:val="FF0000"/>
-                                <w:sz w:val="20"/>
-                                <w:szCs w:val="20"/>
-                                <w14:shadow w14:blurRad="50800" w14:dist="38100" w14:dir="2700000" w14:sx="100000" w14:sy="100000" w14:kx="0" w14:ky="0" w14:algn="tl">
-                                  <w14:srgbClr w14:val="000000">
-                                    <w14:alpha w14:val="60000"/>
-                                  </w14:srgbClr>
-                                </w14:shadow>
-                              </w:rPr>
-                              <w:t>er</w:t>
+                              <w:t>Reverser</w:t>
                             </w:r>
                           </w:p>
                         </w:txbxContent>
@@ -1078,18 +813,18 @@
               <mc:AlternateContent>
                 <mc:Choice Requires="wps">
                   <w:drawing>
-                    <wp:anchor distT="0" distB="0" distL="114300" distR="114300" simplePos="0" relativeHeight="251698176" behindDoc="0" locked="0" layoutInCell="1" allowOverlap="1" wp14:anchorId="0A5CB297" wp14:editId="04FFA304">
+                    <wp:anchor distT="0" distB="0" distL="114300" distR="114300" simplePos="0" relativeHeight="251670528" behindDoc="0" locked="0" layoutInCell="1" allowOverlap="1" wp14:anchorId="39CCF745" wp14:editId="09937F4C">
                       <wp:simplePos x="0" y="0"/>
                       <wp:positionH relativeFrom="column">
-                        <wp:posOffset>2922270</wp:posOffset>
+                        <wp:posOffset>2519045</wp:posOffset>
                       </wp:positionH>
                       <wp:positionV relativeFrom="paragraph">
-                        <wp:posOffset>5260975</wp:posOffset>
+                        <wp:posOffset>1720850</wp:posOffset>
                       </wp:positionV>
-                      <wp:extent cx="742950" cy="323850"/>
-                      <wp:effectExtent l="0" t="0" r="19050" b="19050"/>
+                      <wp:extent cx="611505" cy="215900"/>
+                      <wp:effectExtent l="0" t="0" r="17145" b="12700"/>
                       <wp:wrapNone/>
-                      <wp:docPr id="1728082534" name="Rectangle 1"/>
+                      <wp:docPr id="2062025466" name="Rectangle 1"/>
                       <wp:cNvGraphicFramePr/>
                       <a:graphic xmlns:a="http://schemas.openxmlformats.org/drawingml/2006/main">
                         <a:graphicData uri="http://schemas.microsoft.com/office/word/2010/wordprocessingShape">
@@ -1098,7 +833,7 @@
                             <wps:spPr>
                               <a:xfrm>
                                 <a:off x="0" y="0"/>
-                                <a:ext cx="742950" cy="323850"/>
+                                <a:ext cx="611505" cy="215900"/>
                               </a:xfrm>
                               <a:prstGeom prst="rect">
                                 <a:avLst/>
@@ -1108,33 +843,20 @@
                                   <a:alpha val="60000"/>
                                 </a:srgbClr>
                               </a:solidFill>
-                              <a:ln w="12700">
+                              <a:ln w="12700" cap="flat" cmpd="sng" algn="ctr">
                                 <a:solidFill>
                                   <a:srgbClr val="FF0000"/>
                                 </a:solidFill>
+                                <a:prstDash val="solid"/>
+                                <a:miter lim="800000"/>
                               </a:ln>
+                              <a:effectLst/>
                             </wps:spPr>
-                            <wps:style>
-                              <a:lnRef idx="2">
-                                <a:schemeClr val="accent1">
-                                  <a:shade val="15000"/>
-                                </a:schemeClr>
-                              </a:lnRef>
-                              <a:fillRef idx="1">
-                                <a:schemeClr val="accent1"/>
-                              </a:fillRef>
-                              <a:effectRef idx="0">
-                                <a:schemeClr val="accent1"/>
-                              </a:effectRef>
-                              <a:fontRef idx="minor">
-                                <a:schemeClr val="lt1"/>
-                              </a:fontRef>
-                            </wps:style>
                             <wps:txbx>
                               <w:txbxContent>
                                 <w:p>
                                   <w:pPr>
-                                    <w:spacing w:after="0" w:line="204" w:lineRule="auto"/>
+                                    <w:spacing w:after="0"/>
                                     <w:jc w:val="center"/>
                                     <w:rPr>
                                       <w:b/>
@@ -1162,72 +884,7 @@
                                         </w14:srgbClr>
                                       </w14:shadow>
                                     </w:rPr>
-                                    <w:t>Headlights</w:t>
-                                  </w:r>
-                                  <w:r>
-                                    <w:rPr>
-                                      <w:b/>
-                                      <w:bCs/>
-                                      <w:color w:val="FF0000"/>
-                                      <w:sz w:val="20"/>
-                                      <w:szCs w:val="20"/>
-                                      <w14:shadow w14:blurRad="50800" w14:dist="38100" w14:dir="2700000" w14:sx="100000" w14:sy="100000" w14:kx="0" w14:ky="0" w14:algn="tl">
-                                        <w14:srgbClr w14:val="000000">
-                                          <w14:alpha w14:val="60000"/>
-                                        </w14:srgbClr>
-                                      </w14:shadow>
-                                    </w:rPr>
-                                    <w:br/>
-                                    <w:t>←</w:t>
-                                  </w:r>
-                                  <w:proofErr w:type="gramStart"/>
-                                  <w:r>
-                                    <w:rPr>
-                                      <w:b/>
-                                      <w:bCs/>
-                                      <w:color w:val="FF0000"/>
-                                      <w:sz w:val="20"/>
-                                      <w:szCs w:val="20"/>
-                                      <w14:shadow w14:blurRad="50800" w14:dist="38100" w14:dir="2700000" w14:sx="100000" w14:sy="100000" w14:kx="0" w14:ky="0" w14:algn="tl">
-                                        <w14:srgbClr w14:val="000000">
-                                          <w14:alpha w14:val="60000"/>
-                                        </w14:srgbClr>
-                                      </w14:shadow>
-                                    </w:rPr>
-                                    <w:t xml:space="preserve">dec  </w:t>
-                                  </w:r>
-                                  <w:proofErr w:type="spellStart"/>
-                                  <w:r>
-                                    <w:rPr>
-                                      <w:b/>
-                                      <w:bCs/>
-                                      <w:color w:val="FF0000"/>
-                                      <w:sz w:val="20"/>
-                                      <w:szCs w:val="20"/>
-                                      <w14:shadow w14:blurRad="50800" w14:dist="38100" w14:dir="2700000" w14:sx="100000" w14:sy="100000" w14:kx="0" w14:ky="0" w14:algn="tl">
-                                        <w14:srgbClr w14:val="000000">
-                                          <w14:alpha w14:val="60000"/>
-                                        </w14:srgbClr>
-                                      </w14:shadow>
-                                    </w:rPr>
-                                    <w:t>inc</w:t>
-                                  </w:r>
-                                  <w:proofErr w:type="spellEnd"/>
-                                  <w:proofErr w:type="gramEnd"/>
-                                  <w:r>
-                                    <w:rPr>
-                                      <w:b/>
-                                      <w:bCs/>
-                                      <w:color w:val="FF0000"/>
-                                      <w:sz w:val="20"/>
-                                      <w:szCs w:val="20"/>
-                                      <w14:shadow w14:blurRad="50800" w14:dist="38100" w14:dir="2700000" w14:sx="100000" w14:sy="100000" w14:kx="0" w14:ky="0" w14:algn="tl">
-                                        <w14:srgbClr w14:val="000000">
-                                          <w14:alpha w14:val="60000"/>
-                                        </w14:srgbClr>
-                                      </w14:shadow>
-                                    </w:rPr>
-                                    <w:t>→</w:t>
+                                    <w:t>Throttle</w:t>
                                   </w:r>
                                 </w:p>
                               </w:txbxContent>
@@ -1252,13 +909,13 @@
                 </mc:Choice>
                 <mc:Fallback>
                   <w:pict>
-                    <v:rect w14:anchorId="0A5CB297" id="_x0000_s1029" style="position:absolute;left:0;text-align:left;margin-left:230.1pt;margin-top:414.25pt;width:58.5pt;height:25.5pt;z-index:251698176;visibility:visible;mso-wrap-style:square;mso-width-percent:0;mso-height-percent:0;mso-wrap-distance-left:9pt;mso-wrap-distance-top:0;mso-wrap-distance-right:9pt;mso-wrap-distance-bottom:0;mso-position-horizontal:absolute;mso-position-horizontal-relative:text;mso-position-vertical:absolute;mso-position-vertical-relative:text;mso-width-percent:0;mso-height-percent:0;mso-width-relative:margin;mso-height-relative:margin;v-text-anchor:middle" o:gfxdata="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" fillcolor="black" strokecolor="red" strokeweight="1pt">
+                    <v:rect w14:anchorId="39CCF745" id="_x0000_s1030" style="position:absolute;left:0;text-align:left;margin-left:198.35pt;margin-top:135.5pt;width:48.15pt;height:17pt;z-index:251670528;visibility:visible;mso-wrap-style:square;mso-width-percent:0;mso-height-percent:0;mso-wrap-distance-left:9pt;mso-wrap-distance-top:0;mso-wrap-distance-right:9pt;mso-wrap-distance-bottom:0;mso-position-horizontal:absolute;mso-position-horizontal-relative:text;mso-position-vertical:absolute;mso-position-vertical-relative:text;mso-width-percent:0;mso-height-percent:0;mso-width-relative:margin;mso-height-relative:margin;v-text-anchor:middle" o:gfxdata="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" fillcolor="black" strokecolor="red" strokeweight="1pt">
                       <v:fill opacity="39321f"/>
                       <v:textbox inset="0,0,0,0">
                         <w:txbxContent>
                           <w:p>
                             <w:pPr>
-                              <w:spacing w:after="0" w:line="204" w:lineRule="auto"/>
+                              <w:spacing w:after="0"/>
                               <w:jc w:val="center"/>
                               <w:rPr>
                                 <w:b/>
@@ -1286,8 +943,143 @@
                                   </w14:srgbClr>
                                 </w14:shadow>
                               </w:rPr>
-                              <w:t>Headlights</w:t>
+                              <w:t>Throttle</w:t>
                             </w:r>
+                          </w:p>
+                        </w:txbxContent>
+                      </v:textbox>
+                    </v:rect>
+                  </w:pict>
+                </mc:Fallback>
+              </mc:AlternateContent>
+            </w:r>
+            <w:r>
+              <w:rPr>
+                <w:noProof/>
+                <w:color w:val="FFFFFF" w:themeColor="background1"/>
+                <w:sz w:val="32"/>
+                <w:szCs w:val="32"/>
+              </w:rPr>
+              <mc:AlternateContent>
+                <mc:Choice Requires="wps">
+                  <w:drawing>
+                    <wp:anchor distT="0" distB="0" distL="114300" distR="114300" simplePos="0" relativeHeight="251672576" behindDoc="0" locked="0" layoutInCell="1" allowOverlap="1" wp14:anchorId="6F9D1902" wp14:editId="40294045">
+                      <wp:simplePos x="0" y="0"/>
+                      <wp:positionH relativeFrom="column">
+                        <wp:posOffset>3558223</wp:posOffset>
+                      </wp:positionH>
+                      <wp:positionV relativeFrom="paragraph">
+                        <wp:posOffset>1720850</wp:posOffset>
+                      </wp:positionV>
+                      <wp:extent cx="611505" cy="215900"/>
+                      <wp:effectExtent l="0" t="0" r="17145" b="12700"/>
+                      <wp:wrapNone/>
+                      <wp:docPr id="1542962977" name="Rectangle 1"/>
+                      <wp:cNvGraphicFramePr/>
+                      <a:graphic xmlns:a="http://schemas.openxmlformats.org/drawingml/2006/main">
+                        <a:graphicData uri="http://schemas.microsoft.com/office/word/2010/wordprocessingShape">
+                          <wps:wsp>
+                            <wps:cNvSpPr/>
+                            <wps:spPr>
+                              <a:xfrm>
+                                <a:off x="0" y="0"/>
+                                <a:ext cx="611505" cy="215900"/>
+                              </a:xfrm>
+                              <a:prstGeom prst="rect">
+                                <a:avLst/>
+                              </a:prstGeom>
+                              <a:solidFill>
+                                <a:srgbClr val="000000">
+                                  <a:alpha val="60000"/>
+                                </a:srgbClr>
+                              </a:solidFill>
+                              <a:ln w="12700" cap="flat" cmpd="sng" algn="ctr">
+                                <a:solidFill>
+                                  <a:srgbClr val="FF0000"/>
+                                </a:solidFill>
+                                <a:prstDash val="solid"/>
+                                <a:miter lim="800000"/>
+                              </a:ln>
+                              <a:effectLst/>
+                            </wps:spPr>
+                            <wps:txbx>
+                              <w:txbxContent>
+                                <w:p>
+                                  <w:pPr>
+                                    <w:spacing w:after="0"/>
+                                    <w:jc w:val="center"/>
+                                    <w:rPr>
+                                      <w:b/>
+                                      <w:bCs/>
+                                      <w:color w:val="FF0000"/>
+                                      <w:sz w:val="20"/>
+                                      <w:szCs w:val="20"/>
+                                      <w14:shadow w14:blurRad="50800" w14:dist="38100" w14:dir="2700000" w14:sx="100000" w14:sy="100000" w14:kx="0" w14:ky="0" w14:algn="tl">
+                                        <w14:srgbClr w14:val="000000">
+                                          <w14:alpha w14:val="60000"/>
+                                        </w14:srgbClr>
+                                      </w14:shadow>
+                                    </w:rPr>
+                                  </w:pPr>
+                                  <w:r>
+                                    <w:rPr>
+                                      <w:b/>
+                                      <w:bCs/>
+                                      <w:color w:val="FF0000"/>
+                                      <w:sz w:val="20"/>
+                                      <w:szCs w:val="20"/>
+                                      <w14:shadow w14:blurRad="50800" w14:dist="38100" w14:dir="2700000" w14:sx="100000" w14:sy="100000" w14:kx="0" w14:ky="0" w14:algn="tl">
+                                        <w14:srgbClr w14:val="000000">
+                                          <w14:alpha w14:val="60000"/>
+                                        </w14:srgbClr>
+                                      </w14:shadow>
+                                    </w:rPr>
+                                    <w:t>Brake</w:t>
+                                  </w:r>
+                                </w:p>
+                              </w:txbxContent>
+                            </wps:txbx>
+                            <wps:bodyPr rot="0" spcFirstLastPara="0" vertOverflow="overflow" horzOverflow="overflow" vert="horz" wrap="square" lIns="0" tIns="0" rIns="0" bIns="0" numCol="1" spcCol="0" rtlCol="0" fromWordArt="0" anchor="ctr" anchorCtr="0" forceAA="0" compatLnSpc="1">
+                              <a:prstTxWarp prst="textNoShape">
+                                <a:avLst/>
+                              </a:prstTxWarp>
+                              <a:noAutofit/>
+                            </wps:bodyPr>
+                          </wps:wsp>
+                        </a:graphicData>
+                      </a:graphic>
+                      <wp14:sizeRelH relativeFrom="margin">
+                        <wp14:pctWidth>0</wp14:pctWidth>
+                      </wp14:sizeRelH>
+                      <wp14:sizeRelV relativeFrom="margin">
+                        <wp14:pctHeight>0</wp14:pctHeight>
+                      </wp14:sizeRelV>
+                    </wp:anchor>
+                  </w:drawing>
+                </mc:Choice>
+                <mc:Fallback>
+                  <w:pict>
+                    <v:rect w14:anchorId="6F9D1902" id="_x0000_s1031" style="position:absolute;left:0;text-align:left;margin-left:280.2pt;margin-top:135.5pt;width:48.15pt;height:17pt;z-index:251672576;visibility:visible;mso-wrap-style:square;mso-width-percent:0;mso-height-percent:0;mso-wrap-distance-left:9pt;mso-wrap-distance-top:0;mso-wrap-distance-right:9pt;mso-wrap-distance-bottom:0;mso-position-horizontal:absolute;mso-position-horizontal-relative:text;mso-position-vertical:absolute;mso-position-vertical-relative:text;mso-width-percent:0;mso-height-percent:0;mso-width-relative:margin;mso-height-relative:margin;v-text-anchor:middle" o:gfxdata="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" fillcolor="black" strokecolor="red" strokeweight="1pt">
+                      <v:fill opacity="39321f"/>
+                      <v:textbox inset="0,0,0,0">
+                        <w:txbxContent>
+                          <w:p>
+                            <w:pPr>
+                              <w:spacing w:after="0"/>
+                              <w:jc w:val="center"/>
+                              <w:rPr>
+                                <w:b/>
+                                <w:bCs/>
+                                <w:color w:val="FF0000"/>
+                                <w:sz w:val="20"/>
+                                <w:szCs w:val="20"/>
+                                <w14:shadow w14:blurRad="50800" w14:dist="38100" w14:dir="2700000" w14:sx="100000" w14:sy="100000" w14:kx="0" w14:ky="0" w14:algn="tl">
+                                  <w14:srgbClr w14:val="000000">
+                                    <w14:alpha w14:val="60000"/>
+                                  </w14:srgbClr>
+                                </w14:shadow>
+                              </w:rPr>
+                            </w:pPr>
                             <w:r>
                               <w:rPr>
                                 <w:b/>
@@ -1301,57 +1093,7 @@
                                   </w14:srgbClr>
                                 </w14:shadow>
                               </w:rPr>
-                              <w:br/>
-                              <w:t>←</w:t>
-                            </w:r>
-                            <w:proofErr w:type="gramStart"/>
-                            <w:r>
-                              <w:rPr>
-                                <w:b/>
-                                <w:bCs/>
-                                <w:color w:val="FF0000"/>
-                                <w:sz w:val="20"/>
-                                <w:szCs w:val="20"/>
-                                <w14:shadow w14:blurRad="50800" w14:dist="38100" w14:dir="2700000" w14:sx="100000" w14:sy="100000" w14:kx="0" w14:ky="0" w14:algn="tl">
-                                  <w14:srgbClr w14:val="000000">
-                                    <w14:alpha w14:val="60000"/>
-                                  </w14:srgbClr>
-                                </w14:shadow>
-                              </w:rPr>
-                              <w:t xml:space="preserve">dec  </w:t>
-                            </w:r>
-                            <w:proofErr w:type="spellStart"/>
-                            <w:r>
-                              <w:rPr>
-                                <w:b/>
-                                <w:bCs/>
-                                <w:color w:val="FF0000"/>
-                                <w:sz w:val="20"/>
-                                <w:szCs w:val="20"/>
-                                <w14:shadow w14:blurRad="50800" w14:dist="38100" w14:dir="2700000" w14:sx="100000" w14:sy="100000" w14:kx="0" w14:ky="0" w14:algn="tl">
-                                  <w14:srgbClr w14:val="000000">
-                                    <w14:alpha w14:val="60000"/>
-                                  </w14:srgbClr>
-                                </w14:shadow>
-                              </w:rPr>
-                              <w:t>inc</w:t>
-                            </w:r>
-                            <w:proofErr w:type="spellEnd"/>
-                            <w:proofErr w:type="gramEnd"/>
-                            <w:r>
-                              <w:rPr>
-                                <w:b/>
-                                <w:bCs/>
-                                <w:color w:val="FF0000"/>
-                                <w:sz w:val="20"/>
-                                <w:szCs w:val="20"/>
-                                <w14:shadow w14:blurRad="50800" w14:dist="38100" w14:dir="2700000" w14:sx="100000" w14:sy="100000" w14:kx="0" w14:ky="0" w14:algn="tl">
-                                  <w14:srgbClr w14:val="000000">
-                                    <w14:alpha w14:val="60000"/>
-                                  </w14:srgbClr>
-                                </w14:shadow>
-                              </w:rPr>
-                              <w:t>→</w:t>
+                              <w:t>Brake</w:t>
                             </w:r>
                           </w:p>
                         </w:txbxContent>
@@ -1371,13 +1113,423 @@
               <mc:AlternateContent>
                 <mc:Choice Requires="wps">
                   <w:drawing>
-                    <wp:anchor distT="0" distB="0" distL="114300" distR="114300" simplePos="0" relativeHeight="251696128" behindDoc="0" locked="0" layoutInCell="1" allowOverlap="1" wp14:anchorId="2EAC73DA" wp14:editId="479F5335">
+                    <wp:anchor distT="0" distB="0" distL="114300" distR="114300" simplePos="0" relativeHeight="251727872" behindDoc="0" locked="0" layoutInCell="1" allowOverlap="1" wp14:anchorId="0BB88696" wp14:editId="76C48B47">
+                      <wp:simplePos x="0" y="0"/>
+                      <wp:positionH relativeFrom="column">
+                        <wp:posOffset>4895850</wp:posOffset>
+                      </wp:positionH>
+                      <wp:positionV relativeFrom="paragraph">
+                        <wp:posOffset>5297487</wp:posOffset>
+                      </wp:positionV>
+                      <wp:extent cx="95250" cy="95250"/>
+                      <wp:effectExtent l="0" t="0" r="19050" b="19050"/>
+                      <wp:wrapNone/>
+                      <wp:docPr id="632492111" name="Oval 1"/>
+                      <wp:cNvGraphicFramePr/>
+                      <a:graphic xmlns:a="http://schemas.openxmlformats.org/drawingml/2006/main">
+                        <a:graphicData uri="http://schemas.microsoft.com/office/word/2010/wordprocessingShape">
+                          <wps:wsp>
+                            <wps:cNvSpPr/>
+                            <wps:spPr>
+                              <a:xfrm>
+                                <a:off x="0" y="0"/>
+                                <a:ext cx="95250" cy="95250"/>
+                              </a:xfrm>
+                              <a:prstGeom prst="ellipse">
+                                <a:avLst/>
+                              </a:prstGeom>
+                              <a:solidFill>
+                                <a:srgbClr val="00B050"/>
+                              </a:solidFill>
+                              <a:ln w="9525">
+                                <a:solidFill>
+                                  <a:schemeClr val="bg1"/>
+                                </a:solidFill>
+                              </a:ln>
+                            </wps:spPr>
+                            <wps:style>
+                              <a:lnRef idx="2">
+                                <a:schemeClr val="accent6">
+                                  <a:shade val="15000"/>
+                                </a:schemeClr>
+                              </a:lnRef>
+                              <a:fillRef idx="1">
+                                <a:schemeClr val="accent6"/>
+                              </a:fillRef>
+                              <a:effectRef idx="0">
+                                <a:schemeClr val="accent6"/>
+                              </a:effectRef>
+                              <a:fontRef idx="minor">
+                                <a:schemeClr val="lt1"/>
+                              </a:fontRef>
+                            </wps:style>
+                            <wps:bodyPr rot="0" spcFirstLastPara="0" vertOverflow="overflow" horzOverflow="overflow" vert="horz" wrap="square" lIns="91440" tIns="45720" rIns="91440" bIns="45720" numCol="1" spcCol="0" rtlCol="0" fromWordArt="0" anchor="ctr" anchorCtr="0" forceAA="0" compatLnSpc="1">
+                              <a:prstTxWarp prst="textNoShape">
+                                <a:avLst/>
+                              </a:prstTxWarp>
+                              <a:noAutofit/>
+                            </wps:bodyPr>
+                          </wps:wsp>
+                        </a:graphicData>
+                      </a:graphic>
+                      <wp14:sizeRelH relativeFrom="margin">
+                        <wp14:pctWidth>0</wp14:pctWidth>
+                      </wp14:sizeRelH>
+                      <wp14:sizeRelV relativeFrom="margin">
+                        <wp14:pctHeight>0</wp14:pctHeight>
+                      </wp14:sizeRelV>
+                    </wp:anchor>
+                  </w:drawing>
+                </mc:Choice>
+                <mc:Fallback>
+                  <w:pict>
+                    <v:oval w14:anchorId="7CFD36B1" id="Oval 1" o:spid="_x0000_s1026" style="position:absolute;margin-left:385.5pt;margin-top:417.1pt;width:7.5pt;height:7.5pt;z-index:251727872;visibility:visible;mso-wrap-style:square;mso-width-percent:0;mso-height-percent:0;mso-wrap-distance-left:9pt;mso-wrap-distance-top:0;mso-wrap-distance-right:9pt;mso-wrap-distance-bottom:0;mso-position-horizontal:absolute;mso-position-horizontal-relative:text;mso-position-vertical:absolute;mso-position-vertical-relative:text;mso-width-percent:0;mso-height-percent:0;mso-width-relative:margin;mso-height-relative:margin;v-text-anchor:middle" o:gfxdata="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" fillcolor="#00b050" strokecolor="white [3212]">
+                      <v:stroke joinstyle="miter"/>
+                    </v:oval>
+                  </w:pict>
+                </mc:Fallback>
+              </mc:AlternateContent>
+            </w:r>
+            <w:r>
+              <w:rPr>
+                <w:rFonts w:asciiTheme="majorHAnsi" w:hAnsiTheme="majorHAnsi"/>
+                <w:b/>
+                <w:bCs/>
+                <w:noProof/>
+                <w:color w:val="FFFFFF" w:themeColor="background1"/>
+                <w:sz w:val="36"/>
+                <w:szCs w:val="36"/>
+              </w:rPr>
+              <mc:AlternateContent>
+                <mc:Choice Requires="wps">
+                  <w:drawing>
+                    <wp:anchor distT="45720" distB="45720" distL="114300" distR="114300" simplePos="0" relativeHeight="251725824" behindDoc="0" locked="0" layoutInCell="1" allowOverlap="1" wp14:anchorId="7ECFFEE8" wp14:editId="6D201475">
+                      <wp:simplePos x="0" y="0"/>
+                      <wp:positionH relativeFrom="column">
+                        <wp:posOffset>1410335</wp:posOffset>
+                      </wp:positionH>
+                      <wp:positionV relativeFrom="paragraph">
+                        <wp:posOffset>4568508</wp:posOffset>
+                      </wp:positionV>
+                      <wp:extent cx="271145" cy="285750"/>
+                      <wp:effectExtent l="0" t="0" r="0" b="0"/>
+                      <wp:wrapNone/>
+                      <wp:docPr id="1807397351" name="Text Box 2"/>
+                      <wp:cNvGraphicFramePr>
+                        <a:graphicFrameLocks xmlns:a="http://schemas.openxmlformats.org/drawingml/2006/main"/>
+                      </wp:cNvGraphicFramePr>
+                      <a:graphic xmlns:a="http://schemas.openxmlformats.org/drawingml/2006/main">
+                        <a:graphicData uri="http://schemas.microsoft.com/office/word/2010/wordprocessingShape">
+                          <wps:wsp>
+                            <wps:cNvSpPr txBox="1">
+                              <a:spLocks noChangeArrowheads="1"/>
+                            </wps:cNvSpPr>
+                            <wps:spPr bwMode="auto">
+                              <a:xfrm>
+                                <a:off x="0" y="0"/>
+                                <a:ext cx="271145" cy="285750"/>
+                              </a:xfrm>
+                              <a:prstGeom prst="rect">
+                                <a:avLst/>
+                              </a:prstGeom>
+                              <a:noFill/>
+                              <a:ln w="9525">
+                                <a:noFill/>
+                                <a:miter lim="800000"/>
+                                <a:headEnd/>
+                                <a:tailEnd/>
+                              </a:ln>
+                            </wps:spPr>
+                            <wps:txbx>
+                              <w:txbxContent>
+                                <w:p>
+                                  <w:pPr>
+                                    <w:rPr>
+                                      <w:color w:val="FFFFFF" w:themeColor="background1"/>
+                                      <w:sz w:val="14"/>
+                                      <w:szCs w:val="14"/>
+                                    </w:rPr>
+                                  </w:pPr>
+                                  <w:r>
+                                    <w:rPr>
+                                      <w:color w:val="FFFFFF" w:themeColor="background1"/>
+                                      <w:sz w:val="14"/>
+                                      <w:szCs w:val="14"/>
+                                    </w:rPr>
+                                    <w:t>2</w:t>
+                                  </w:r>
+                                </w:p>
+                              </w:txbxContent>
+                            </wps:txbx>
+                            <wps:bodyPr rot="0" vert="horz" wrap="square" lIns="91440" tIns="45720" rIns="91440" bIns="45720" anchor="t" anchorCtr="0">
+                              <a:noAutofit/>
+                            </wps:bodyPr>
+                          </wps:wsp>
+                        </a:graphicData>
+                      </a:graphic>
+                      <wp14:sizeRelH relativeFrom="margin">
+                        <wp14:pctWidth>0</wp14:pctWidth>
+                      </wp14:sizeRelH>
+                      <wp14:sizeRelV relativeFrom="margin">
+                        <wp14:pctHeight>0</wp14:pctHeight>
+                      </wp14:sizeRelV>
+                    </wp:anchor>
+                  </w:drawing>
+                </mc:Choice>
+                <mc:Fallback>
+                  <w:pict>
+                    <v:shape w14:anchorId="7ECFFEE8" id="Text Box 2" o:spid="_x0000_s1032" type="#_x0000_t202" style="position:absolute;left:0;text-align:left;margin-left:111.05pt;margin-top:359.75pt;width:21.35pt;height:22.5pt;z-index:251725824;visibility:visible;mso-wrap-style:square;mso-width-percent:0;mso-height-percent:0;mso-wrap-distance-left:9pt;mso-wrap-distance-top:3.6pt;mso-wrap-distance-right:9pt;mso-wrap-distance-bottom:3.6pt;mso-position-horizontal:absolute;mso-position-horizontal-relative:text;mso-position-vertical:absolute;mso-position-vertical-relative:text;mso-width-percent:0;mso-height-percent:0;mso-width-relative:margin;mso-height-relative:margin;v-text-anchor:top" o:gfxdata="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" filled="f" stroked="f">
+                      <v:textbox>
+                        <w:txbxContent>
+                          <w:p>
+                            <w:pPr>
+                              <w:rPr>
+                                <w:color w:val="FFFFFF" w:themeColor="background1"/>
+                                <w:sz w:val="14"/>
+                                <w:szCs w:val="14"/>
+                              </w:rPr>
+                            </w:pPr>
+                            <w:r>
+                              <w:rPr>
+                                <w:color w:val="FFFFFF" w:themeColor="background1"/>
+                                <w:sz w:val="14"/>
+                                <w:szCs w:val="14"/>
+                              </w:rPr>
+                              <w:t>2</w:t>
+                            </w:r>
+                          </w:p>
+                        </w:txbxContent>
+                      </v:textbox>
+                    </v:shape>
+                  </w:pict>
+                </mc:Fallback>
+              </mc:AlternateContent>
+            </w:r>
+            <w:r>
+              <w:rPr>
+                <w:noProof/>
+                <w:color w:val="FFFFFF" w:themeColor="background1"/>
+                <w:sz w:val="32"/>
+                <w:szCs w:val="32"/>
+              </w:rPr>
+              <mc:AlternateContent>
+                <mc:Choice Requires="wps">
+                  <w:drawing>
+                    <wp:anchor distT="0" distB="0" distL="114300" distR="114300" simplePos="0" relativeHeight="251723776" behindDoc="0" locked="0" layoutInCell="1" allowOverlap="1" wp14:anchorId="0674617E" wp14:editId="02BDBB7A">
+                      <wp:simplePos x="0" y="0"/>
+                      <wp:positionH relativeFrom="column">
+                        <wp:posOffset>1485900</wp:posOffset>
+                      </wp:positionH>
+                      <wp:positionV relativeFrom="paragraph">
+                        <wp:posOffset>4626928</wp:posOffset>
+                      </wp:positionV>
+                      <wp:extent cx="95250" cy="95250"/>
+                      <wp:effectExtent l="0" t="0" r="19050" b="19050"/>
+                      <wp:wrapNone/>
+                      <wp:docPr id="115945447" name="Oval 1"/>
+                      <wp:cNvGraphicFramePr/>
+                      <a:graphic xmlns:a="http://schemas.openxmlformats.org/drawingml/2006/main">
+                        <a:graphicData uri="http://schemas.microsoft.com/office/word/2010/wordprocessingShape">
+                          <wps:wsp>
+                            <wps:cNvSpPr/>
+                            <wps:spPr>
+                              <a:xfrm>
+                                <a:off x="0" y="0"/>
+                                <a:ext cx="95250" cy="95250"/>
+                              </a:xfrm>
+                              <a:prstGeom prst="ellipse">
+                                <a:avLst/>
+                              </a:prstGeom>
+                              <a:solidFill>
+                                <a:srgbClr val="00B050"/>
+                              </a:solidFill>
+                              <a:ln w="9525">
+                                <a:solidFill>
+                                  <a:schemeClr val="bg1"/>
+                                </a:solidFill>
+                              </a:ln>
+                            </wps:spPr>
+                            <wps:style>
+                              <a:lnRef idx="2">
+                                <a:schemeClr val="accent6">
+                                  <a:shade val="15000"/>
+                                </a:schemeClr>
+                              </a:lnRef>
+                              <a:fillRef idx="1">
+                                <a:schemeClr val="accent6"/>
+                              </a:fillRef>
+                              <a:effectRef idx="0">
+                                <a:schemeClr val="accent6"/>
+                              </a:effectRef>
+                              <a:fontRef idx="minor">
+                                <a:schemeClr val="lt1"/>
+                              </a:fontRef>
+                            </wps:style>
+                            <wps:txbx>
+                              <w:txbxContent>
+                                <w:p>
+                                  <w:pPr>
+                                    <w:rPr>
+                                      <w:color w:val="FFFFFF" w:themeColor="background1"/>
+                                    </w:rPr>
+                                  </w:pPr>
+                                  <w:r>
+                                    <w:rPr>
+                                      <w:color w:val="FFFFFF" w:themeColor="background1"/>
+                                    </w:rPr>
+                                    <w:t>2</w:t>
+                                  </w:r>
+                                </w:p>
+                              </w:txbxContent>
+                            </wps:txbx>
+                            <wps:bodyPr rot="0" spcFirstLastPara="0" vertOverflow="overflow" horzOverflow="overflow" vert="horz" wrap="square" lIns="91440" tIns="45720" rIns="91440" bIns="45720" numCol="1" spcCol="0" rtlCol="0" fromWordArt="0" anchor="ctr" anchorCtr="0" forceAA="0" compatLnSpc="1">
+                              <a:prstTxWarp prst="textNoShape">
+                                <a:avLst/>
+                              </a:prstTxWarp>
+                              <a:noAutofit/>
+                            </wps:bodyPr>
+                          </wps:wsp>
+                        </a:graphicData>
+                      </a:graphic>
+                      <wp14:sizeRelH relativeFrom="margin">
+                        <wp14:pctWidth>0</wp14:pctWidth>
+                      </wp14:sizeRelH>
+                      <wp14:sizeRelV relativeFrom="margin">
+                        <wp14:pctHeight>0</wp14:pctHeight>
+                      </wp14:sizeRelV>
+                    </wp:anchor>
+                  </w:drawing>
+                </mc:Choice>
+                <mc:Fallback>
+                  <w:pict>
+                    <v:oval w14:anchorId="0674617E" id="Oval 1" o:spid="_x0000_s1033" style="position:absolute;left:0;text-align:left;margin-left:117pt;margin-top:364.35pt;width:7.5pt;height:7.5pt;z-index:251723776;visibility:visible;mso-wrap-style:square;mso-width-percent:0;mso-height-percent:0;mso-wrap-distance-left:9pt;mso-wrap-distance-top:0;mso-wrap-distance-right:9pt;mso-wrap-distance-bottom:0;mso-position-horizontal:absolute;mso-position-horizontal-relative:text;mso-position-vertical:absolute;mso-position-vertical-relative:text;mso-width-percent:0;mso-height-percent:0;mso-width-relative:margin;mso-height-relative:margin;v-text-anchor:middle" o:gfxdata="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" fillcolor="#00b050" strokecolor="white [3212]">
+                      <v:stroke joinstyle="miter"/>
+                      <v:textbox>
+                        <w:txbxContent>
+                          <w:p>
+                            <w:pPr>
+                              <w:rPr>
+                                <w:color w:val="FFFFFF" w:themeColor="background1"/>
+                              </w:rPr>
+                            </w:pPr>
+                            <w:r>
+                              <w:rPr>
+                                <w:color w:val="FFFFFF" w:themeColor="background1"/>
+                              </w:rPr>
+                              <w:t>2</w:t>
+                            </w:r>
+                          </w:p>
+                        </w:txbxContent>
+                      </v:textbox>
+                    </v:oval>
+                  </w:pict>
+                </mc:Fallback>
+              </mc:AlternateContent>
+            </w:r>
+            <w:r>
+              <w:rPr>
+                <w:noProof/>
+                <w:color w:val="FFFFFF" w:themeColor="background1"/>
+                <w:sz w:val="32"/>
+                <w:szCs w:val="32"/>
+              </w:rPr>
+              <mc:AlternateContent>
+                <mc:Choice Requires="wps">
+                  <w:drawing>
+                    <wp:anchor distT="0" distB="0" distL="114300" distR="114300" simplePos="0" relativeHeight="251721728" behindDoc="0" locked="0" layoutInCell="1" allowOverlap="1" wp14:anchorId="325A0B3E" wp14:editId="43CDEB3F">
+                      <wp:simplePos x="0" y="0"/>
+                      <wp:positionH relativeFrom="column">
+                        <wp:posOffset>3240405</wp:posOffset>
+                      </wp:positionH>
+                      <wp:positionV relativeFrom="paragraph">
+                        <wp:posOffset>4823143</wp:posOffset>
+                      </wp:positionV>
+                      <wp:extent cx="95250" cy="95250"/>
+                      <wp:effectExtent l="0" t="0" r="19050" b="19050"/>
+                      <wp:wrapNone/>
+                      <wp:docPr id="1046626499" name="Oval 1"/>
+                      <wp:cNvGraphicFramePr/>
+                      <a:graphic xmlns:a="http://schemas.openxmlformats.org/drawingml/2006/main">
+                        <a:graphicData uri="http://schemas.microsoft.com/office/word/2010/wordprocessingShape">
+                          <wps:wsp>
+                            <wps:cNvSpPr/>
+                            <wps:spPr>
+                              <a:xfrm>
+                                <a:off x="0" y="0"/>
+                                <a:ext cx="95250" cy="95250"/>
+                              </a:xfrm>
+                              <a:prstGeom prst="ellipse">
+                                <a:avLst/>
+                              </a:prstGeom>
+                              <a:solidFill>
+                                <a:srgbClr val="00B050"/>
+                              </a:solidFill>
+                              <a:ln w="9525">
+                                <a:solidFill>
+                                  <a:schemeClr val="bg1"/>
+                                </a:solidFill>
+                              </a:ln>
+                            </wps:spPr>
+                            <wps:style>
+                              <a:lnRef idx="2">
+                                <a:schemeClr val="accent6">
+                                  <a:shade val="15000"/>
+                                </a:schemeClr>
+                              </a:lnRef>
+                              <a:fillRef idx="1">
+                                <a:schemeClr val="accent6"/>
+                              </a:fillRef>
+                              <a:effectRef idx="0">
+                                <a:schemeClr val="accent6"/>
+                              </a:effectRef>
+                              <a:fontRef idx="minor">
+                                <a:schemeClr val="lt1"/>
+                              </a:fontRef>
+                            </wps:style>
+                            <wps:bodyPr rot="0" spcFirstLastPara="0" vertOverflow="overflow" horzOverflow="overflow" vert="horz" wrap="square" lIns="91440" tIns="45720" rIns="91440" bIns="45720" numCol="1" spcCol="0" rtlCol="0" fromWordArt="0" anchor="ctr" anchorCtr="0" forceAA="0" compatLnSpc="1">
+                              <a:prstTxWarp prst="textNoShape">
+                                <a:avLst/>
+                              </a:prstTxWarp>
+                              <a:noAutofit/>
+                            </wps:bodyPr>
+                          </wps:wsp>
+                        </a:graphicData>
+                      </a:graphic>
+                      <wp14:sizeRelH relativeFrom="margin">
+                        <wp14:pctWidth>0</wp14:pctWidth>
+                      </wp14:sizeRelH>
+                      <wp14:sizeRelV relativeFrom="margin">
+                        <wp14:pctHeight>0</wp14:pctHeight>
+                      </wp14:sizeRelV>
+                    </wp:anchor>
+                  </w:drawing>
+                </mc:Choice>
+                <mc:Fallback>
+                  <w:pict>
+                    <v:oval w14:anchorId="31926698" id="Oval 1" o:spid="_x0000_s1026" style="position:absolute;margin-left:255.15pt;margin-top:379.8pt;width:7.5pt;height:7.5pt;z-index:251721728;visibility:visible;mso-wrap-style:square;mso-width-percent:0;mso-height-percent:0;mso-wrap-distance-left:9pt;mso-wrap-distance-top:0;mso-wrap-distance-right:9pt;mso-wrap-distance-bottom:0;mso-position-horizontal:absolute;mso-position-horizontal-relative:text;mso-position-vertical:absolute;mso-position-vertical-relative:text;mso-width-percent:0;mso-height-percent:0;mso-width-relative:margin;mso-height-relative:margin;v-text-anchor:middle" o:gfxdata="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" fillcolor="#00b050" strokecolor="white [3212]">
+                      <v:stroke joinstyle="miter"/>
+                    </v:oval>
+                  </w:pict>
+                </mc:Fallback>
+              </mc:AlternateContent>
+            </w:r>
+            <w:r>
+              <w:rPr>
+                <w:noProof/>
+                <w:color w:val="FFFFFF" w:themeColor="background1"/>
+                <w:sz w:val="32"/>
+                <w:szCs w:val="32"/>
+              </w:rPr>
+              <mc:AlternateContent>
+                <mc:Choice Requires="wps">
+                  <w:drawing>
+                    <wp:anchor distT="0" distB="0" distL="114300" distR="114300" simplePos="0" relativeHeight="251695104" behindDoc="0" locked="0" layoutInCell="1" allowOverlap="1" wp14:anchorId="2EAC73DA" wp14:editId="4DC6A502">
                       <wp:simplePos x="0" y="0"/>
                       <wp:positionH relativeFrom="column">
                         <wp:posOffset>1267460</wp:posOffset>
                       </wp:positionH>
                       <wp:positionV relativeFrom="paragraph">
-                        <wp:posOffset>4737100</wp:posOffset>
+                        <wp:posOffset>4861877</wp:posOffset>
                       </wp:positionV>
                       <wp:extent cx="771525" cy="536575"/>
                       <wp:effectExtent l="0" t="0" r="28575" b="15875"/>
@@ -1574,7 +1726,7 @@
                 </mc:Choice>
                 <mc:Fallback>
                   <w:pict>
-                    <v:rect w14:anchorId="2EAC73DA" id="_x0000_s1030" style="position:absolute;left:0;text-align:left;margin-left:99.8pt;margin-top:373pt;width:60.75pt;height:42.25pt;z-index:251696128;visibility:visible;mso-wrap-style:square;mso-width-percent:0;mso-height-percent:0;mso-wrap-distance-left:9pt;mso-wrap-distance-top:0;mso-wrap-distance-right:9pt;mso-wrap-distance-bottom:0;mso-position-horizontal:absolute;mso-position-horizontal-relative:text;mso-position-vertical:absolute;mso-position-vertical-relative:text;mso-width-percent:0;mso-height-percent:0;mso-width-relative:margin;mso-height-relative:margin;v-text-anchor:middle" o:gfxdata="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" fillcolor="black" strokecolor="red" strokeweight="1pt">
+                    <v:rect w14:anchorId="2EAC73DA" id="_x0000_s1034" style="position:absolute;left:0;text-align:left;margin-left:99.8pt;margin-top:382.8pt;width:60.75pt;height:42.25pt;z-index:251695104;visibility:visible;mso-wrap-style:square;mso-width-percent:0;mso-height-percent:0;mso-wrap-distance-left:9pt;mso-wrap-distance-top:0;mso-wrap-distance-right:9pt;mso-wrap-distance-bottom:0;mso-position-horizontal:absolute;mso-position-horizontal-relative:text;mso-position-vertical:absolute;mso-position-vertical-relative:text;mso-width-percent:0;mso-height-percent:0;mso-width-relative:margin;mso-height-relative:margin;v-text-anchor:middle" o:gfxdata="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" fillcolor="black" strokecolor="red" strokeweight="1pt">
                       <v:fill opacity="39321f"/>
                       <v:textbox inset="0,0,0,0">
                         <w:txbxContent>
@@ -1722,7 +1874,1742 @@
               <mc:AlternateContent>
                 <mc:Choice Requires="wps">
                   <w:drawing>
-                    <wp:anchor distT="0" distB="0" distL="114300" distR="114300" simplePos="0" relativeHeight="251692032" behindDoc="0" locked="0" layoutInCell="1" allowOverlap="1" wp14:anchorId="5011B118" wp14:editId="74FD1FC7">
+                    <wp:anchor distT="0" distB="0" distL="114300" distR="114300" simplePos="0" relativeHeight="251719680" behindDoc="0" locked="0" layoutInCell="1" allowOverlap="1" wp14:anchorId="7258615A" wp14:editId="58B51564">
+                      <wp:simplePos x="0" y="0"/>
+                      <wp:positionH relativeFrom="column">
+                        <wp:posOffset>3762692</wp:posOffset>
+                      </wp:positionH>
+                      <wp:positionV relativeFrom="paragraph">
+                        <wp:posOffset>4578985</wp:posOffset>
+                      </wp:positionV>
+                      <wp:extent cx="95250" cy="95250"/>
+                      <wp:effectExtent l="0" t="0" r="19050" b="19050"/>
+                      <wp:wrapNone/>
+                      <wp:docPr id="1033411484" name="Oval 1"/>
+                      <wp:cNvGraphicFramePr/>
+                      <a:graphic xmlns:a="http://schemas.openxmlformats.org/drawingml/2006/main">
+                        <a:graphicData uri="http://schemas.microsoft.com/office/word/2010/wordprocessingShape">
+                          <wps:wsp>
+                            <wps:cNvSpPr/>
+                            <wps:spPr>
+                              <a:xfrm>
+                                <a:off x="0" y="0"/>
+                                <a:ext cx="95250" cy="95250"/>
+                              </a:xfrm>
+                              <a:prstGeom prst="ellipse">
+                                <a:avLst/>
+                              </a:prstGeom>
+                              <a:solidFill>
+                                <a:srgbClr val="00B050"/>
+                              </a:solidFill>
+                              <a:ln w="9525">
+                                <a:solidFill>
+                                  <a:schemeClr val="bg1"/>
+                                </a:solidFill>
+                              </a:ln>
+                            </wps:spPr>
+                            <wps:style>
+                              <a:lnRef idx="2">
+                                <a:schemeClr val="accent6">
+                                  <a:shade val="15000"/>
+                                </a:schemeClr>
+                              </a:lnRef>
+                              <a:fillRef idx="1">
+                                <a:schemeClr val="accent6"/>
+                              </a:fillRef>
+                              <a:effectRef idx="0">
+                                <a:schemeClr val="accent6"/>
+                              </a:effectRef>
+                              <a:fontRef idx="minor">
+                                <a:schemeClr val="lt1"/>
+                              </a:fontRef>
+                            </wps:style>
+                            <wps:bodyPr rot="0" spcFirstLastPara="0" vertOverflow="overflow" horzOverflow="overflow" vert="horz" wrap="square" lIns="91440" tIns="45720" rIns="91440" bIns="45720" numCol="1" spcCol="0" rtlCol="0" fromWordArt="0" anchor="ctr" anchorCtr="0" forceAA="0" compatLnSpc="1">
+                              <a:prstTxWarp prst="textNoShape">
+                                <a:avLst/>
+                              </a:prstTxWarp>
+                              <a:noAutofit/>
+                            </wps:bodyPr>
+                          </wps:wsp>
+                        </a:graphicData>
+                      </a:graphic>
+                      <wp14:sizeRelH relativeFrom="margin">
+                        <wp14:pctWidth>0</wp14:pctWidth>
+                      </wp14:sizeRelH>
+                      <wp14:sizeRelV relativeFrom="margin">
+                        <wp14:pctHeight>0</wp14:pctHeight>
+                      </wp14:sizeRelV>
+                    </wp:anchor>
+                  </w:drawing>
+                </mc:Choice>
+                <mc:Fallback>
+                  <w:pict>
+                    <v:oval w14:anchorId="48C8E617" id="Oval 1" o:spid="_x0000_s1026" style="position:absolute;margin-left:296.25pt;margin-top:360.55pt;width:7.5pt;height:7.5pt;z-index:251719680;visibility:visible;mso-wrap-style:square;mso-width-percent:0;mso-height-percent:0;mso-wrap-distance-left:9pt;mso-wrap-distance-top:0;mso-wrap-distance-right:9pt;mso-wrap-distance-bottom:0;mso-position-horizontal:absolute;mso-position-horizontal-relative:text;mso-position-vertical:absolute;mso-position-vertical-relative:text;mso-width-percent:0;mso-height-percent:0;mso-width-relative:margin;mso-height-relative:margin;v-text-anchor:middle" o:gfxdata="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" fillcolor="#00b050" strokecolor="white [3212]">
+                      <v:stroke joinstyle="miter"/>
+                    </v:oval>
+                  </w:pict>
+                </mc:Fallback>
+              </mc:AlternateContent>
+            </w:r>
+            <w:r>
+              <w:rPr>
+                <w:noProof/>
+                <w:color w:val="FFFFFF" w:themeColor="background1"/>
+                <w:sz w:val="32"/>
+                <w:szCs w:val="32"/>
+              </w:rPr>
+              <mc:AlternateContent>
+                <mc:Choice Requires="wps">
+                  <w:drawing>
+                    <wp:anchor distT="0" distB="0" distL="114300" distR="114300" simplePos="0" relativeHeight="251717632" behindDoc="0" locked="0" layoutInCell="1" allowOverlap="1" wp14:anchorId="70CEE8DA" wp14:editId="36028B19">
+                      <wp:simplePos x="0" y="0"/>
+                      <wp:positionH relativeFrom="column">
+                        <wp:posOffset>2738120</wp:posOffset>
+                      </wp:positionH>
+                      <wp:positionV relativeFrom="paragraph">
+                        <wp:posOffset>4578032</wp:posOffset>
+                      </wp:positionV>
+                      <wp:extent cx="95250" cy="95250"/>
+                      <wp:effectExtent l="0" t="0" r="19050" b="19050"/>
+                      <wp:wrapNone/>
+                      <wp:docPr id="1977404032" name="Oval 1"/>
+                      <wp:cNvGraphicFramePr/>
+                      <a:graphic xmlns:a="http://schemas.openxmlformats.org/drawingml/2006/main">
+                        <a:graphicData uri="http://schemas.microsoft.com/office/word/2010/wordprocessingShape">
+                          <wps:wsp>
+                            <wps:cNvSpPr/>
+                            <wps:spPr>
+                              <a:xfrm>
+                                <a:off x="0" y="0"/>
+                                <a:ext cx="95250" cy="95250"/>
+                              </a:xfrm>
+                              <a:prstGeom prst="ellipse">
+                                <a:avLst/>
+                              </a:prstGeom>
+                              <a:solidFill>
+                                <a:srgbClr val="00B050"/>
+                              </a:solidFill>
+                              <a:ln w="9525">
+                                <a:solidFill>
+                                  <a:schemeClr val="bg1"/>
+                                </a:solidFill>
+                              </a:ln>
+                            </wps:spPr>
+                            <wps:style>
+                              <a:lnRef idx="2">
+                                <a:schemeClr val="accent6">
+                                  <a:shade val="15000"/>
+                                </a:schemeClr>
+                              </a:lnRef>
+                              <a:fillRef idx="1">
+                                <a:schemeClr val="accent6"/>
+                              </a:fillRef>
+                              <a:effectRef idx="0">
+                                <a:schemeClr val="accent6"/>
+                              </a:effectRef>
+                              <a:fontRef idx="minor">
+                                <a:schemeClr val="lt1"/>
+                              </a:fontRef>
+                            </wps:style>
+                            <wps:bodyPr rot="0" spcFirstLastPara="0" vertOverflow="overflow" horzOverflow="overflow" vert="horz" wrap="square" lIns="91440" tIns="45720" rIns="91440" bIns="45720" numCol="1" spcCol="0" rtlCol="0" fromWordArt="0" anchor="ctr" anchorCtr="0" forceAA="0" compatLnSpc="1">
+                              <a:prstTxWarp prst="textNoShape">
+                                <a:avLst/>
+                              </a:prstTxWarp>
+                              <a:noAutofit/>
+                            </wps:bodyPr>
+                          </wps:wsp>
+                        </a:graphicData>
+                      </a:graphic>
+                      <wp14:sizeRelH relativeFrom="margin">
+                        <wp14:pctWidth>0</wp14:pctWidth>
+                      </wp14:sizeRelH>
+                      <wp14:sizeRelV relativeFrom="margin">
+                        <wp14:pctHeight>0</wp14:pctHeight>
+                      </wp14:sizeRelV>
+                    </wp:anchor>
+                  </w:drawing>
+                </mc:Choice>
+                <mc:Fallback>
+                  <w:pict>
+                    <v:oval w14:anchorId="53BF95A5" id="Oval 1" o:spid="_x0000_s1026" style="position:absolute;margin-left:215.6pt;margin-top:360.45pt;width:7.5pt;height:7.5pt;z-index:251717632;visibility:visible;mso-wrap-style:square;mso-width-percent:0;mso-height-percent:0;mso-wrap-distance-left:9pt;mso-wrap-distance-top:0;mso-wrap-distance-right:9pt;mso-wrap-distance-bottom:0;mso-position-horizontal:absolute;mso-position-horizontal-relative:text;mso-position-vertical:absolute;mso-position-vertical-relative:text;mso-width-percent:0;mso-height-percent:0;mso-width-relative:margin;mso-height-relative:margin;v-text-anchor:middle" o:gfxdata="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" fillcolor="#00b050" strokecolor="white [3212]">
+                      <v:stroke joinstyle="miter"/>
+                    </v:oval>
+                  </w:pict>
+                </mc:Fallback>
+              </mc:AlternateContent>
+            </w:r>
+            <w:r>
+              <w:rPr>
+                <w:noProof/>
+                <w:color w:val="FFFFFF" w:themeColor="background1"/>
+                <w:sz w:val="32"/>
+                <w:szCs w:val="32"/>
+              </w:rPr>
+              <mc:AlternateContent>
+                <mc:Choice Requires="wps">
+                  <w:drawing>
+                    <wp:anchor distT="0" distB="0" distL="114300" distR="114300" simplePos="0" relativeHeight="251685888" behindDoc="0" locked="0" layoutInCell="1" allowOverlap="1" wp14:anchorId="5A88F8DE" wp14:editId="1A9F1BE5">
+                      <wp:simplePos x="0" y="0"/>
+                      <wp:positionH relativeFrom="column">
+                        <wp:posOffset>3576320</wp:posOffset>
+                      </wp:positionH>
+                      <wp:positionV relativeFrom="paragraph">
+                        <wp:posOffset>4187190</wp:posOffset>
+                      </wp:positionV>
+                      <wp:extent cx="431800" cy="323850"/>
+                      <wp:effectExtent l="0" t="0" r="25400" b="19050"/>
+                      <wp:wrapNone/>
+                      <wp:docPr id="42527342" name="Rectangle 1"/>
+                      <wp:cNvGraphicFramePr/>
+                      <a:graphic xmlns:a="http://schemas.openxmlformats.org/drawingml/2006/main">
+                        <a:graphicData uri="http://schemas.microsoft.com/office/word/2010/wordprocessingShape">
+                          <wps:wsp>
+                            <wps:cNvSpPr/>
+                            <wps:spPr>
+                              <a:xfrm>
+                                <a:off x="0" y="0"/>
+                                <a:ext cx="431800" cy="323850"/>
+                              </a:xfrm>
+                              <a:prstGeom prst="rect">
+                                <a:avLst/>
+                              </a:prstGeom>
+                              <a:solidFill>
+                                <a:srgbClr val="000000">
+                                  <a:alpha val="60000"/>
+                                </a:srgbClr>
+                              </a:solidFill>
+                              <a:ln w="12700">
+                                <a:solidFill>
+                                  <a:srgbClr val="FF0000"/>
+                                </a:solidFill>
+                              </a:ln>
+                            </wps:spPr>
+                            <wps:style>
+                              <a:lnRef idx="2">
+                                <a:schemeClr val="accent1">
+                                  <a:shade val="15000"/>
+                                </a:schemeClr>
+                              </a:lnRef>
+                              <a:fillRef idx="1">
+                                <a:schemeClr val="accent1"/>
+                              </a:fillRef>
+                              <a:effectRef idx="0">
+                                <a:schemeClr val="accent1"/>
+                              </a:effectRef>
+                              <a:fontRef idx="minor">
+                                <a:schemeClr val="lt1"/>
+                              </a:fontRef>
+                            </wps:style>
+                            <wps:txbx>
+                              <w:txbxContent>
+                                <w:p>
+                                  <w:pPr>
+                                    <w:spacing w:after="0" w:line="204" w:lineRule="auto"/>
+                                    <w:jc w:val="center"/>
+                                    <w:rPr>
+                                      <w:b/>
+                                      <w:bCs/>
+                                      <w:color w:val="FF0000"/>
+                                      <w:sz w:val="20"/>
+                                      <w:szCs w:val="20"/>
+                                      <w14:shadow w14:blurRad="50800" w14:dist="38100" w14:dir="2700000" w14:sx="100000" w14:sy="100000" w14:kx="0" w14:ky="0" w14:algn="tl">
+                                        <w14:srgbClr w14:val="000000">
+                                          <w14:alpha w14:val="60000"/>
+                                        </w14:srgbClr>
+                                      </w14:shadow>
+                                    </w:rPr>
+                                  </w:pPr>
+                                  <w:r>
+                                    <w:rPr>
+                                      <w:b/>
+                                      <w:bCs/>
+                                      <w:color w:val="FF0000"/>
+                                      <w:sz w:val="20"/>
+                                      <w:szCs w:val="20"/>
+                                      <w14:shadow w14:blurRad="50800" w14:dist="38100" w14:dir="2700000" w14:sx="100000" w14:sy="100000" w14:kx="0" w14:ky="0" w14:algn="tl">
+                                        <w14:srgbClr w14:val="000000">
+                                          <w14:alpha w14:val="60000"/>
+                                        </w14:srgbClr>
+                                      </w14:shadow>
+                                    </w:rPr>
+                                    <w:t>Horn High</w:t>
+                                  </w:r>
+                                </w:p>
+                              </w:txbxContent>
+                            </wps:txbx>
+                            <wps:bodyPr rot="0" spcFirstLastPara="0" vertOverflow="overflow" horzOverflow="overflow" vert="horz" wrap="square" lIns="0" tIns="0" rIns="0" bIns="0" numCol="1" spcCol="0" rtlCol="0" fromWordArt="0" anchor="ctr" anchorCtr="0" forceAA="0" compatLnSpc="1">
+                              <a:prstTxWarp prst="textNoShape">
+                                <a:avLst/>
+                              </a:prstTxWarp>
+                              <a:noAutofit/>
+                            </wps:bodyPr>
+                          </wps:wsp>
+                        </a:graphicData>
+                      </a:graphic>
+                      <wp14:sizeRelH relativeFrom="margin">
+                        <wp14:pctWidth>0</wp14:pctWidth>
+                      </wp14:sizeRelH>
+                      <wp14:sizeRelV relativeFrom="margin">
+                        <wp14:pctHeight>0</wp14:pctHeight>
+                      </wp14:sizeRelV>
+                    </wp:anchor>
+                  </w:drawing>
+                </mc:Choice>
+                <mc:Fallback>
+                  <w:pict>
+                    <v:rect w14:anchorId="5A88F8DE" id="_x0000_s1035" style="position:absolute;left:0;text-align:left;margin-left:281.6pt;margin-top:329.7pt;width:34pt;height:25.5pt;z-index:251685888;visibility:visible;mso-wrap-style:square;mso-width-percent:0;mso-height-percent:0;mso-wrap-distance-left:9pt;mso-wrap-distance-top:0;mso-wrap-distance-right:9pt;mso-wrap-distance-bottom:0;mso-position-horizontal:absolute;mso-position-horizontal-relative:text;mso-position-vertical:absolute;mso-position-vertical-relative:text;mso-width-percent:0;mso-height-percent:0;mso-width-relative:margin;mso-height-relative:margin;v-text-anchor:middle" o:gfxdata="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" fillcolor="black" strokecolor="red" strokeweight="1pt">
+                      <v:fill opacity="39321f"/>
+                      <v:textbox inset="0,0,0,0">
+                        <w:txbxContent>
+                          <w:p>
+                            <w:pPr>
+                              <w:spacing w:after="0" w:line="204" w:lineRule="auto"/>
+                              <w:jc w:val="center"/>
+                              <w:rPr>
+                                <w:b/>
+                                <w:bCs/>
+                                <w:color w:val="FF0000"/>
+                                <w:sz w:val="20"/>
+                                <w:szCs w:val="20"/>
+                                <w14:shadow w14:blurRad="50800" w14:dist="38100" w14:dir="2700000" w14:sx="100000" w14:sy="100000" w14:kx="0" w14:ky="0" w14:algn="tl">
+                                  <w14:srgbClr w14:val="000000">
+                                    <w14:alpha w14:val="60000"/>
+                                  </w14:srgbClr>
+                                </w14:shadow>
+                              </w:rPr>
+                            </w:pPr>
+                            <w:r>
+                              <w:rPr>
+                                <w:b/>
+                                <w:bCs/>
+                                <w:color w:val="FF0000"/>
+                                <w:sz w:val="20"/>
+                                <w:szCs w:val="20"/>
+                                <w14:shadow w14:blurRad="50800" w14:dist="38100" w14:dir="2700000" w14:sx="100000" w14:sy="100000" w14:kx="0" w14:ky="0" w14:algn="tl">
+                                  <w14:srgbClr w14:val="000000">
+                                    <w14:alpha w14:val="60000"/>
+                                  </w14:srgbClr>
+                                </w14:shadow>
+                              </w:rPr>
+                              <w:t>Horn High</w:t>
+                            </w:r>
+                          </w:p>
+                        </w:txbxContent>
+                      </v:textbox>
+                    </v:rect>
+                  </w:pict>
+                </mc:Fallback>
+              </mc:AlternateContent>
+            </w:r>
+            <w:r>
+              <w:rPr>
+                <w:noProof/>
+                <w:color w:val="FFFFFF" w:themeColor="background1"/>
+                <w:sz w:val="32"/>
+                <w:szCs w:val="32"/>
+              </w:rPr>
+              <mc:AlternateContent>
+                <mc:Choice Requires="wps">
+                  <w:drawing>
+                    <wp:anchor distT="0" distB="0" distL="114300" distR="114300" simplePos="0" relativeHeight="251677696" behindDoc="0" locked="0" layoutInCell="1" allowOverlap="1" wp14:anchorId="71AA84E9" wp14:editId="4AB3DDE4">
+                      <wp:simplePos x="0" y="0"/>
+                      <wp:positionH relativeFrom="column">
+                        <wp:posOffset>2567305</wp:posOffset>
+                      </wp:positionH>
+                      <wp:positionV relativeFrom="paragraph">
+                        <wp:posOffset>4186872</wp:posOffset>
+                      </wp:positionV>
+                      <wp:extent cx="431800" cy="323850"/>
+                      <wp:effectExtent l="0" t="0" r="25400" b="19050"/>
+                      <wp:wrapNone/>
+                      <wp:docPr id="777598180" name="Rectangle 1"/>
+                      <wp:cNvGraphicFramePr/>
+                      <a:graphic xmlns:a="http://schemas.openxmlformats.org/drawingml/2006/main">
+                        <a:graphicData uri="http://schemas.microsoft.com/office/word/2010/wordprocessingShape">
+                          <wps:wsp>
+                            <wps:cNvSpPr/>
+                            <wps:spPr>
+                              <a:xfrm>
+                                <a:off x="0" y="0"/>
+                                <a:ext cx="431800" cy="323850"/>
+                              </a:xfrm>
+                              <a:prstGeom prst="rect">
+                                <a:avLst/>
+                              </a:prstGeom>
+                              <a:solidFill>
+                                <a:srgbClr val="000000">
+                                  <a:alpha val="60000"/>
+                                </a:srgbClr>
+                              </a:solidFill>
+                              <a:ln w="12700">
+                                <a:solidFill>
+                                  <a:srgbClr val="FF0000"/>
+                                </a:solidFill>
+                              </a:ln>
+                            </wps:spPr>
+                            <wps:style>
+                              <a:lnRef idx="2">
+                                <a:schemeClr val="accent1">
+                                  <a:shade val="15000"/>
+                                </a:schemeClr>
+                              </a:lnRef>
+                              <a:fillRef idx="1">
+                                <a:schemeClr val="accent1"/>
+                              </a:fillRef>
+                              <a:effectRef idx="0">
+                                <a:schemeClr val="accent1"/>
+                              </a:effectRef>
+                              <a:fontRef idx="minor">
+                                <a:schemeClr val="lt1"/>
+                              </a:fontRef>
+                            </wps:style>
+                            <wps:txbx>
+                              <w:txbxContent>
+                                <w:p>
+                                  <w:pPr>
+                                    <w:spacing w:after="0" w:line="204" w:lineRule="auto"/>
+                                    <w:jc w:val="center"/>
+                                    <w:rPr>
+                                      <w:b/>
+                                      <w:bCs/>
+                                      <w:color w:val="FF0000"/>
+                                      <w:sz w:val="20"/>
+                                      <w:szCs w:val="20"/>
+                                      <w14:shadow w14:blurRad="50800" w14:dist="38100" w14:dir="2700000" w14:sx="100000" w14:sy="100000" w14:kx="0" w14:ky="0" w14:algn="tl">
+                                        <w14:srgbClr w14:val="000000">
+                                          <w14:alpha w14:val="60000"/>
+                                        </w14:srgbClr>
+                                      </w14:shadow>
+                                    </w:rPr>
+                                  </w:pPr>
+                                  <w:r>
+                                    <w:rPr>
+                                      <w:b/>
+                                      <w:bCs/>
+                                      <w:color w:val="FF0000"/>
+                                      <w:sz w:val="20"/>
+                                      <w:szCs w:val="20"/>
+                                      <w14:shadow w14:blurRad="50800" w14:dist="38100" w14:dir="2700000" w14:sx="100000" w14:sy="100000" w14:kx="0" w14:ky="0" w14:algn="tl">
+                                        <w14:srgbClr w14:val="000000">
+                                          <w14:alpha w14:val="60000"/>
+                                        </w14:srgbClr>
+                                      </w14:shadow>
+                                    </w:rPr>
+                                    <w:t>Horn Low</w:t>
+                                  </w:r>
+                                </w:p>
+                              </w:txbxContent>
+                            </wps:txbx>
+                            <wps:bodyPr rot="0" spcFirstLastPara="0" vertOverflow="overflow" horzOverflow="overflow" vert="horz" wrap="square" lIns="0" tIns="0" rIns="0" bIns="0" numCol="1" spcCol="0" rtlCol="0" fromWordArt="0" anchor="ctr" anchorCtr="0" forceAA="0" compatLnSpc="1">
+                              <a:prstTxWarp prst="textNoShape">
+                                <a:avLst/>
+                              </a:prstTxWarp>
+                              <a:noAutofit/>
+                            </wps:bodyPr>
+                          </wps:wsp>
+                        </a:graphicData>
+                      </a:graphic>
+                      <wp14:sizeRelH relativeFrom="margin">
+                        <wp14:pctWidth>0</wp14:pctWidth>
+                      </wp14:sizeRelH>
+                      <wp14:sizeRelV relativeFrom="margin">
+                        <wp14:pctHeight>0</wp14:pctHeight>
+                      </wp14:sizeRelV>
+                    </wp:anchor>
+                  </w:drawing>
+                </mc:Choice>
+                <mc:Fallback>
+                  <w:pict>
+                    <v:rect w14:anchorId="71AA84E9" id="_x0000_s1036" style="position:absolute;left:0;text-align:left;margin-left:202.15pt;margin-top:329.65pt;width:34pt;height:25.5pt;z-index:251677696;visibility:visible;mso-wrap-style:square;mso-width-percent:0;mso-height-percent:0;mso-wrap-distance-left:9pt;mso-wrap-distance-top:0;mso-wrap-distance-right:9pt;mso-wrap-distance-bottom:0;mso-position-horizontal:absolute;mso-position-horizontal-relative:text;mso-position-vertical:absolute;mso-position-vertical-relative:text;mso-width-percent:0;mso-height-percent:0;mso-width-relative:margin;mso-height-relative:margin;v-text-anchor:middle" o:gfxdata="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" fillcolor="black" strokecolor="red" strokeweight="1pt">
+                      <v:fill opacity="39321f"/>
+                      <v:textbox inset="0,0,0,0">
+                        <w:txbxContent>
+                          <w:p>
+                            <w:pPr>
+                              <w:spacing w:after="0" w:line="204" w:lineRule="auto"/>
+                              <w:jc w:val="center"/>
+                              <w:rPr>
+                                <w:b/>
+                                <w:bCs/>
+                                <w:color w:val="FF0000"/>
+                                <w:sz w:val="20"/>
+                                <w:szCs w:val="20"/>
+                                <w14:shadow w14:blurRad="50800" w14:dist="38100" w14:dir="2700000" w14:sx="100000" w14:sy="100000" w14:kx="0" w14:ky="0" w14:algn="tl">
+                                  <w14:srgbClr w14:val="000000">
+                                    <w14:alpha w14:val="60000"/>
+                                  </w14:srgbClr>
+                                </w14:shadow>
+                              </w:rPr>
+                            </w:pPr>
+                            <w:r>
+                              <w:rPr>
+                                <w:b/>
+                                <w:bCs/>
+                                <w:color w:val="FF0000"/>
+                                <w:sz w:val="20"/>
+                                <w:szCs w:val="20"/>
+                                <w14:shadow w14:blurRad="50800" w14:dist="38100" w14:dir="2700000" w14:sx="100000" w14:sy="100000" w14:kx="0" w14:ky="0" w14:algn="tl">
+                                  <w14:srgbClr w14:val="000000">
+                                    <w14:alpha w14:val="60000"/>
+                                  </w14:srgbClr>
+                                </w14:shadow>
+                              </w:rPr>
+                              <w:t>Horn Low</w:t>
+                            </w:r>
+                          </w:p>
+                        </w:txbxContent>
+                      </v:textbox>
+                    </v:rect>
+                  </w:pict>
+                </mc:Fallback>
+              </mc:AlternateContent>
+            </w:r>
+            <w:r>
+              <w:rPr>
+                <w:noProof/>
+                <w:color w:val="FFFFFF" w:themeColor="background1"/>
+                <w:sz w:val="32"/>
+                <w:szCs w:val="32"/>
+              </w:rPr>
+              <mc:AlternateContent>
+                <mc:Choice Requires="wps">
+                  <w:drawing>
+                    <wp:anchor distT="0" distB="0" distL="114300" distR="114300" simplePos="0" relativeHeight="251710464" behindDoc="0" locked="0" layoutInCell="1" allowOverlap="1" wp14:anchorId="2AB7E50F" wp14:editId="1C49ADF5">
+                      <wp:simplePos x="0" y="0"/>
+                      <wp:positionH relativeFrom="column">
+                        <wp:posOffset>1599565</wp:posOffset>
+                      </wp:positionH>
+                      <wp:positionV relativeFrom="paragraph">
+                        <wp:posOffset>4421187</wp:posOffset>
+                      </wp:positionV>
+                      <wp:extent cx="95250" cy="95250"/>
+                      <wp:effectExtent l="0" t="0" r="19050" b="19050"/>
+                      <wp:wrapNone/>
+                      <wp:docPr id="2012941271" name="Oval 1"/>
+                      <wp:cNvGraphicFramePr/>
+                      <a:graphic xmlns:a="http://schemas.openxmlformats.org/drawingml/2006/main">
+                        <a:graphicData uri="http://schemas.microsoft.com/office/word/2010/wordprocessingShape">
+                          <wps:wsp>
+                            <wps:cNvSpPr/>
+                            <wps:spPr>
+                              <a:xfrm>
+                                <a:off x="0" y="0"/>
+                                <a:ext cx="95250" cy="95250"/>
+                              </a:xfrm>
+                              <a:prstGeom prst="ellipse">
+                                <a:avLst/>
+                              </a:prstGeom>
+                              <a:solidFill>
+                                <a:srgbClr val="00B050"/>
+                              </a:solidFill>
+                              <a:ln w="9525">
+                                <a:solidFill>
+                                  <a:schemeClr val="bg1"/>
+                                </a:solidFill>
+                              </a:ln>
+                            </wps:spPr>
+                            <wps:style>
+                              <a:lnRef idx="2">
+                                <a:schemeClr val="accent6">
+                                  <a:shade val="15000"/>
+                                </a:schemeClr>
+                              </a:lnRef>
+                              <a:fillRef idx="1">
+                                <a:schemeClr val="accent6"/>
+                              </a:fillRef>
+                              <a:effectRef idx="0">
+                                <a:schemeClr val="accent6"/>
+                              </a:effectRef>
+                              <a:fontRef idx="minor">
+                                <a:schemeClr val="lt1"/>
+                              </a:fontRef>
+                            </wps:style>
+                            <wps:bodyPr rot="0" spcFirstLastPara="0" vertOverflow="overflow" horzOverflow="overflow" vert="horz" wrap="square" lIns="91440" tIns="45720" rIns="91440" bIns="45720" numCol="1" spcCol="0" rtlCol="0" fromWordArt="0" anchor="ctr" anchorCtr="0" forceAA="0" compatLnSpc="1">
+                              <a:prstTxWarp prst="textNoShape">
+                                <a:avLst/>
+                              </a:prstTxWarp>
+                              <a:noAutofit/>
+                            </wps:bodyPr>
+                          </wps:wsp>
+                        </a:graphicData>
+                      </a:graphic>
+                    </wp:anchor>
+                  </w:drawing>
+                </mc:Choice>
+                <mc:Fallback>
+                  <w:pict>
+                    <v:oval w14:anchorId="613E1716" id="Oval 1" o:spid="_x0000_s1026" style="position:absolute;margin-left:125.95pt;margin-top:348.1pt;width:7.5pt;height:7.5pt;z-index:251710464;visibility:visible;mso-wrap-style:square;mso-wrap-distance-left:9pt;mso-wrap-distance-top:0;mso-wrap-distance-right:9pt;mso-wrap-distance-bottom:0;mso-position-horizontal:absolute;mso-position-horizontal-relative:text;mso-position-vertical:absolute;mso-position-vertical-relative:text;v-text-anchor:middle" o:gfxdata="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" fillcolor="#00b050" strokecolor="white [3212]">
+                      <v:stroke joinstyle="miter"/>
+                    </v:oval>
+                  </w:pict>
+                </mc:Fallback>
+              </mc:AlternateContent>
+            </w:r>
+            <w:r>
+              <w:rPr>
+                <w:noProof/>
+                <w:color w:val="FFFFFF" w:themeColor="background1"/>
+                <w:sz w:val="32"/>
+                <w:szCs w:val="32"/>
+              </w:rPr>
+              <mc:AlternateContent>
+                <mc:Choice Requires="wps">
+                  <w:drawing>
+                    <wp:anchor distT="0" distB="0" distL="114300" distR="114300" simplePos="0" relativeHeight="251704320" behindDoc="0" locked="0" layoutInCell="1" allowOverlap="1" wp14:anchorId="760EDE77" wp14:editId="51A36100">
+                      <wp:simplePos x="0" y="0"/>
+                      <wp:positionH relativeFrom="column">
+                        <wp:posOffset>3761105</wp:posOffset>
+                      </wp:positionH>
+                      <wp:positionV relativeFrom="paragraph">
+                        <wp:posOffset>710883</wp:posOffset>
+                      </wp:positionV>
+                      <wp:extent cx="95250" cy="95250"/>
+                      <wp:effectExtent l="0" t="0" r="19050" b="19050"/>
+                      <wp:wrapNone/>
+                      <wp:docPr id="1524331403" name="Oval 1"/>
+                      <wp:cNvGraphicFramePr/>
+                      <a:graphic xmlns:a="http://schemas.openxmlformats.org/drawingml/2006/main">
+                        <a:graphicData uri="http://schemas.microsoft.com/office/word/2010/wordprocessingShape">
+                          <wps:wsp>
+                            <wps:cNvSpPr/>
+                            <wps:spPr>
+                              <a:xfrm>
+                                <a:off x="0" y="0"/>
+                                <a:ext cx="95250" cy="95250"/>
+                              </a:xfrm>
+                              <a:prstGeom prst="ellipse">
+                                <a:avLst/>
+                              </a:prstGeom>
+                              <a:solidFill>
+                                <a:srgbClr val="00B050"/>
+                              </a:solidFill>
+                              <a:ln w="9525">
+                                <a:solidFill>
+                                  <a:schemeClr val="bg1"/>
+                                </a:solidFill>
+                              </a:ln>
+                            </wps:spPr>
+                            <wps:style>
+                              <a:lnRef idx="2">
+                                <a:schemeClr val="accent6">
+                                  <a:shade val="15000"/>
+                                </a:schemeClr>
+                              </a:lnRef>
+                              <a:fillRef idx="1">
+                                <a:schemeClr val="accent6"/>
+                              </a:fillRef>
+                              <a:effectRef idx="0">
+                                <a:schemeClr val="accent6"/>
+                              </a:effectRef>
+                              <a:fontRef idx="minor">
+                                <a:schemeClr val="lt1"/>
+                              </a:fontRef>
+                            </wps:style>
+                            <wps:bodyPr rot="0" spcFirstLastPara="0" vertOverflow="overflow" horzOverflow="overflow" vert="horz" wrap="square" lIns="91440" tIns="45720" rIns="91440" bIns="45720" numCol="1" spcCol="0" rtlCol="0" fromWordArt="0" anchor="ctr" anchorCtr="0" forceAA="0" compatLnSpc="1">
+                              <a:prstTxWarp prst="textNoShape">
+                                <a:avLst/>
+                              </a:prstTxWarp>
+                              <a:noAutofit/>
+                            </wps:bodyPr>
+                          </wps:wsp>
+                        </a:graphicData>
+                      </a:graphic>
+                    </wp:anchor>
+                  </w:drawing>
+                </mc:Choice>
+                <mc:Fallback>
+                  <w:pict>
+                    <v:oval w14:anchorId="44D9EEFA" id="Oval 1" o:spid="_x0000_s1026" style="position:absolute;margin-left:296.15pt;margin-top:56pt;width:7.5pt;height:7.5pt;z-index:251704320;visibility:visible;mso-wrap-style:square;mso-wrap-distance-left:9pt;mso-wrap-distance-top:0;mso-wrap-distance-right:9pt;mso-wrap-distance-bottom:0;mso-position-horizontal:absolute;mso-position-horizontal-relative:text;mso-position-vertical:absolute;mso-position-vertical-relative:text;v-text-anchor:middle" o:gfxdata="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" fillcolor="#00b050" strokecolor="white [3212]">
+                      <v:stroke joinstyle="miter"/>
+                    </v:oval>
+                  </w:pict>
+                </mc:Fallback>
+              </mc:AlternateContent>
+            </w:r>
+            <w:r>
+              <w:rPr>
+                <w:noProof/>
+                <w:color w:val="FFFFFF" w:themeColor="background1"/>
+                <w:sz w:val="32"/>
+                <w:szCs w:val="32"/>
+              </w:rPr>
+              <mc:AlternateContent>
+                <mc:Choice Requires="wps">
+                  <w:drawing>
+                    <wp:anchor distT="0" distB="0" distL="114300" distR="114300" simplePos="0" relativeHeight="251706368" behindDoc="0" locked="0" layoutInCell="1" allowOverlap="1" wp14:anchorId="3BA97E6A" wp14:editId="03CD2468">
+                      <wp:simplePos x="0" y="0"/>
+                      <wp:positionH relativeFrom="column">
+                        <wp:posOffset>2756853</wp:posOffset>
+                      </wp:positionH>
+                      <wp:positionV relativeFrom="paragraph">
+                        <wp:posOffset>3063875</wp:posOffset>
+                      </wp:positionV>
+                      <wp:extent cx="95250" cy="95250"/>
+                      <wp:effectExtent l="0" t="0" r="19050" b="19050"/>
+                      <wp:wrapNone/>
+                      <wp:docPr id="1821372240" name="Oval 1"/>
+                      <wp:cNvGraphicFramePr/>
+                      <a:graphic xmlns:a="http://schemas.openxmlformats.org/drawingml/2006/main">
+                        <a:graphicData uri="http://schemas.microsoft.com/office/word/2010/wordprocessingShape">
+                          <wps:wsp>
+                            <wps:cNvSpPr/>
+                            <wps:spPr>
+                              <a:xfrm>
+                                <a:off x="0" y="0"/>
+                                <a:ext cx="95250" cy="95250"/>
+                              </a:xfrm>
+                              <a:prstGeom prst="ellipse">
+                                <a:avLst/>
+                              </a:prstGeom>
+                              <a:solidFill>
+                                <a:srgbClr val="00B050"/>
+                              </a:solidFill>
+                              <a:ln w="9525">
+                                <a:solidFill>
+                                  <a:schemeClr val="bg1"/>
+                                </a:solidFill>
+                              </a:ln>
+                            </wps:spPr>
+                            <wps:style>
+                              <a:lnRef idx="2">
+                                <a:schemeClr val="accent6">
+                                  <a:shade val="15000"/>
+                                </a:schemeClr>
+                              </a:lnRef>
+                              <a:fillRef idx="1">
+                                <a:schemeClr val="accent6"/>
+                              </a:fillRef>
+                              <a:effectRef idx="0">
+                                <a:schemeClr val="accent6"/>
+                              </a:effectRef>
+                              <a:fontRef idx="minor">
+                                <a:schemeClr val="lt1"/>
+                              </a:fontRef>
+                            </wps:style>
+                            <wps:bodyPr rot="0" spcFirstLastPara="0" vertOverflow="overflow" horzOverflow="overflow" vert="horz" wrap="square" lIns="91440" tIns="45720" rIns="91440" bIns="45720" numCol="1" spcCol="0" rtlCol="0" fromWordArt="0" anchor="ctr" anchorCtr="0" forceAA="0" compatLnSpc="1">
+                              <a:prstTxWarp prst="textNoShape">
+                                <a:avLst/>
+                              </a:prstTxWarp>
+                              <a:noAutofit/>
+                            </wps:bodyPr>
+                          </wps:wsp>
+                        </a:graphicData>
+                      </a:graphic>
+                    </wp:anchor>
+                  </w:drawing>
+                </mc:Choice>
+                <mc:Fallback>
+                  <w:pict>
+                    <v:oval w14:anchorId="5224DC34" id="Oval 1" o:spid="_x0000_s1026" style="position:absolute;margin-left:217.1pt;margin-top:241.25pt;width:7.5pt;height:7.5pt;z-index:251706368;visibility:visible;mso-wrap-style:square;mso-wrap-distance-left:9pt;mso-wrap-distance-top:0;mso-wrap-distance-right:9pt;mso-wrap-distance-bottom:0;mso-position-horizontal:absolute;mso-position-horizontal-relative:text;mso-position-vertical:absolute;mso-position-vertical-relative:text;v-text-anchor:middle" o:gfxdata="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" fillcolor="#00b050" strokecolor="white [3212]">
+                      <v:stroke joinstyle="miter"/>
+                    </v:oval>
+                  </w:pict>
+                </mc:Fallback>
+              </mc:AlternateContent>
+            </w:r>
+            <w:r>
+              <w:rPr>
+                <w:noProof/>
+                <w:color w:val="FFFFFF" w:themeColor="background1"/>
+                <w:sz w:val="32"/>
+                <w:szCs w:val="32"/>
+              </w:rPr>
+              <mc:AlternateContent>
+                <mc:Choice Requires="wps">
+                  <w:drawing>
+                    <wp:anchor distT="0" distB="0" distL="114300" distR="114300" simplePos="0" relativeHeight="251700224" behindDoc="0" locked="0" layoutInCell="1" allowOverlap="1" wp14:anchorId="0E2F5FFB" wp14:editId="6FFA505E">
+                      <wp:simplePos x="0" y="0"/>
+                      <wp:positionH relativeFrom="column">
+                        <wp:posOffset>1269365</wp:posOffset>
+                      </wp:positionH>
+                      <wp:positionV relativeFrom="paragraph">
+                        <wp:posOffset>2039937</wp:posOffset>
+                      </wp:positionV>
+                      <wp:extent cx="95250" cy="95250"/>
+                      <wp:effectExtent l="0" t="0" r="19050" b="19050"/>
+                      <wp:wrapNone/>
+                      <wp:docPr id="203193410" name="Oval 1"/>
+                      <wp:cNvGraphicFramePr/>
+                      <a:graphic xmlns:a="http://schemas.openxmlformats.org/drawingml/2006/main">
+                        <a:graphicData uri="http://schemas.microsoft.com/office/word/2010/wordprocessingShape">
+                          <wps:wsp>
+                            <wps:cNvSpPr/>
+                            <wps:spPr>
+                              <a:xfrm>
+                                <a:off x="0" y="0"/>
+                                <a:ext cx="95250" cy="95250"/>
+                              </a:xfrm>
+                              <a:prstGeom prst="ellipse">
+                                <a:avLst/>
+                              </a:prstGeom>
+                              <a:solidFill>
+                                <a:srgbClr val="00B050"/>
+                              </a:solidFill>
+                              <a:ln w="9525">
+                                <a:solidFill>
+                                  <a:schemeClr val="bg1"/>
+                                </a:solidFill>
+                              </a:ln>
+                            </wps:spPr>
+                            <wps:style>
+                              <a:lnRef idx="2">
+                                <a:schemeClr val="accent6">
+                                  <a:shade val="15000"/>
+                                </a:schemeClr>
+                              </a:lnRef>
+                              <a:fillRef idx="1">
+                                <a:schemeClr val="accent6"/>
+                              </a:fillRef>
+                              <a:effectRef idx="0">
+                                <a:schemeClr val="accent6"/>
+                              </a:effectRef>
+                              <a:fontRef idx="minor">
+                                <a:schemeClr val="lt1"/>
+                              </a:fontRef>
+                            </wps:style>
+                            <wps:bodyPr rot="0" spcFirstLastPara="0" vertOverflow="overflow" horzOverflow="overflow" vert="horz" wrap="square" lIns="91440" tIns="45720" rIns="91440" bIns="45720" numCol="1" spcCol="0" rtlCol="0" fromWordArt="0" anchor="ctr" anchorCtr="0" forceAA="0" compatLnSpc="1">
+                              <a:prstTxWarp prst="textNoShape">
+                                <a:avLst/>
+                              </a:prstTxWarp>
+                              <a:noAutofit/>
+                            </wps:bodyPr>
+                          </wps:wsp>
+                        </a:graphicData>
+                      </a:graphic>
+                    </wp:anchor>
+                  </w:drawing>
+                </mc:Choice>
+                <mc:Fallback>
+                  <w:pict>
+                    <v:oval w14:anchorId="2A118514" id="Oval 1" o:spid="_x0000_s1026" style="position:absolute;margin-left:99.95pt;margin-top:160.6pt;width:7.5pt;height:7.5pt;z-index:251700224;visibility:visible;mso-wrap-style:square;mso-wrap-distance-left:9pt;mso-wrap-distance-top:0;mso-wrap-distance-right:9pt;mso-wrap-distance-bottom:0;mso-position-horizontal:absolute;mso-position-horizontal-relative:text;mso-position-vertical:absolute;mso-position-vertical-relative:text;v-text-anchor:middle" o:gfxdata="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" fillcolor="#00b050" strokecolor="white [3212]">
+                      <v:stroke joinstyle="miter"/>
+                    </v:oval>
+                  </w:pict>
+                </mc:Fallback>
+              </mc:AlternateContent>
+            </w:r>
+            <w:r>
+              <w:rPr>
+                <w:noProof/>
+                <w:color w:val="FFFFFF" w:themeColor="background1"/>
+                <w:sz w:val="32"/>
+                <w:szCs w:val="32"/>
+              </w:rPr>
+              <mc:AlternateContent>
+                <mc:Choice Requires="wps">
+                  <w:drawing>
+                    <wp:anchor distT="0" distB="0" distL="114300" distR="114300" simplePos="0" relativeHeight="251693056" behindDoc="0" locked="0" layoutInCell="1" allowOverlap="1" wp14:anchorId="01FDE6F4" wp14:editId="70EA14E4">
+                      <wp:simplePos x="0" y="0"/>
+                      <wp:positionH relativeFrom="column">
+                        <wp:posOffset>1313612</wp:posOffset>
+                      </wp:positionH>
+                      <wp:positionV relativeFrom="paragraph">
+                        <wp:posOffset>4053985</wp:posOffset>
+                      </wp:positionV>
+                      <wp:extent cx="660203" cy="323850"/>
+                      <wp:effectExtent l="0" t="0" r="26035" b="19050"/>
+                      <wp:wrapNone/>
+                      <wp:docPr id="2094956401" name="Rectangle 1"/>
+                      <wp:cNvGraphicFramePr/>
+                      <a:graphic xmlns:a="http://schemas.openxmlformats.org/drawingml/2006/main">
+                        <a:graphicData uri="http://schemas.microsoft.com/office/word/2010/wordprocessingShape">
+                          <wps:wsp>
+                            <wps:cNvSpPr/>
+                            <wps:spPr>
+                              <a:xfrm>
+                                <a:off x="0" y="0"/>
+                                <a:ext cx="660203" cy="323850"/>
+                              </a:xfrm>
+                              <a:prstGeom prst="rect">
+                                <a:avLst/>
+                              </a:prstGeom>
+                              <a:solidFill>
+                                <a:srgbClr val="000000">
+                                  <a:alpha val="60000"/>
+                                </a:srgbClr>
+                              </a:solidFill>
+                              <a:ln w="12700">
+                                <a:solidFill>
+                                  <a:srgbClr val="FF0000"/>
+                                </a:solidFill>
+                              </a:ln>
+                            </wps:spPr>
+                            <wps:style>
+                              <a:lnRef idx="2">
+                                <a:schemeClr val="accent1">
+                                  <a:shade val="15000"/>
+                                </a:schemeClr>
+                              </a:lnRef>
+                              <a:fillRef idx="1">
+                                <a:schemeClr val="accent1"/>
+                              </a:fillRef>
+                              <a:effectRef idx="0">
+                                <a:schemeClr val="accent1"/>
+                              </a:effectRef>
+                              <a:fontRef idx="minor">
+                                <a:schemeClr val="lt1"/>
+                              </a:fontRef>
+                            </wps:style>
+                            <wps:txbx>
+                              <w:txbxContent>
+                                <w:p>
+                                  <w:pPr>
+                                    <w:spacing w:after="0" w:line="204" w:lineRule="auto"/>
+                                    <w:jc w:val="center"/>
+                                    <w:rPr>
+                                      <w:b/>
+                                      <w:bCs/>
+                                      <w:color w:val="FF0000"/>
+                                      <w:sz w:val="20"/>
+                                      <w:szCs w:val="20"/>
+                                      <w14:shadow w14:blurRad="50800" w14:dist="38100" w14:dir="2700000" w14:sx="100000" w14:sy="100000" w14:kx="0" w14:ky="0" w14:algn="tl">
+                                        <w14:srgbClr w14:val="000000">
+                                          <w14:alpha w14:val="60000"/>
+                                        </w14:srgbClr>
+                                      </w14:shadow>
+                                    </w:rPr>
+                                  </w:pPr>
+                                  <w:r>
+                                    <w:rPr>
+                                      <w:b/>
+                                      <w:bCs/>
+                                      <w:color w:val="FF0000"/>
+                                      <w:sz w:val="20"/>
+                                      <w:szCs w:val="20"/>
+                                      <w14:shadow w14:blurRad="50800" w14:dist="38100" w14:dir="2700000" w14:sx="100000" w14:sy="100000" w14:kx="0" w14:ky="0" w14:algn="tl">
+                                        <w14:srgbClr w14:val="000000">
+                                          <w14:alpha w14:val="60000"/>
+                                        </w14:srgbClr>
+                                      </w14:shadow>
+                                    </w:rPr>
+                                    <w:t xml:space="preserve">Deadman </w:t>
+                                  </w:r>
+                                  <w:r>
+                                    <w:rPr>
+                                      <w:b/>
+                                      <w:bCs/>
+                                      <w:color w:val="FF0000"/>
+                                      <w:sz w:val="20"/>
+                                      <w:szCs w:val="20"/>
+                                      <w14:shadow w14:blurRad="50800" w14:dist="38100" w14:dir="2700000" w14:sx="100000" w14:sy="100000" w14:kx="0" w14:ky="0" w14:algn="tl">
+                                        <w14:srgbClr w14:val="000000">
+                                          <w14:alpha w14:val="60000"/>
+                                        </w14:srgbClr>
+                                      </w14:shadow>
+                                    </w:rPr>
+                                    <w:t>reset</w:t>
+                                  </w:r>
+                                </w:p>
+                              </w:txbxContent>
+                            </wps:txbx>
+                            <wps:bodyPr rot="0" spcFirstLastPara="0" vertOverflow="overflow" horzOverflow="overflow" vert="horz" wrap="square" lIns="0" tIns="0" rIns="0" bIns="0" numCol="1" spcCol="0" rtlCol="0" fromWordArt="0" anchor="ctr" anchorCtr="0" forceAA="0" compatLnSpc="1">
+                              <a:prstTxWarp prst="textNoShape">
+                                <a:avLst/>
+                              </a:prstTxWarp>
+                              <a:noAutofit/>
+                            </wps:bodyPr>
+                          </wps:wsp>
+                        </a:graphicData>
+                      </a:graphic>
+                      <wp14:sizeRelH relativeFrom="margin">
+                        <wp14:pctWidth>0</wp14:pctWidth>
+                      </wp14:sizeRelH>
+                      <wp14:sizeRelV relativeFrom="margin">
+                        <wp14:pctHeight>0</wp14:pctHeight>
+                      </wp14:sizeRelV>
+                    </wp:anchor>
+                  </w:drawing>
+                </mc:Choice>
+                <mc:Fallback>
+                  <w:pict>
+                    <v:rect w14:anchorId="01FDE6F4" id="_x0000_s1037" style="position:absolute;left:0;text-align:left;margin-left:103.45pt;margin-top:319.2pt;width:52pt;height:25.5pt;z-index:251693056;visibility:visible;mso-wrap-style:square;mso-width-percent:0;mso-height-percent:0;mso-wrap-distance-left:9pt;mso-wrap-distance-top:0;mso-wrap-distance-right:9pt;mso-wrap-distance-bottom:0;mso-position-horizontal:absolute;mso-position-horizontal-relative:text;mso-position-vertical:absolute;mso-position-vertical-relative:text;mso-width-percent:0;mso-height-percent:0;mso-width-relative:margin;mso-height-relative:margin;v-text-anchor:middle" o:gfxdata="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" fillcolor="black" strokecolor="red" strokeweight="1pt">
+                      <v:fill opacity="39321f"/>
+                      <v:textbox inset="0,0,0,0">
+                        <w:txbxContent>
+                          <w:p>
+                            <w:pPr>
+                              <w:spacing w:after="0" w:line="204" w:lineRule="auto"/>
+                              <w:jc w:val="center"/>
+                              <w:rPr>
+                                <w:b/>
+                                <w:bCs/>
+                                <w:color w:val="FF0000"/>
+                                <w:sz w:val="20"/>
+                                <w:szCs w:val="20"/>
+                                <w14:shadow w14:blurRad="50800" w14:dist="38100" w14:dir="2700000" w14:sx="100000" w14:sy="100000" w14:kx="0" w14:ky="0" w14:algn="tl">
+                                  <w14:srgbClr w14:val="000000">
+                                    <w14:alpha w14:val="60000"/>
+                                  </w14:srgbClr>
+                                </w14:shadow>
+                              </w:rPr>
+                            </w:pPr>
+                            <w:r>
+                              <w:rPr>
+                                <w:b/>
+                                <w:bCs/>
+                                <w:color w:val="FF0000"/>
+                                <w:sz w:val="20"/>
+                                <w:szCs w:val="20"/>
+                                <w14:shadow w14:blurRad="50800" w14:dist="38100" w14:dir="2700000" w14:sx="100000" w14:sy="100000" w14:kx="0" w14:ky="0" w14:algn="tl">
+                                  <w14:srgbClr w14:val="000000">
+                                    <w14:alpha w14:val="60000"/>
+                                  </w14:srgbClr>
+                                </w14:shadow>
+                              </w:rPr>
+                              <w:t xml:space="preserve">Deadman </w:t>
+                            </w:r>
+                            <w:r>
+                              <w:rPr>
+                                <w:b/>
+                                <w:bCs/>
+                                <w:color w:val="FF0000"/>
+                                <w:sz w:val="20"/>
+                                <w:szCs w:val="20"/>
+                                <w14:shadow w14:blurRad="50800" w14:dist="38100" w14:dir="2700000" w14:sx="100000" w14:sy="100000" w14:kx="0" w14:ky="0" w14:algn="tl">
+                                  <w14:srgbClr w14:val="000000">
+                                    <w14:alpha w14:val="60000"/>
+                                  </w14:srgbClr>
+                                </w14:shadow>
+                              </w:rPr>
+                              <w:t>reset</w:t>
+                            </w:r>
+                          </w:p>
+                        </w:txbxContent>
+                      </v:textbox>
+                    </v:rect>
+                  </w:pict>
+                </mc:Fallback>
+              </mc:AlternateContent>
+            </w:r>
+            <w:r>
+              <w:rPr>
+                <w:noProof/>
+                <w:color w:val="FFFFFF" w:themeColor="background1"/>
+                <w:sz w:val="32"/>
+                <w:szCs w:val="32"/>
+              </w:rPr>
+              <mc:AlternateContent>
+                <mc:Choice Requires="wps">
+                  <w:drawing>
+                    <wp:anchor distT="0" distB="0" distL="114300" distR="114300" simplePos="0" relativeHeight="251699200" behindDoc="0" locked="0" layoutInCell="1" allowOverlap="1" wp14:anchorId="7B697D34" wp14:editId="5F305AA6">
+                      <wp:simplePos x="0" y="0"/>
+                      <wp:positionH relativeFrom="column">
+                        <wp:posOffset>4622673</wp:posOffset>
+                      </wp:positionH>
+                      <wp:positionV relativeFrom="paragraph">
+                        <wp:posOffset>4975809</wp:posOffset>
+                      </wp:positionV>
+                      <wp:extent cx="611505" cy="215900"/>
+                      <wp:effectExtent l="0" t="0" r="17145" b="12700"/>
+                      <wp:wrapNone/>
+                      <wp:docPr id="974760974" name="Rectangle 1"/>
+                      <wp:cNvGraphicFramePr/>
+                      <a:graphic xmlns:a="http://schemas.openxmlformats.org/drawingml/2006/main">
+                        <a:graphicData uri="http://schemas.microsoft.com/office/word/2010/wordprocessingShape">
+                          <wps:wsp>
+                            <wps:cNvSpPr/>
+                            <wps:spPr>
+                              <a:xfrm>
+                                <a:off x="0" y="0"/>
+                                <a:ext cx="611505" cy="215900"/>
+                              </a:xfrm>
+                              <a:prstGeom prst="rect">
+                                <a:avLst/>
+                              </a:prstGeom>
+                              <a:solidFill>
+                                <a:srgbClr val="000000">
+                                  <a:alpha val="60000"/>
+                                </a:srgbClr>
+                              </a:solidFill>
+                              <a:ln w="12700" cap="flat" cmpd="sng" algn="ctr">
+                                <a:solidFill>
+                                  <a:srgbClr val="FF0000"/>
+                                </a:solidFill>
+                                <a:prstDash val="solid"/>
+                                <a:miter lim="800000"/>
+                              </a:ln>
+                              <a:effectLst/>
+                            </wps:spPr>
+                            <wps:txbx>
+                              <w:txbxContent>
+                                <w:p>
+                                  <w:pPr>
+                                    <w:spacing w:after="0"/>
+                                    <w:jc w:val="center"/>
+                                    <w:rPr>
+                                      <w:b/>
+                                      <w:bCs/>
+                                      <w:color w:val="FF0000"/>
+                                      <w:sz w:val="20"/>
+                                      <w:szCs w:val="20"/>
+                                      <w14:shadow w14:blurRad="50800" w14:dist="38100" w14:dir="2700000" w14:sx="100000" w14:sy="100000" w14:kx="0" w14:ky="0" w14:algn="tl">
+                                        <w14:srgbClr w14:val="000000">
+                                          <w14:alpha w14:val="60000"/>
+                                        </w14:srgbClr>
+                                      </w14:shadow>
+                                    </w:rPr>
+                                  </w:pPr>
+                                  <w:r>
+                                    <w:rPr>
+                                      <w:b/>
+                                      <w:bCs/>
+                                      <w:color w:val="FF0000"/>
+                                      <w:sz w:val="20"/>
+                                      <w:szCs w:val="20"/>
+                                      <w14:shadow w14:blurRad="50800" w14:dist="38100" w14:dir="2700000" w14:sx="100000" w14:sy="100000" w14:kx="0" w14:ky="0" w14:algn="tl">
+                                        <w14:srgbClr w14:val="000000">
+                                          <w14:alpha w14:val="60000"/>
+                                        </w14:srgbClr>
+                                      </w14:shadow>
+                                    </w:rPr>
+                                    <w:t>Wipers</w:t>
+                                  </w:r>
+                                </w:p>
+                              </w:txbxContent>
+                            </wps:txbx>
+                            <wps:bodyPr rot="0" spcFirstLastPara="0" vertOverflow="overflow" horzOverflow="overflow" vert="horz" wrap="square" lIns="0" tIns="0" rIns="0" bIns="0" numCol="1" spcCol="0" rtlCol="0" fromWordArt="0" anchor="ctr" anchorCtr="0" forceAA="0" compatLnSpc="1">
+                              <a:prstTxWarp prst="textNoShape">
+                                <a:avLst/>
+                              </a:prstTxWarp>
+                              <a:noAutofit/>
+                            </wps:bodyPr>
+                          </wps:wsp>
+                        </a:graphicData>
+                      </a:graphic>
+                      <wp14:sizeRelH relativeFrom="margin">
+                        <wp14:pctWidth>0</wp14:pctWidth>
+                      </wp14:sizeRelH>
+                      <wp14:sizeRelV relativeFrom="margin">
+                        <wp14:pctHeight>0</wp14:pctHeight>
+                      </wp14:sizeRelV>
+                    </wp:anchor>
+                  </w:drawing>
+                </mc:Choice>
+                <mc:Fallback>
+                  <w:pict>
+                    <v:rect w14:anchorId="7B697D34" id="_x0000_s1038" style="position:absolute;left:0;text-align:left;margin-left:364pt;margin-top:391.8pt;width:48.15pt;height:17pt;z-index:251699200;visibility:visible;mso-wrap-style:square;mso-width-percent:0;mso-height-percent:0;mso-wrap-distance-left:9pt;mso-wrap-distance-top:0;mso-wrap-distance-right:9pt;mso-wrap-distance-bottom:0;mso-position-horizontal:absolute;mso-position-horizontal-relative:text;mso-position-vertical:absolute;mso-position-vertical-relative:text;mso-width-percent:0;mso-height-percent:0;mso-width-relative:margin;mso-height-relative:margin;v-text-anchor:middle" o:gfxdata="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" fillcolor="black" strokecolor="red" strokeweight="1pt">
+                      <v:fill opacity="39321f"/>
+                      <v:textbox inset="0,0,0,0">
+                        <w:txbxContent>
+                          <w:p>
+                            <w:pPr>
+                              <w:spacing w:after="0"/>
+                              <w:jc w:val="center"/>
+                              <w:rPr>
+                                <w:b/>
+                                <w:bCs/>
+                                <w:color w:val="FF0000"/>
+                                <w:sz w:val="20"/>
+                                <w:szCs w:val="20"/>
+                                <w14:shadow w14:blurRad="50800" w14:dist="38100" w14:dir="2700000" w14:sx="100000" w14:sy="100000" w14:kx="0" w14:ky="0" w14:algn="tl">
+                                  <w14:srgbClr w14:val="000000">
+                                    <w14:alpha w14:val="60000"/>
+                                  </w14:srgbClr>
+                                </w14:shadow>
+                              </w:rPr>
+                            </w:pPr>
+                            <w:r>
+                              <w:rPr>
+                                <w:b/>
+                                <w:bCs/>
+                                <w:color w:val="FF0000"/>
+                                <w:sz w:val="20"/>
+                                <w:szCs w:val="20"/>
+                                <w14:shadow w14:blurRad="50800" w14:dist="38100" w14:dir="2700000" w14:sx="100000" w14:sy="100000" w14:kx="0" w14:ky="0" w14:algn="tl">
+                                  <w14:srgbClr w14:val="000000">
+                                    <w14:alpha w14:val="60000"/>
+                                  </w14:srgbClr>
+                                </w14:shadow>
+                              </w:rPr>
+                              <w:t>Wipers</w:t>
+                            </w:r>
+                          </w:p>
+                        </w:txbxContent>
+                      </v:textbox>
+                    </v:rect>
+                  </w:pict>
+                </mc:Fallback>
+              </mc:AlternateContent>
+            </w:r>
+            <w:r>
+              <w:rPr>
+                <w:noProof/>
+                <w:color w:val="FFFFFF" w:themeColor="background1"/>
+                <w:sz w:val="32"/>
+                <w:szCs w:val="32"/>
+              </w:rPr>
+              <mc:AlternateContent>
+                <mc:Choice Requires="wps">
+                  <w:drawing>
+                    <wp:anchor distT="0" distB="0" distL="114300" distR="114300" simplePos="0" relativeHeight="251675648" behindDoc="0" locked="0" layoutInCell="1" allowOverlap="1" wp14:anchorId="62E3AE57" wp14:editId="5D127AD4">
+                      <wp:simplePos x="0" y="0"/>
+                      <wp:positionH relativeFrom="column">
+                        <wp:posOffset>2127885</wp:posOffset>
+                      </wp:positionH>
+                      <wp:positionV relativeFrom="paragraph">
+                        <wp:posOffset>1831974</wp:posOffset>
+                      </wp:positionV>
+                      <wp:extent cx="202565" cy="630555"/>
+                      <wp:effectExtent l="0" t="38100" r="64135" b="17145"/>
+                      <wp:wrapNone/>
+                      <wp:docPr id="224703054" name="Straight Arrow Connector 2"/>
+                      <wp:cNvGraphicFramePr/>
+                      <a:graphic xmlns:a="http://schemas.openxmlformats.org/drawingml/2006/main">
+                        <a:graphicData uri="http://schemas.microsoft.com/office/word/2010/wordprocessingShape">
+                          <wps:wsp>
+                            <wps:cNvCnPr/>
+                            <wps:spPr>
+                              <a:xfrm flipV="1">
+                                <a:off x="0" y="0"/>
+                                <a:ext cx="202565" cy="630555"/>
+                              </a:xfrm>
+                              <a:prstGeom prst="straightConnector1">
+                                <a:avLst/>
+                              </a:prstGeom>
+                              <a:ln>
+                                <a:solidFill>
+                                  <a:srgbClr val="FF0000"/>
+                                </a:solidFill>
+                                <a:tailEnd type="triangle"/>
+                              </a:ln>
+                            </wps:spPr>
+                            <wps:style>
+                              <a:lnRef idx="2">
+                                <a:schemeClr val="accent1"/>
+                              </a:lnRef>
+                              <a:fillRef idx="0">
+                                <a:schemeClr val="accent1"/>
+                              </a:fillRef>
+                              <a:effectRef idx="1">
+                                <a:schemeClr val="accent1"/>
+                              </a:effectRef>
+                              <a:fontRef idx="minor">
+                                <a:schemeClr val="tx1"/>
+                              </a:fontRef>
+                            </wps:style>
+                            <wps:bodyPr/>
+                          </wps:wsp>
+                        </a:graphicData>
+                      </a:graphic>
+                      <wp14:sizeRelH relativeFrom="margin">
+                        <wp14:pctWidth>0</wp14:pctWidth>
+                      </wp14:sizeRelH>
+                      <wp14:sizeRelV relativeFrom="margin">
+                        <wp14:pctHeight>0</wp14:pctHeight>
+                      </wp14:sizeRelV>
+                    </wp:anchor>
+                  </w:drawing>
+                </mc:Choice>
+                <mc:Fallback>
+                  <w:pict>
+                    <v:shapetype w14:anchorId="2405E2C3" id="_x0000_t32" coordsize="21600,21600" o:spt="32" o:oned="t" path="m,l21600,21600e" filled="f">
+                      <v:path arrowok="t" fillok="f" o:connecttype="none"/>
+                      <o:lock v:ext="edit" shapetype="t"/>
+                    </v:shapetype>
+                    <v:shape id="Straight Arrow Connector 2" o:spid="_x0000_s1026" type="#_x0000_t32" style="position:absolute;margin-left:167.55pt;margin-top:144.25pt;width:15.95pt;height:49.65pt;flip:y;z-index:251675648;visibility:visible;mso-wrap-style:square;mso-width-percent:0;mso-height-percent:0;mso-wrap-distance-left:9pt;mso-wrap-distance-top:0;mso-wrap-distance-right:9pt;mso-wrap-distance-bottom:0;mso-position-horizontal:absolute;mso-position-horizontal-relative:text;mso-position-vertical:absolute;mso-position-vertical-relative:text;mso-width-percent:0;mso-height-percent:0;mso-width-relative:margin;mso-height-relative:margin" o:gfxdata="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" strokecolor="red" strokeweight="1.5pt">
+                      <v:stroke endarrow="block" joinstyle="miter"/>
+                    </v:shape>
+                  </w:pict>
+                </mc:Fallback>
+              </mc:AlternateContent>
+            </w:r>
+            <w:r>
+              <w:rPr>
+                <w:noProof/>
+                <w:color w:val="FFFFFF" w:themeColor="background1"/>
+                <w:sz w:val="32"/>
+                <w:szCs w:val="32"/>
+              </w:rPr>
+              <mc:AlternateContent>
+                <mc:Choice Requires="wps">
+                  <w:drawing>
+                    <wp:anchor distT="0" distB="0" distL="114300" distR="114300" simplePos="0" relativeHeight="251674624" behindDoc="0" locked="0" layoutInCell="1" allowOverlap="1" wp14:anchorId="30B8046B" wp14:editId="28FEFFC4">
+                      <wp:simplePos x="0" y="0"/>
+                      <wp:positionH relativeFrom="column">
+                        <wp:posOffset>1824990</wp:posOffset>
+                      </wp:positionH>
+                      <wp:positionV relativeFrom="paragraph">
+                        <wp:posOffset>2464435</wp:posOffset>
+                      </wp:positionV>
+                      <wp:extent cx="611505" cy="215900"/>
+                      <wp:effectExtent l="0" t="0" r="17145" b="12700"/>
+                      <wp:wrapNone/>
+                      <wp:docPr id="906436419" name="Rectangle 1"/>
+                      <wp:cNvGraphicFramePr/>
+                      <a:graphic xmlns:a="http://schemas.openxmlformats.org/drawingml/2006/main">
+                        <a:graphicData uri="http://schemas.microsoft.com/office/word/2010/wordprocessingShape">
+                          <wps:wsp>
+                            <wps:cNvSpPr/>
+                            <wps:spPr>
+                              <a:xfrm>
+                                <a:off x="0" y="0"/>
+                                <a:ext cx="611505" cy="215900"/>
+                              </a:xfrm>
+                              <a:prstGeom prst="rect">
+                                <a:avLst/>
+                              </a:prstGeom>
+                              <a:solidFill>
+                                <a:srgbClr val="000000">
+                                  <a:alpha val="60000"/>
+                                </a:srgbClr>
+                              </a:solidFill>
+                              <a:ln w="12700">
+                                <a:solidFill>
+                                  <a:srgbClr val="FF0000"/>
+                                </a:solidFill>
+                              </a:ln>
+                            </wps:spPr>
+                            <wps:style>
+                              <a:lnRef idx="2">
+                                <a:schemeClr val="accent1">
+                                  <a:shade val="15000"/>
+                                </a:schemeClr>
+                              </a:lnRef>
+                              <a:fillRef idx="1">
+                                <a:schemeClr val="accent1"/>
+                              </a:fillRef>
+                              <a:effectRef idx="0">
+                                <a:schemeClr val="accent1"/>
+                              </a:effectRef>
+                              <a:fontRef idx="minor">
+                                <a:schemeClr val="lt1"/>
+                              </a:fontRef>
+                            </wps:style>
+                            <wps:txbx>
+                              <w:txbxContent>
+                                <w:p>
+                                  <w:pPr>
+                                    <w:spacing w:after="0"/>
+                                    <w:jc w:val="center"/>
+                                    <w:rPr>
+                                      <w:b/>
+                                      <w:bCs/>
+                                      <w:color w:val="FF0000"/>
+                                      <w:sz w:val="20"/>
+                                      <w:szCs w:val="20"/>
+                                      <w14:shadow w14:blurRad="50800" w14:dist="38100" w14:dir="2700000" w14:sx="100000" w14:sy="100000" w14:kx="0" w14:ky="0" w14:algn="tl">
+                                        <w14:srgbClr w14:val="000000">
+                                          <w14:alpha w14:val="60000"/>
+                                        </w14:srgbClr>
+                                      </w14:shadow>
+                                    </w:rPr>
+                                  </w:pPr>
+                                  <w:r>
+                                    <w:rPr>
+                                      <w:b/>
+                                      <w:bCs/>
+                                      <w:color w:val="FF0000"/>
+                                      <w:sz w:val="20"/>
+                                      <w:szCs w:val="20"/>
+                                      <w14:shadow w14:blurRad="50800" w14:dist="38100" w14:dir="2700000" w14:sx="100000" w14:sy="100000" w14:kx="0" w14:ky="0" w14:algn="tl">
+                                        <w14:srgbClr w14:val="000000">
+                                          <w14:alpha w14:val="60000"/>
+                                        </w14:srgbClr>
+                                      </w14:shadow>
+                                    </w:rPr>
+                                    <w:t>Sand</w:t>
+                                  </w:r>
+                                  <w:r>
+                                    <w:rPr>
+                                      <w:b/>
+                                      <w:bCs/>
+                                      <w:color w:val="FF0000"/>
+                                      <w:sz w:val="20"/>
+                                      <w:szCs w:val="20"/>
+                                      <w14:shadow w14:blurRad="50800" w14:dist="38100" w14:dir="2700000" w14:sx="100000" w14:sy="100000" w14:kx="0" w14:ky="0" w14:algn="tl">
+                                        <w14:srgbClr w14:val="000000">
+                                          <w14:alpha w14:val="60000"/>
+                                        </w14:srgbClr>
+                                      </w14:shadow>
+                                    </w:rPr>
+                                    <w:t>er</w:t>
+                                  </w:r>
+                                </w:p>
+                              </w:txbxContent>
+                            </wps:txbx>
+                            <wps:bodyPr rot="0" spcFirstLastPara="0" vertOverflow="overflow" horzOverflow="overflow" vert="horz" wrap="square" lIns="0" tIns="0" rIns="0" bIns="0" numCol="1" spcCol="0" rtlCol="0" fromWordArt="0" anchor="ctr" anchorCtr="0" forceAA="0" compatLnSpc="1">
+                              <a:prstTxWarp prst="textNoShape">
+                                <a:avLst/>
+                              </a:prstTxWarp>
+                              <a:noAutofit/>
+                            </wps:bodyPr>
+                          </wps:wsp>
+                        </a:graphicData>
+                      </a:graphic>
+                      <wp14:sizeRelH relativeFrom="margin">
+                        <wp14:pctWidth>0</wp14:pctWidth>
+                      </wp14:sizeRelH>
+                      <wp14:sizeRelV relativeFrom="margin">
+                        <wp14:pctHeight>0</wp14:pctHeight>
+                      </wp14:sizeRelV>
+                    </wp:anchor>
+                  </w:drawing>
+                </mc:Choice>
+                <mc:Fallback>
+                  <w:pict>
+                    <v:rect w14:anchorId="30B8046B" id="_x0000_s1039" style="position:absolute;left:0;text-align:left;margin-left:143.7pt;margin-top:194.05pt;width:48.15pt;height:17pt;z-index:251674624;visibility:visible;mso-wrap-style:square;mso-width-percent:0;mso-height-percent:0;mso-wrap-distance-left:9pt;mso-wrap-distance-top:0;mso-wrap-distance-right:9pt;mso-wrap-distance-bottom:0;mso-position-horizontal:absolute;mso-position-horizontal-relative:text;mso-position-vertical:absolute;mso-position-vertical-relative:text;mso-width-percent:0;mso-height-percent:0;mso-width-relative:margin;mso-height-relative:margin;v-text-anchor:middle" o:gfxdata="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" fillcolor="black" strokecolor="red" strokeweight="1pt">
+                      <v:fill opacity="39321f"/>
+                      <v:textbox inset="0,0,0,0">
+                        <w:txbxContent>
+                          <w:p>
+                            <w:pPr>
+                              <w:spacing w:after="0"/>
+                              <w:jc w:val="center"/>
+                              <w:rPr>
+                                <w:b/>
+                                <w:bCs/>
+                                <w:color w:val="FF0000"/>
+                                <w:sz w:val="20"/>
+                                <w:szCs w:val="20"/>
+                                <w14:shadow w14:blurRad="50800" w14:dist="38100" w14:dir="2700000" w14:sx="100000" w14:sy="100000" w14:kx="0" w14:ky="0" w14:algn="tl">
+                                  <w14:srgbClr w14:val="000000">
+                                    <w14:alpha w14:val="60000"/>
+                                  </w14:srgbClr>
+                                </w14:shadow>
+                              </w:rPr>
+                            </w:pPr>
+                            <w:r>
+                              <w:rPr>
+                                <w:b/>
+                                <w:bCs/>
+                                <w:color w:val="FF0000"/>
+                                <w:sz w:val="20"/>
+                                <w:szCs w:val="20"/>
+                                <w14:shadow w14:blurRad="50800" w14:dist="38100" w14:dir="2700000" w14:sx="100000" w14:sy="100000" w14:kx="0" w14:ky="0" w14:algn="tl">
+                                  <w14:srgbClr w14:val="000000">
+                                    <w14:alpha w14:val="60000"/>
+                                  </w14:srgbClr>
+                                </w14:shadow>
+                              </w:rPr>
+                              <w:t>Sand</w:t>
+                            </w:r>
+                            <w:r>
+                              <w:rPr>
+                                <w:b/>
+                                <w:bCs/>
+                                <w:color w:val="FF0000"/>
+                                <w:sz w:val="20"/>
+                                <w:szCs w:val="20"/>
+                                <w14:shadow w14:blurRad="50800" w14:dist="38100" w14:dir="2700000" w14:sx="100000" w14:sy="100000" w14:kx="0" w14:ky="0" w14:algn="tl">
+                                  <w14:srgbClr w14:val="000000">
+                                    <w14:alpha w14:val="60000"/>
+                                  </w14:srgbClr>
+                                </w14:shadow>
+                              </w:rPr>
+                              <w:t>er</w:t>
+                            </w:r>
+                          </w:p>
+                        </w:txbxContent>
+                      </v:textbox>
+                    </v:rect>
+                  </w:pict>
+                </mc:Fallback>
+              </mc:AlternateContent>
+            </w:r>
+            <w:r>
+              <w:rPr>
+                <w:noProof/>
+                <w:color w:val="FFFFFF" w:themeColor="background1"/>
+                <w:sz w:val="32"/>
+                <w:szCs w:val="32"/>
+              </w:rPr>
+              <mc:AlternateContent>
+                <mc:Choice Requires="wps">
+                  <w:drawing>
+                    <wp:anchor distT="0" distB="0" distL="114300" distR="114300" simplePos="0" relativeHeight="251697152" behindDoc="0" locked="0" layoutInCell="1" allowOverlap="1" wp14:anchorId="0A5CB297" wp14:editId="59A6D97E">
+                      <wp:simplePos x="0" y="0"/>
+                      <wp:positionH relativeFrom="column">
+                        <wp:posOffset>2922270</wp:posOffset>
+                      </wp:positionH>
+                      <wp:positionV relativeFrom="paragraph">
+                        <wp:posOffset>5260975</wp:posOffset>
+                      </wp:positionV>
+                      <wp:extent cx="742950" cy="323850"/>
+                      <wp:effectExtent l="0" t="0" r="19050" b="19050"/>
+                      <wp:wrapNone/>
+                      <wp:docPr id="1728082534" name="Rectangle 1"/>
+                      <wp:cNvGraphicFramePr/>
+                      <a:graphic xmlns:a="http://schemas.openxmlformats.org/drawingml/2006/main">
+                        <a:graphicData uri="http://schemas.microsoft.com/office/word/2010/wordprocessingShape">
+                          <wps:wsp>
+                            <wps:cNvSpPr/>
+                            <wps:spPr>
+                              <a:xfrm>
+                                <a:off x="0" y="0"/>
+                                <a:ext cx="742950" cy="323850"/>
+                              </a:xfrm>
+                              <a:prstGeom prst="rect">
+                                <a:avLst/>
+                              </a:prstGeom>
+                              <a:solidFill>
+                                <a:srgbClr val="000000">
+                                  <a:alpha val="60000"/>
+                                </a:srgbClr>
+                              </a:solidFill>
+                              <a:ln w="12700">
+                                <a:solidFill>
+                                  <a:srgbClr val="FF0000"/>
+                                </a:solidFill>
+                              </a:ln>
+                            </wps:spPr>
+                            <wps:style>
+                              <a:lnRef idx="2">
+                                <a:schemeClr val="accent1">
+                                  <a:shade val="15000"/>
+                                </a:schemeClr>
+                              </a:lnRef>
+                              <a:fillRef idx="1">
+                                <a:schemeClr val="accent1"/>
+                              </a:fillRef>
+                              <a:effectRef idx="0">
+                                <a:schemeClr val="accent1"/>
+                              </a:effectRef>
+                              <a:fontRef idx="minor">
+                                <a:schemeClr val="lt1"/>
+                              </a:fontRef>
+                            </wps:style>
+                            <wps:txbx>
+                              <w:txbxContent>
+                                <w:p>
+                                  <w:pPr>
+                                    <w:spacing w:after="0" w:line="204" w:lineRule="auto"/>
+                                    <w:jc w:val="center"/>
+                                    <w:rPr>
+                                      <w:b/>
+                                      <w:bCs/>
+                                      <w:color w:val="FF0000"/>
+                                      <w:sz w:val="20"/>
+                                      <w:szCs w:val="20"/>
+                                      <w14:shadow w14:blurRad="50800" w14:dist="38100" w14:dir="2700000" w14:sx="100000" w14:sy="100000" w14:kx="0" w14:ky="0" w14:algn="tl">
+                                        <w14:srgbClr w14:val="000000">
+                                          <w14:alpha w14:val="60000"/>
+                                        </w14:srgbClr>
+                                      </w14:shadow>
+                                    </w:rPr>
+                                  </w:pPr>
+                                  <w:r>
+                                    <w:rPr>
+                                      <w:b/>
+                                      <w:bCs/>
+                                      <w:color w:val="FF0000"/>
+                                      <w:sz w:val="20"/>
+                                      <w:szCs w:val="20"/>
+                                      <w14:shadow w14:blurRad="50800" w14:dist="38100" w14:dir="2700000" w14:sx="100000" w14:sy="100000" w14:kx="0" w14:ky="0" w14:algn="tl">
+                                        <w14:srgbClr w14:val="000000">
+                                          <w14:alpha w14:val="60000"/>
+                                        </w14:srgbClr>
+                                      </w14:shadow>
+                                    </w:rPr>
+                                    <w:t>Headlights</w:t>
+                                  </w:r>
+                                  <w:r>
+                                    <w:rPr>
+                                      <w:b/>
+                                      <w:bCs/>
+                                      <w:color w:val="FF0000"/>
+                                      <w:sz w:val="20"/>
+                                      <w:szCs w:val="20"/>
+                                      <w14:shadow w14:blurRad="50800" w14:dist="38100" w14:dir="2700000" w14:sx="100000" w14:sy="100000" w14:kx="0" w14:ky="0" w14:algn="tl">
+                                        <w14:srgbClr w14:val="000000">
+                                          <w14:alpha w14:val="60000"/>
+                                        </w14:srgbClr>
+                                      </w14:shadow>
+                                    </w:rPr>
+                                    <w:br/>
+                                    <w:t>←</w:t>
+                                  </w:r>
+                                  <w:proofErr w:type="gramStart"/>
+                                  <w:r>
+                                    <w:rPr>
+                                      <w:b/>
+                                      <w:bCs/>
+                                      <w:color w:val="FF0000"/>
+                                      <w:sz w:val="20"/>
+                                      <w:szCs w:val="20"/>
+                                      <w14:shadow w14:blurRad="50800" w14:dist="38100" w14:dir="2700000" w14:sx="100000" w14:sy="100000" w14:kx="0" w14:ky="0" w14:algn="tl">
+                                        <w14:srgbClr w14:val="000000">
+                                          <w14:alpha w14:val="60000"/>
+                                        </w14:srgbClr>
+                                      </w14:shadow>
+                                    </w:rPr>
+                                    <w:t xml:space="preserve">dec  </w:t>
+                                  </w:r>
+                                  <w:proofErr w:type="spellStart"/>
+                                  <w:r>
+                                    <w:rPr>
+                                      <w:b/>
+                                      <w:bCs/>
+                                      <w:color w:val="FF0000"/>
+                                      <w:sz w:val="20"/>
+                                      <w:szCs w:val="20"/>
+                                      <w14:shadow w14:blurRad="50800" w14:dist="38100" w14:dir="2700000" w14:sx="100000" w14:sy="100000" w14:kx="0" w14:ky="0" w14:algn="tl">
+                                        <w14:srgbClr w14:val="000000">
+                                          <w14:alpha w14:val="60000"/>
+                                        </w14:srgbClr>
+                                      </w14:shadow>
+                                    </w:rPr>
+                                    <w:t>inc</w:t>
+                                  </w:r>
+                                  <w:proofErr w:type="spellEnd"/>
+                                  <w:proofErr w:type="gramEnd"/>
+                                  <w:r>
+                                    <w:rPr>
+                                      <w:b/>
+                                      <w:bCs/>
+                                      <w:color w:val="FF0000"/>
+                                      <w:sz w:val="20"/>
+                                      <w:szCs w:val="20"/>
+                                      <w14:shadow w14:blurRad="50800" w14:dist="38100" w14:dir="2700000" w14:sx="100000" w14:sy="100000" w14:kx="0" w14:ky="0" w14:algn="tl">
+                                        <w14:srgbClr w14:val="000000">
+                                          <w14:alpha w14:val="60000"/>
+                                        </w14:srgbClr>
+                                      </w14:shadow>
+                                    </w:rPr>
+                                    <w:t>→</w:t>
+                                  </w:r>
+                                </w:p>
+                              </w:txbxContent>
+                            </wps:txbx>
+                            <wps:bodyPr rot="0" spcFirstLastPara="0" vertOverflow="overflow" horzOverflow="overflow" vert="horz" wrap="square" lIns="0" tIns="0" rIns="0" bIns="0" numCol="1" spcCol="0" rtlCol="0" fromWordArt="0" anchor="ctr" anchorCtr="0" forceAA="0" compatLnSpc="1">
+                              <a:prstTxWarp prst="textNoShape">
+                                <a:avLst/>
+                              </a:prstTxWarp>
+                              <a:noAutofit/>
+                            </wps:bodyPr>
+                          </wps:wsp>
+                        </a:graphicData>
+                      </a:graphic>
+                      <wp14:sizeRelH relativeFrom="margin">
+                        <wp14:pctWidth>0</wp14:pctWidth>
+                      </wp14:sizeRelH>
+                      <wp14:sizeRelV relativeFrom="margin">
+                        <wp14:pctHeight>0</wp14:pctHeight>
+                      </wp14:sizeRelV>
+                    </wp:anchor>
+                  </w:drawing>
+                </mc:Choice>
+                <mc:Fallback>
+                  <w:pict>
+                    <v:rect w14:anchorId="0A5CB297" id="_x0000_s1040" style="position:absolute;left:0;text-align:left;margin-left:230.1pt;margin-top:414.25pt;width:58.5pt;height:25.5pt;z-index:251697152;visibility:visible;mso-wrap-style:square;mso-width-percent:0;mso-height-percent:0;mso-wrap-distance-left:9pt;mso-wrap-distance-top:0;mso-wrap-distance-right:9pt;mso-wrap-distance-bottom:0;mso-position-horizontal:absolute;mso-position-horizontal-relative:text;mso-position-vertical:absolute;mso-position-vertical-relative:text;mso-width-percent:0;mso-height-percent:0;mso-width-relative:margin;mso-height-relative:margin;v-text-anchor:middle" o:gfxdata="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" fillcolor="black" strokecolor="red" strokeweight="1pt">
+                      <v:fill opacity="39321f"/>
+                      <v:textbox inset="0,0,0,0">
+                        <w:txbxContent>
+                          <w:p>
+                            <w:pPr>
+                              <w:spacing w:after="0" w:line="204" w:lineRule="auto"/>
+                              <w:jc w:val="center"/>
+                              <w:rPr>
+                                <w:b/>
+                                <w:bCs/>
+                                <w:color w:val="FF0000"/>
+                                <w:sz w:val="20"/>
+                                <w:szCs w:val="20"/>
+                                <w14:shadow w14:blurRad="50800" w14:dist="38100" w14:dir="2700000" w14:sx="100000" w14:sy="100000" w14:kx="0" w14:ky="0" w14:algn="tl">
+                                  <w14:srgbClr w14:val="000000">
+                                    <w14:alpha w14:val="60000"/>
+                                  </w14:srgbClr>
+                                </w14:shadow>
+                              </w:rPr>
+                            </w:pPr>
+                            <w:r>
+                              <w:rPr>
+                                <w:b/>
+                                <w:bCs/>
+                                <w:color w:val="FF0000"/>
+                                <w:sz w:val="20"/>
+                                <w:szCs w:val="20"/>
+                                <w14:shadow w14:blurRad="50800" w14:dist="38100" w14:dir="2700000" w14:sx="100000" w14:sy="100000" w14:kx="0" w14:ky="0" w14:algn="tl">
+                                  <w14:srgbClr w14:val="000000">
+                                    <w14:alpha w14:val="60000"/>
+                                  </w14:srgbClr>
+                                </w14:shadow>
+                              </w:rPr>
+                              <w:t>Headlights</w:t>
+                            </w:r>
+                            <w:r>
+                              <w:rPr>
+                                <w:b/>
+                                <w:bCs/>
+                                <w:color w:val="FF0000"/>
+                                <w:sz w:val="20"/>
+                                <w:szCs w:val="20"/>
+                                <w14:shadow w14:blurRad="50800" w14:dist="38100" w14:dir="2700000" w14:sx="100000" w14:sy="100000" w14:kx="0" w14:ky="0" w14:algn="tl">
+                                  <w14:srgbClr w14:val="000000">
+                                    <w14:alpha w14:val="60000"/>
+                                  </w14:srgbClr>
+                                </w14:shadow>
+                              </w:rPr>
+                              <w:br/>
+                              <w:t>←</w:t>
+                            </w:r>
+                            <w:proofErr w:type="gramStart"/>
+                            <w:r>
+                              <w:rPr>
+                                <w:b/>
+                                <w:bCs/>
+                                <w:color w:val="FF0000"/>
+                                <w:sz w:val="20"/>
+                                <w:szCs w:val="20"/>
+                                <w14:shadow w14:blurRad="50800" w14:dist="38100" w14:dir="2700000" w14:sx="100000" w14:sy="100000" w14:kx="0" w14:ky="0" w14:algn="tl">
+                                  <w14:srgbClr w14:val="000000">
+                                    <w14:alpha w14:val="60000"/>
+                                  </w14:srgbClr>
+                                </w14:shadow>
+                              </w:rPr>
+                              <w:t xml:space="preserve">dec  </w:t>
+                            </w:r>
+                            <w:proofErr w:type="spellStart"/>
+                            <w:r>
+                              <w:rPr>
+                                <w:b/>
+                                <w:bCs/>
+                                <w:color w:val="FF0000"/>
+                                <w:sz w:val="20"/>
+                                <w:szCs w:val="20"/>
+                                <w14:shadow w14:blurRad="50800" w14:dist="38100" w14:dir="2700000" w14:sx="100000" w14:sy="100000" w14:kx="0" w14:ky="0" w14:algn="tl">
+                                  <w14:srgbClr w14:val="000000">
+                                    <w14:alpha w14:val="60000"/>
+                                  </w14:srgbClr>
+                                </w14:shadow>
+                              </w:rPr>
+                              <w:t>inc</w:t>
+                            </w:r>
+                            <w:proofErr w:type="spellEnd"/>
+                            <w:proofErr w:type="gramEnd"/>
+                            <w:r>
+                              <w:rPr>
+                                <w:b/>
+                                <w:bCs/>
+                                <w:color w:val="FF0000"/>
+                                <w:sz w:val="20"/>
+                                <w:szCs w:val="20"/>
+                                <w14:shadow w14:blurRad="50800" w14:dist="38100" w14:dir="2700000" w14:sx="100000" w14:sy="100000" w14:kx="0" w14:ky="0" w14:algn="tl">
+                                  <w14:srgbClr w14:val="000000">
+                                    <w14:alpha w14:val="60000"/>
+                                  </w14:srgbClr>
+                                </w14:shadow>
+                              </w:rPr>
+                              <w:t>→</w:t>
+                            </w:r>
+                          </w:p>
+                        </w:txbxContent>
+                      </v:textbox>
+                    </v:rect>
+                  </w:pict>
+                </mc:Fallback>
+              </mc:AlternateContent>
+            </w:r>
+            <w:r>
+              <w:rPr>
+                <w:noProof/>
+                <w:color w:val="FFFFFF" w:themeColor="background1"/>
+                <w:sz w:val="32"/>
+                <w:szCs w:val="32"/>
+              </w:rPr>
+              <mc:AlternateContent>
+                <mc:Choice Requires="wps">
+                  <w:drawing>
+                    <wp:anchor distT="0" distB="0" distL="114300" distR="114300" simplePos="0" relativeHeight="251691008" behindDoc="0" locked="0" layoutInCell="1" allowOverlap="1" wp14:anchorId="5011B118" wp14:editId="70F2A810">
                       <wp:simplePos x="0" y="0"/>
                       <wp:positionH relativeFrom="column">
                         <wp:posOffset>4922520</wp:posOffset>
@@ -1879,7 +3766,7 @@
                 </mc:Choice>
                 <mc:Fallback>
                   <w:pict>
-                    <v:rect w14:anchorId="5011B118" id="_x0000_s1031" style="position:absolute;left:0;text-align:left;margin-left:387.6pt;margin-top:329pt;width:39.15pt;height:25.5pt;z-index:251692032;visibility:visible;mso-wrap-style:square;mso-width-percent:0;mso-height-percent:0;mso-wrap-distance-left:9pt;mso-wrap-distance-top:0;mso-wrap-distance-right:9pt;mso-wrap-distance-bottom:0;mso-position-horizontal:absolute;mso-position-horizontal-relative:text;mso-position-vertical:absolute;mso-position-vertical-relative:text;mso-width-percent:0;mso-height-percent:0;mso-width-relative:margin;mso-height-relative:margin;v-text-anchor:middle" o:gfxdata="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" fillcolor="black" strokecolor="red" strokeweight="1pt">
+                    <v:rect w14:anchorId="5011B118" id="_x0000_s1041" style="position:absolute;left:0;text-align:left;margin-left:387.6pt;margin-top:329pt;width:39.15pt;height:25.5pt;z-index:251691008;visibility:visible;mso-wrap-style:square;mso-width-percent:0;mso-height-percent:0;mso-wrap-distance-left:9pt;mso-wrap-distance-top:0;mso-wrap-distance-right:9pt;mso-wrap-distance-bottom:0;mso-position-horizontal:absolute;mso-position-horizontal-relative:text;mso-position-vertical:absolute;mso-position-vertical-relative:text;mso-width-percent:0;mso-height-percent:0;mso-width-relative:margin;mso-height-relative:margin;v-text-anchor:middle" o:gfxdata="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" fillcolor="black" strokecolor="red" strokeweight="1pt">
                       <v:fill opacity="39321f"/>
                       <v:textbox inset="0,0,0,0">
                         <w:txbxContent>
@@ -1981,7 +3868,7 @@
               <mc:AlternateContent>
                 <mc:Choice Requires="wps">
                   <w:drawing>
-                    <wp:anchor distT="0" distB="0" distL="114300" distR="114300" simplePos="0" relativeHeight="251688960" behindDoc="0" locked="0" layoutInCell="1" allowOverlap="1" wp14:anchorId="2CBDD507" wp14:editId="2DB900D1">
+                    <wp:anchor distT="0" distB="0" distL="114300" distR="114300" simplePos="0" relativeHeight="251687936" behindDoc="0" locked="0" layoutInCell="1" allowOverlap="1" wp14:anchorId="2CBDD507" wp14:editId="2826603B">
                       <wp:simplePos x="0" y="0"/>
                       <wp:positionH relativeFrom="column">
                         <wp:posOffset>3928745</wp:posOffset>
@@ -2090,7 +3977,7 @@
                 </mc:Choice>
                 <mc:Fallback>
                   <w:pict>
-                    <v:rect w14:anchorId="2CBDD507" id="_x0000_s1032" style="position:absolute;left:0;text-align:left;margin-left:309.35pt;margin-top:287.25pt;width:59.55pt;height:17pt;z-index:251688960;visibility:visible;mso-wrap-style:square;mso-width-percent:0;mso-height-percent:0;mso-wrap-distance-left:9pt;mso-wrap-distance-top:0;mso-wrap-distance-right:9pt;mso-wrap-distance-bottom:0;mso-position-horizontal:absolute;mso-position-horizontal-relative:text;mso-position-vertical:absolute;mso-position-vertical-relative:text;mso-width-percent:0;mso-height-percent:0;mso-width-relative:margin;mso-height-relative:margin;v-text-anchor:middle" o:gfxdata="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" fillcolor="black" strokecolor="red" strokeweight="1pt">
+                    <v:rect w14:anchorId="2CBDD507" id="_x0000_s1042" style="position:absolute;left:0;text-align:left;margin-left:309.35pt;margin-top:287.25pt;width:59.55pt;height:17pt;z-index:251687936;visibility:visible;mso-wrap-style:square;mso-width-percent:0;mso-height-percent:0;mso-wrap-distance-left:9pt;mso-wrap-distance-top:0;mso-wrap-distance-right:9pt;mso-wrap-distance-bottom:0;mso-position-horizontal:absolute;mso-position-horizontal-relative:text;mso-position-vertical:absolute;mso-position-vertical-relative:text;mso-width-percent:0;mso-height-percent:0;mso-width-relative:margin;mso-height-relative:margin;v-text-anchor:middle" o:gfxdata="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" fillcolor="black" strokecolor="red" strokeweight="1pt">
                       <v:fill opacity="39321f"/>
                       <v:textbox inset="0,0,0,0">
                         <w:txbxContent>
@@ -2144,7 +4031,7 @@
               <mc:AlternateContent>
                 <mc:Choice Requires="wps">
                   <w:drawing>
-                    <wp:anchor distT="0" distB="0" distL="114300" distR="114300" simplePos="0" relativeHeight="251689984" behindDoc="0" locked="0" layoutInCell="1" allowOverlap="1" wp14:anchorId="2F3507D2" wp14:editId="2D611E94">
+                    <wp:anchor distT="0" distB="0" distL="114300" distR="114300" simplePos="0" relativeHeight="251688960" behindDoc="0" locked="0" layoutInCell="1" allowOverlap="1" wp14:anchorId="2F3507D2" wp14:editId="634678FE">
                       <wp:simplePos x="0" y="0"/>
                       <wp:positionH relativeFrom="column">
                         <wp:posOffset>4376420</wp:posOffset>
@@ -2205,7 +4092,7 @@
                 </mc:Choice>
                 <mc:Fallback>
                   <w:pict>
-                    <v:shape w14:anchorId="7261C684" id="Straight Arrow Connector 2" o:spid="_x0000_s1026" type="#_x0000_t32" style="position:absolute;margin-left:344.6pt;margin-top:304.25pt;width:25pt;height:22.75pt;z-index:251689984;visibility:visible;mso-wrap-style:square;mso-width-percent:0;mso-height-percent:0;mso-wrap-distance-left:9pt;mso-wrap-distance-top:0;mso-wrap-distance-right:9pt;mso-wrap-distance-bottom:0;mso-position-horizontal:absolute;mso-position-horizontal-relative:text;mso-position-vertical:absolute;mso-position-vertical-relative:text;mso-width-percent:0;mso-height-percent:0;mso-width-relative:margin;mso-height-relative:margin" o:gfxdata="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" strokecolor="red" strokeweight="1.5pt">
+                    <v:shape w14:anchorId="3F741C35" id="Straight Arrow Connector 2" o:spid="_x0000_s1026" type="#_x0000_t32" style="position:absolute;margin-left:344.6pt;margin-top:304.25pt;width:25pt;height:22.75pt;z-index:251688960;visibility:visible;mso-wrap-style:square;mso-width-percent:0;mso-height-percent:0;mso-wrap-distance-left:9pt;mso-wrap-distance-top:0;mso-wrap-distance-right:9pt;mso-wrap-distance-bottom:0;mso-position-horizontal:absolute;mso-position-horizontal-relative:text;mso-position-vertical:absolute;mso-position-vertical-relative:text;mso-width-percent:0;mso-height-percent:0;mso-width-relative:margin;mso-height-relative:margin" o:gfxdata="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" strokecolor="red" strokeweight="1.5pt">
                       <v:stroke endarrow="block" joinstyle="miter"/>
                     </v:shape>
                   </w:pict>
@@ -2222,7 +4109,7 @@
               <mc:AlternateContent>
                 <mc:Choice Requires="wps">
                   <w:drawing>
-                    <wp:anchor distT="0" distB="0" distL="114300" distR="114300" simplePos="0" relativeHeight="251682816" behindDoc="0" locked="0" layoutInCell="1" allowOverlap="1" wp14:anchorId="189BDC66" wp14:editId="01DEE6A4">
+                    <wp:anchor distT="0" distB="0" distL="114300" distR="114300" simplePos="0" relativeHeight="251681792" behindDoc="0" locked="0" layoutInCell="1" allowOverlap="1" wp14:anchorId="189BDC66" wp14:editId="219CA601">
                       <wp:simplePos x="0" y="0"/>
                       <wp:positionH relativeFrom="column">
                         <wp:posOffset>3617595</wp:posOffset>
@@ -2331,7 +4218,7 @@
                 </mc:Choice>
                 <mc:Fallback>
                   <w:pict>
-                    <v:rect w14:anchorId="189BDC66" id="_x0000_s1033" style="position:absolute;left:0;text-align:left;margin-left:284.85pt;margin-top:385.75pt;width:48.15pt;height:25.5pt;z-index:251682816;visibility:visible;mso-wrap-style:square;mso-width-percent:0;mso-height-percent:0;mso-wrap-distance-left:9pt;mso-wrap-distance-top:0;mso-wrap-distance-right:9pt;mso-wrap-distance-bottom:0;mso-position-horizontal:absolute;mso-position-horizontal-relative:text;mso-position-vertical:absolute;mso-position-vertical-relative:text;mso-width-percent:0;mso-height-percent:0;mso-width-relative:margin;mso-height-relative:margin;v-text-anchor:middle" o:gfxdata="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" fillcolor="black" strokecolor="red" strokeweight="1pt">
+                    <v:rect w14:anchorId="189BDC66" id="_x0000_s1043" style="position:absolute;left:0;text-align:left;margin-left:284.85pt;margin-top:385.75pt;width:48.15pt;height:25.5pt;z-index:251681792;visibility:visible;mso-wrap-style:square;mso-width-percent:0;mso-height-percent:0;mso-wrap-distance-left:9pt;mso-wrap-distance-top:0;mso-wrap-distance-right:9pt;mso-wrap-distance-bottom:0;mso-position-horizontal:absolute;mso-position-horizontal-relative:text;mso-position-vertical:absolute;mso-position-vertical-relative:text;mso-width-percent:0;mso-height-percent:0;mso-width-relative:margin;mso-height-relative:margin;v-text-anchor:middle" o:gfxdata="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" fillcolor="black" strokecolor="red" strokeweight="1pt">
                       <v:fill opacity="39321f"/>
                       <v:textbox inset="0,0,0,0">
                         <w:txbxContent>
@@ -2385,7 +4272,7 @@
               <mc:AlternateContent>
                 <mc:Choice Requires="wps">
                   <w:drawing>
-                    <wp:anchor distT="0" distB="0" distL="114300" distR="114300" simplePos="0" relativeHeight="251684864" behindDoc="0" locked="0" layoutInCell="1" allowOverlap="1" wp14:anchorId="52C438C6" wp14:editId="5F42D102">
+                    <wp:anchor distT="0" distB="0" distL="114300" distR="114300" simplePos="0" relativeHeight="251683840" behindDoc="0" locked="0" layoutInCell="1" allowOverlap="1" wp14:anchorId="52C438C6" wp14:editId="11994643">
                       <wp:simplePos x="0" y="0"/>
                       <wp:positionH relativeFrom="column">
                         <wp:posOffset>2325370</wp:posOffset>
@@ -2510,7 +4397,7 @@
                 </mc:Choice>
                 <mc:Fallback>
                   <w:pict>
-                    <v:rect w14:anchorId="52C438C6" id="_x0000_s1034" style="position:absolute;left:0;text-align:left;margin-left:183.1pt;margin-top:385.75pt;width:48.15pt;height:25.5pt;z-index:251684864;visibility:visible;mso-wrap-style:square;mso-width-percent:0;mso-height-percent:0;mso-wrap-distance-left:9pt;mso-wrap-distance-top:0;mso-wrap-distance-right:9pt;mso-wrap-distance-bottom:0;mso-position-horizontal:absolute;mso-position-horizontal-relative:text;mso-position-vertical:absolute;mso-position-vertical-relative:text;mso-width-percent:0;mso-height-percent:0;mso-width-relative:margin;mso-height-relative:margin;v-text-anchor:middle" o:gfxdata="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" fillcolor="black" strokecolor="red" strokeweight="1pt">
+                    <v:rect w14:anchorId="52C438C6" id="_x0000_s1044" style="position:absolute;left:0;text-align:left;margin-left:183.1pt;margin-top:385.75pt;width:48.15pt;height:25.5pt;z-index:251683840;visibility:visible;mso-wrap-style:square;mso-width-percent:0;mso-height-percent:0;mso-wrap-distance-left:9pt;mso-wrap-distance-top:0;mso-wrap-distance-right:9pt;mso-wrap-distance-bottom:0;mso-position-horizontal:absolute;mso-position-horizontal-relative:text;mso-position-vertical:absolute;mso-position-vertical-relative:text;mso-width-percent:0;mso-height-percent:0;mso-width-relative:margin;mso-height-relative:margin;v-text-anchor:middle" o:gfxdata="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" fillcolor="black" strokecolor="red" strokeweight="1pt">
                       <v:fill opacity="39321f"/>
                       <v:textbox inset="0,0,0,0">
                         <w:txbxContent>
@@ -2577,797 +4464,8 @@
                 <w:sz w:val="32"/>
                 <w:szCs w:val="32"/>
               </w:rPr>
-              <mc:AlternateContent>
-                <mc:Choice Requires="wps">
-                  <w:drawing>
-                    <wp:anchor distT="0" distB="0" distL="114300" distR="114300" simplePos="0" relativeHeight="251678720" behindDoc="0" locked="0" layoutInCell="1" allowOverlap="1" wp14:anchorId="71AA84E9" wp14:editId="215912BF">
-                      <wp:simplePos x="0" y="0"/>
-                      <wp:positionH relativeFrom="column">
-                        <wp:posOffset>2567305</wp:posOffset>
-                      </wp:positionH>
-                      <wp:positionV relativeFrom="paragraph">
-                        <wp:posOffset>4323715</wp:posOffset>
-                      </wp:positionV>
-                      <wp:extent cx="431800" cy="323850"/>
-                      <wp:effectExtent l="0" t="0" r="25400" b="19050"/>
-                      <wp:wrapNone/>
-                      <wp:docPr id="777598180" name="Rectangle 1"/>
-                      <wp:cNvGraphicFramePr/>
-                      <a:graphic xmlns:a="http://schemas.openxmlformats.org/drawingml/2006/main">
-                        <a:graphicData uri="http://schemas.microsoft.com/office/word/2010/wordprocessingShape">
-                          <wps:wsp>
-                            <wps:cNvSpPr/>
-                            <wps:spPr>
-                              <a:xfrm>
-                                <a:off x="0" y="0"/>
-                                <a:ext cx="431800" cy="323850"/>
-                              </a:xfrm>
-                              <a:prstGeom prst="rect">
-                                <a:avLst/>
-                              </a:prstGeom>
-                              <a:solidFill>
-                                <a:srgbClr val="000000">
-                                  <a:alpha val="60000"/>
-                                </a:srgbClr>
-                              </a:solidFill>
-                              <a:ln w="12700">
-                                <a:solidFill>
-                                  <a:srgbClr val="FF0000"/>
-                                </a:solidFill>
-                              </a:ln>
-                            </wps:spPr>
-                            <wps:style>
-                              <a:lnRef idx="2">
-                                <a:schemeClr val="accent1">
-                                  <a:shade val="15000"/>
-                                </a:schemeClr>
-                              </a:lnRef>
-                              <a:fillRef idx="1">
-                                <a:schemeClr val="accent1"/>
-                              </a:fillRef>
-                              <a:effectRef idx="0">
-                                <a:schemeClr val="accent1"/>
-                              </a:effectRef>
-                              <a:fontRef idx="minor">
-                                <a:schemeClr val="lt1"/>
-                              </a:fontRef>
-                            </wps:style>
-                            <wps:txbx>
-                              <w:txbxContent>
-                                <w:p>
-                                  <w:pPr>
-                                    <w:spacing w:after="0" w:line="204" w:lineRule="auto"/>
-                                    <w:jc w:val="center"/>
-                                    <w:rPr>
-                                      <w:b/>
-                                      <w:bCs/>
-                                      <w:color w:val="FF0000"/>
-                                      <w:sz w:val="20"/>
-                                      <w:szCs w:val="20"/>
-                                      <w14:shadow w14:blurRad="50800" w14:dist="38100" w14:dir="2700000" w14:sx="100000" w14:sy="100000" w14:kx="0" w14:ky="0" w14:algn="tl">
-                                        <w14:srgbClr w14:val="000000">
-                                          <w14:alpha w14:val="60000"/>
-                                        </w14:srgbClr>
-                                      </w14:shadow>
-                                    </w:rPr>
-                                  </w:pPr>
-                                  <w:r>
-                                    <w:rPr>
-                                      <w:b/>
-                                      <w:bCs/>
-                                      <w:color w:val="FF0000"/>
-                                      <w:sz w:val="20"/>
-                                      <w:szCs w:val="20"/>
-                                      <w14:shadow w14:blurRad="50800" w14:dist="38100" w14:dir="2700000" w14:sx="100000" w14:sy="100000" w14:kx="0" w14:ky="0" w14:algn="tl">
-                                        <w14:srgbClr w14:val="000000">
-                                          <w14:alpha w14:val="60000"/>
-                                        </w14:srgbClr>
-                                      </w14:shadow>
-                                    </w:rPr>
-                                    <w:t>Horn Low</w:t>
-                                  </w:r>
-                                </w:p>
-                              </w:txbxContent>
-                            </wps:txbx>
-                            <wps:bodyPr rot="0" spcFirstLastPara="0" vertOverflow="overflow" horzOverflow="overflow" vert="horz" wrap="square" lIns="0" tIns="0" rIns="0" bIns="0" numCol="1" spcCol="0" rtlCol="0" fromWordArt="0" anchor="ctr" anchorCtr="0" forceAA="0" compatLnSpc="1">
-                              <a:prstTxWarp prst="textNoShape">
-                                <a:avLst/>
-                              </a:prstTxWarp>
-                              <a:noAutofit/>
-                            </wps:bodyPr>
-                          </wps:wsp>
-                        </a:graphicData>
-                      </a:graphic>
-                      <wp14:sizeRelH relativeFrom="margin">
-                        <wp14:pctWidth>0</wp14:pctWidth>
-                      </wp14:sizeRelH>
-                      <wp14:sizeRelV relativeFrom="margin">
-                        <wp14:pctHeight>0</wp14:pctHeight>
-                      </wp14:sizeRelV>
-                    </wp:anchor>
-                  </w:drawing>
-                </mc:Choice>
-                <mc:Fallback>
-                  <w:pict>
-                    <v:rect w14:anchorId="71AA84E9" id="_x0000_s1035" style="position:absolute;left:0;text-align:left;margin-left:202.15pt;margin-top:340.45pt;width:34pt;height:25.5pt;z-index:251678720;visibility:visible;mso-wrap-style:square;mso-width-percent:0;mso-height-percent:0;mso-wrap-distance-left:9pt;mso-wrap-distance-top:0;mso-wrap-distance-right:9pt;mso-wrap-distance-bottom:0;mso-position-horizontal:absolute;mso-position-horizontal-relative:text;mso-position-vertical:absolute;mso-position-vertical-relative:text;mso-width-percent:0;mso-height-percent:0;mso-width-relative:margin;mso-height-relative:margin;v-text-anchor:middle" o:gfxdata="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" fillcolor="black" strokecolor="red" strokeweight="1pt">
-                      <v:fill opacity="39321f"/>
-                      <v:textbox inset="0,0,0,0">
-                        <w:txbxContent>
-                          <w:p>
-                            <w:pPr>
-                              <w:spacing w:after="0" w:line="204" w:lineRule="auto"/>
-                              <w:jc w:val="center"/>
-                              <w:rPr>
-                                <w:b/>
-                                <w:bCs/>
-                                <w:color w:val="FF0000"/>
-                                <w:sz w:val="20"/>
-                                <w:szCs w:val="20"/>
-                                <w14:shadow w14:blurRad="50800" w14:dist="38100" w14:dir="2700000" w14:sx="100000" w14:sy="100000" w14:kx="0" w14:ky="0" w14:algn="tl">
-                                  <w14:srgbClr w14:val="000000">
-                                    <w14:alpha w14:val="60000"/>
-                                  </w14:srgbClr>
-                                </w14:shadow>
-                              </w:rPr>
-                            </w:pPr>
-                            <w:r>
-                              <w:rPr>
-                                <w:b/>
-                                <w:bCs/>
-                                <w:color w:val="FF0000"/>
-                                <w:sz w:val="20"/>
-                                <w:szCs w:val="20"/>
-                                <w14:shadow w14:blurRad="50800" w14:dist="38100" w14:dir="2700000" w14:sx="100000" w14:sy="100000" w14:kx="0" w14:ky="0" w14:algn="tl">
-                                  <w14:srgbClr w14:val="000000">
-                                    <w14:alpha w14:val="60000"/>
-                                  </w14:srgbClr>
-                                </w14:shadow>
-                              </w:rPr>
-                              <w:t>Horn Low</w:t>
-                            </w:r>
-                          </w:p>
-                        </w:txbxContent>
-                      </v:textbox>
-                    </v:rect>
-                  </w:pict>
-                </mc:Fallback>
-              </mc:AlternateContent>
-            </w:r>
-            <w:r>
-              <w:rPr>
-                <w:noProof/>
-                <w:color w:val="FFFFFF" w:themeColor="background1"/>
-                <w:sz w:val="32"/>
-                <w:szCs w:val="32"/>
-              </w:rPr>
-              <mc:AlternateContent>
-                <mc:Choice Requires="wps">
-                  <w:drawing>
-                    <wp:anchor distT="0" distB="0" distL="114300" distR="114300" simplePos="0" relativeHeight="251686912" behindDoc="0" locked="0" layoutInCell="1" allowOverlap="1" wp14:anchorId="5A88F8DE" wp14:editId="7130EBC5">
-                      <wp:simplePos x="0" y="0"/>
-                      <wp:positionH relativeFrom="column">
-                        <wp:posOffset>3576320</wp:posOffset>
-                      </wp:positionH>
-                      <wp:positionV relativeFrom="paragraph">
-                        <wp:posOffset>4324350</wp:posOffset>
-                      </wp:positionV>
-                      <wp:extent cx="431800" cy="323850"/>
-                      <wp:effectExtent l="0" t="0" r="25400" b="19050"/>
-                      <wp:wrapNone/>
-                      <wp:docPr id="42527342" name="Rectangle 1"/>
-                      <wp:cNvGraphicFramePr/>
-                      <a:graphic xmlns:a="http://schemas.openxmlformats.org/drawingml/2006/main">
-                        <a:graphicData uri="http://schemas.microsoft.com/office/word/2010/wordprocessingShape">
-                          <wps:wsp>
-                            <wps:cNvSpPr/>
-                            <wps:spPr>
-                              <a:xfrm>
-                                <a:off x="0" y="0"/>
-                                <a:ext cx="431800" cy="323850"/>
-                              </a:xfrm>
-                              <a:prstGeom prst="rect">
-                                <a:avLst/>
-                              </a:prstGeom>
-                              <a:solidFill>
-                                <a:srgbClr val="000000">
-                                  <a:alpha val="60000"/>
-                                </a:srgbClr>
-                              </a:solidFill>
-                              <a:ln w="12700">
-                                <a:solidFill>
-                                  <a:srgbClr val="FF0000"/>
-                                </a:solidFill>
-                              </a:ln>
-                            </wps:spPr>
-                            <wps:style>
-                              <a:lnRef idx="2">
-                                <a:schemeClr val="accent1">
-                                  <a:shade val="15000"/>
-                                </a:schemeClr>
-                              </a:lnRef>
-                              <a:fillRef idx="1">
-                                <a:schemeClr val="accent1"/>
-                              </a:fillRef>
-                              <a:effectRef idx="0">
-                                <a:schemeClr val="accent1"/>
-                              </a:effectRef>
-                              <a:fontRef idx="minor">
-                                <a:schemeClr val="lt1"/>
-                              </a:fontRef>
-                            </wps:style>
-                            <wps:txbx>
-                              <w:txbxContent>
-                                <w:p>
-                                  <w:pPr>
-                                    <w:spacing w:after="0" w:line="204" w:lineRule="auto"/>
-                                    <w:jc w:val="center"/>
-                                    <w:rPr>
-                                      <w:b/>
-                                      <w:bCs/>
-                                      <w:color w:val="FF0000"/>
-                                      <w:sz w:val="20"/>
-                                      <w:szCs w:val="20"/>
-                                      <w14:shadow w14:blurRad="50800" w14:dist="38100" w14:dir="2700000" w14:sx="100000" w14:sy="100000" w14:kx="0" w14:ky="0" w14:algn="tl">
-                                        <w14:srgbClr w14:val="000000">
-                                          <w14:alpha w14:val="60000"/>
-                                        </w14:srgbClr>
-                                      </w14:shadow>
-                                    </w:rPr>
-                                  </w:pPr>
-                                  <w:r>
-                                    <w:rPr>
-                                      <w:b/>
-                                      <w:bCs/>
-                                      <w:color w:val="FF0000"/>
-                                      <w:sz w:val="20"/>
-                                      <w:szCs w:val="20"/>
-                                      <w14:shadow w14:blurRad="50800" w14:dist="38100" w14:dir="2700000" w14:sx="100000" w14:sy="100000" w14:kx="0" w14:ky="0" w14:algn="tl">
-                                        <w14:srgbClr w14:val="000000">
-                                          <w14:alpha w14:val="60000"/>
-                                        </w14:srgbClr>
-                                      </w14:shadow>
-                                    </w:rPr>
-                                    <w:t>Horn High</w:t>
-                                  </w:r>
-                                </w:p>
-                              </w:txbxContent>
-                            </wps:txbx>
-                            <wps:bodyPr rot="0" spcFirstLastPara="0" vertOverflow="overflow" horzOverflow="overflow" vert="horz" wrap="square" lIns="0" tIns="0" rIns="0" bIns="0" numCol="1" spcCol="0" rtlCol="0" fromWordArt="0" anchor="ctr" anchorCtr="0" forceAA="0" compatLnSpc="1">
-                              <a:prstTxWarp prst="textNoShape">
-                                <a:avLst/>
-                              </a:prstTxWarp>
-                              <a:noAutofit/>
-                            </wps:bodyPr>
-                          </wps:wsp>
-                        </a:graphicData>
-                      </a:graphic>
-                      <wp14:sizeRelH relativeFrom="margin">
-                        <wp14:pctWidth>0</wp14:pctWidth>
-                      </wp14:sizeRelH>
-                      <wp14:sizeRelV relativeFrom="margin">
-                        <wp14:pctHeight>0</wp14:pctHeight>
-                      </wp14:sizeRelV>
-                    </wp:anchor>
-                  </w:drawing>
-                </mc:Choice>
-                <mc:Fallback>
-                  <w:pict>
-                    <v:rect w14:anchorId="5A88F8DE" id="_x0000_s1036" style="position:absolute;left:0;text-align:left;margin-left:281.6pt;margin-top:340.5pt;width:34pt;height:25.5pt;z-index:251686912;visibility:visible;mso-wrap-style:square;mso-width-percent:0;mso-height-percent:0;mso-wrap-distance-left:9pt;mso-wrap-distance-top:0;mso-wrap-distance-right:9pt;mso-wrap-distance-bottom:0;mso-position-horizontal:absolute;mso-position-horizontal-relative:text;mso-position-vertical:absolute;mso-position-vertical-relative:text;mso-width-percent:0;mso-height-percent:0;mso-width-relative:margin;mso-height-relative:margin;v-text-anchor:middle" o:gfxdata="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" fillcolor="black" strokecolor="red" strokeweight="1pt">
-                      <v:fill opacity="39321f"/>
-                      <v:textbox inset="0,0,0,0">
-                        <w:txbxContent>
-                          <w:p>
-                            <w:pPr>
-                              <w:spacing w:after="0" w:line="204" w:lineRule="auto"/>
-                              <w:jc w:val="center"/>
-                              <w:rPr>
-                                <w:b/>
-                                <w:bCs/>
-                                <w:color w:val="FF0000"/>
-                                <w:sz w:val="20"/>
-                                <w:szCs w:val="20"/>
-                                <w14:shadow w14:blurRad="50800" w14:dist="38100" w14:dir="2700000" w14:sx="100000" w14:sy="100000" w14:kx="0" w14:ky="0" w14:algn="tl">
-                                  <w14:srgbClr w14:val="000000">
-                                    <w14:alpha w14:val="60000"/>
-                                  </w14:srgbClr>
-                                </w14:shadow>
-                              </w:rPr>
-                            </w:pPr>
-                            <w:r>
-                              <w:rPr>
-                                <w:b/>
-                                <w:bCs/>
-                                <w:color w:val="FF0000"/>
-                                <w:sz w:val="20"/>
-                                <w:szCs w:val="20"/>
-                                <w14:shadow w14:blurRad="50800" w14:dist="38100" w14:dir="2700000" w14:sx="100000" w14:sy="100000" w14:kx="0" w14:ky="0" w14:algn="tl">
-                                  <w14:srgbClr w14:val="000000">
-                                    <w14:alpha w14:val="60000"/>
-                                  </w14:srgbClr>
-                                </w14:shadow>
-                              </w:rPr>
-                              <w:t>Horn High</w:t>
-                            </w:r>
-                          </w:p>
-                        </w:txbxContent>
-                      </v:textbox>
-                    </v:rect>
-                  </w:pict>
-                </mc:Fallback>
-              </mc:AlternateContent>
-            </w:r>
-            <w:r>
-              <w:rPr>
-                <w:noProof/>
-                <w:color w:val="FFFFFF" w:themeColor="background1"/>
-                <w:sz w:val="32"/>
-                <w:szCs w:val="32"/>
-              </w:rPr>
-              <mc:AlternateContent>
-                <mc:Choice Requires="wps">
-                  <w:drawing>
-                    <wp:anchor distT="0" distB="0" distL="114300" distR="114300" simplePos="0" relativeHeight="251673600" behindDoc="0" locked="0" layoutInCell="1" allowOverlap="1" wp14:anchorId="6F9D1902" wp14:editId="7CD1E238">
-                      <wp:simplePos x="0" y="0"/>
-                      <wp:positionH relativeFrom="column">
-                        <wp:posOffset>3553460</wp:posOffset>
-                      </wp:positionH>
-                      <wp:positionV relativeFrom="paragraph">
-                        <wp:posOffset>1667510</wp:posOffset>
-                      </wp:positionV>
-                      <wp:extent cx="611505" cy="215900"/>
-                      <wp:effectExtent l="0" t="0" r="17145" b="12700"/>
-                      <wp:wrapNone/>
-                      <wp:docPr id="1542962977" name="Rectangle 1"/>
-                      <wp:cNvGraphicFramePr/>
-                      <a:graphic xmlns:a="http://schemas.openxmlformats.org/drawingml/2006/main">
-                        <a:graphicData uri="http://schemas.microsoft.com/office/word/2010/wordprocessingShape">
-                          <wps:wsp>
-                            <wps:cNvSpPr/>
-                            <wps:spPr>
-                              <a:xfrm>
-                                <a:off x="0" y="0"/>
-                                <a:ext cx="611505" cy="215900"/>
-                              </a:xfrm>
-                              <a:prstGeom prst="rect">
-                                <a:avLst/>
-                              </a:prstGeom>
-                              <a:solidFill>
-                                <a:srgbClr val="000000">
-                                  <a:alpha val="60000"/>
-                                </a:srgbClr>
-                              </a:solidFill>
-                              <a:ln w="12700" cap="flat" cmpd="sng" algn="ctr">
-                                <a:solidFill>
-                                  <a:srgbClr val="FF0000"/>
-                                </a:solidFill>
-                                <a:prstDash val="solid"/>
-                                <a:miter lim="800000"/>
-                              </a:ln>
-                              <a:effectLst/>
-                            </wps:spPr>
-                            <wps:txbx>
-                              <w:txbxContent>
-                                <w:p>
-                                  <w:pPr>
-                                    <w:spacing w:after="0"/>
-                                    <w:jc w:val="center"/>
-                                    <w:rPr>
-                                      <w:b/>
-                                      <w:bCs/>
-                                      <w:color w:val="FF0000"/>
-                                      <w:sz w:val="20"/>
-                                      <w:szCs w:val="20"/>
-                                      <w14:shadow w14:blurRad="50800" w14:dist="38100" w14:dir="2700000" w14:sx="100000" w14:sy="100000" w14:kx="0" w14:ky="0" w14:algn="tl">
-                                        <w14:srgbClr w14:val="000000">
-                                          <w14:alpha w14:val="60000"/>
-                                        </w14:srgbClr>
-                                      </w14:shadow>
-                                    </w:rPr>
-                                  </w:pPr>
-                                  <w:r>
-                                    <w:rPr>
-                                      <w:b/>
-                                      <w:bCs/>
-                                      <w:color w:val="FF0000"/>
-                                      <w:sz w:val="20"/>
-                                      <w:szCs w:val="20"/>
-                                      <w14:shadow w14:blurRad="50800" w14:dist="38100" w14:dir="2700000" w14:sx="100000" w14:sy="100000" w14:kx="0" w14:ky="0" w14:algn="tl">
-                                        <w14:srgbClr w14:val="000000">
-                                          <w14:alpha w14:val="60000"/>
-                                        </w14:srgbClr>
-                                      </w14:shadow>
-                                    </w:rPr>
-                                    <w:t>Brake</w:t>
-                                  </w:r>
-                                </w:p>
-                              </w:txbxContent>
-                            </wps:txbx>
-                            <wps:bodyPr rot="0" spcFirstLastPara="0" vertOverflow="overflow" horzOverflow="overflow" vert="horz" wrap="square" lIns="0" tIns="0" rIns="0" bIns="0" numCol="1" spcCol="0" rtlCol="0" fromWordArt="0" anchor="ctr" anchorCtr="0" forceAA="0" compatLnSpc="1">
-                              <a:prstTxWarp prst="textNoShape">
-                                <a:avLst/>
-                              </a:prstTxWarp>
-                              <a:noAutofit/>
-                            </wps:bodyPr>
-                          </wps:wsp>
-                        </a:graphicData>
-                      </a:graphic>
-                      <wp14:sizeRelH relativeFrom="margin">
-                        <wp14:pctWidth>0</wp14:pctWidth>
-                      </wp14:sizeRelH>
-                      <wp14:sizeRelV relativeFrom="margin">
-                        <wp14:pctHeight>0</wp14:pctHeight>
-                      </wp14:sizeRelV>
-                    </wp:anchor>
-                  </w:drawing>
-                </mc:Choice>
-                <mc:Fallback>
-                  <w:pict>
-                    <v:rect w14:anchorId="6F9D1902" id="_x0000_s1037" style="position:absolute;left:0;text-align:left;margin-left:279.8pt;margin-top:131.3pt;width:48.15pt;height:17pt;z-index:251673600;visibility:visible;mso-wrap-style:square;mso-width-percent:0;mso-height-percent:0;mso-wrap-distance-left:9pt;mso-wrap-distance-top:0;mso-wrap-distance-right:9pt;mso-wrap-distance-bottom:0;mso-position-horizontal:absolute;mso-position-horizontal-relative:text;mso-position-vertical:absolute;mso-position-vertical-relative:text;mso-width-percent:0;mso-height-percent:0;mso-width-relative:margin;mso-height-relative:margin;v-text-anchor:middle" o:gfxdata="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" fillcolor="black" strokecolor="red" strokeweight="1pt">
-                      <v:fill opacity="39321f"/>
-                      <v:textbox inset="0,0,0,0">
-                        <w:txbxContent>
-                          <w:p>
-                            <w:pPr>
-                              <w:spacing w:after="0"/>
-                              <w:jc w:val="center"/>
-                              <w:rPr>
-                                <w:b/>
-                                <w:bCs/>
-                                <w:color w:val="FF0000"/>
-                                <w:sz w:val="20"/>
-                                <w:szCs w:val="20"/>
-                                <w14:shadow w14:blurRad="50800" w14:dist="38100" w14:dir="2700000" w14:sx="100000" w14:sy="100000" w14:kx="0" w14:ky="0" w14:algn="tl">
-                                  <w14:srgbClr w14:val="000000">
-                                    <w14:alpha w14:val="60000"/>
-                                  </w14:srgbClr>
-                                </w14:shadow>
-                              </w:rPr>
-                            </w:pPr>
-                            <w:r>
-                              <w:rPr>
-                                <w:b/>
-                                <w:bCs/>
-                                <w:color w:val="FF0000"/>
-                                <w:sz w:val="20"/>
-                                <w:szCs w:val="20"/>
-                                <w14:shadow w14:blurRad="50800" w14:dist="38100" w14:dir="2700000" w14:sx="100000" w14:sy="100000" w14:kx="0" w14:ky="0" w14:algn="tl">
-                                  <w14:srgbClr w14:val="000000">
-                                    <w14:alpha w14:val="60000"/>
-                                  </w14:srgbClr>
-                                </w14:shadow>
-                              </w:rPr>
-                              <w:t>Brake</w:t>
-                            </w:r>
-                          </w:p>
-                        </w:txbxContent>
-                      </v:textbox>
-                    </v:rect>
-                  </w:pict>
-                </mc:Fallback>
-              </mc:AlternateContent>
-            </w:r>
-            <w:r>
-              <w:rPr>
-                <w:noProof/>
-                <w:color w:val="FFFFFF" w:themeColor="background1"/>
-                <w:sz w:val="32"/>
-                <w:szCs w:val="32"/>
-              </w:rPr>
-              <mc:AlternateContent>
-                <mc:Choice Requires="wps">
-                  <w:drawing>
-                    <wp:anchor distT="0" distB="0" distL="114300" distR="114300" simplePos="0" relativeHeight="251671552" behindDoc="0" locked="0" layoutInCell="1" allowOverlap="1" wp14:anchorId="39CCF745" wp14:editId="1AE06FB6">
-                      <wp:simplePos x="0" y="0"/>
-                      <wp:positionH relativeFrom="column">
-                        <wp:posOffset>2514600</wp:posOffset>
-                      </wp:positionH>
-                      <wp:positionV relativeFrom="paragraph">
-                        <wp:posOffset>1667510</wp:posOffset>
-                      </wp:positionV>
-                      <wp:extent cx="611505" cy="215900"/>
-                      <wp:effectExtent l="0" t="0" r="17145" b="12700"/>
-                      <wp:wrapNone/>
-                      <wp:docPr id="2062025466" name="Rectangle 1"/>
-                      <wp:cNvGraphicFramePr/>
-                      <a:graphic xmlns:a="http://schemas.openxmlformats.org/drawingml/2006/main">
-                        <a:graphicData uri="http://schemas.microsoft.com/office/word/2010/wordprocessingShape">
-                          <wps:wsp>
-                            <wps:cNvSpPr/>
-                            <wps:spPr>
-                              <a:xfrm>
-                                <a:off x="0" y="0"/>
-                                <a:ext cx="611505" cy="215900"/>
-                              </a:xfrm>
-                              <a:prstGeom prst="rect">
-                                <a:avLst/>
-                              </a:prstGeom>
-                              <a:solidFill>
-                                <a:srgbClr val="000000">
-                                  <a:alpha val="60000"/>
-                                </a:srgbClr>
-                              </a:solidFill>
-                              <a:ln w="12700" cap="flat" cmpd="sng" algn="ctr">
-                                <a:solidFill>
-                                  <a:srgbClr val="FF0000"/>
-                                </a:solidFill>
-                                <a:prstDash val="solid"/>
-                                <a:miter lim="800000"/>
-                              </a:ln>
-                              <a:effectLst/>
-                            </wps:spPr>
-                            <wps:txbx>
-                              <w:txbxContent>
-                                <w:p>
-                                  <w:pPr>
-                                    <w:spacing w:after="0"/>
-                                    <w:jc w:val="center"/>
-                                    <w:rPr>
-                                      <w:b/>
-                                      <w:bCs/>
-                                      <w:color w:val="FF0000"/>
-                                      <w:sz w:val="20"/>
-                                      <w:szCs w:val="20"/>
-                                      <w14:shadow w14:blurRad="50800" w14:dist="38100" w14:dir="2700000" w14:sx="100000" w14:sy="100000" w14:kx="0" w14:ky="0" w14:algn="tl">
-                                        <w14:srgbClr w14:val="000000">
-                                          <w14:alpha w14:val="60000"/>
-                                        </w14:srgbClr>
-                                      </w14:shadow>
-                                    </w:rPr>
-                                  </w:pPr>
-                                  <w:r>
-                                    <w:rPr>
-                                      <w:b/>
-                                      <w:bCs/>
-                                      <w:color w:val="FF0000"/>
-                                      <w:sz w:val="20"/>
-                                      <w:szCs w:val="20"/>
-                                      <w14:shadow w14:blurRad="50800" w14:dist="38100" w14:dir="2700000" w14:sx="100000" w14:sy="100000" w14:kx="0" w14:ky="0" w14:algn="tl">
-                                        <w14:srgbClr w14:val="000000">
-                                          <w14:alpha w14:val="60000"/>
-                                        </w14:srgbClr>
-                                      </w14:shadow>
-                                    </w:rPr>
-                                    <w:t>Throttle</w:t>
-                                  </w:r>
-                                </w:p>
-                              </w:txbxContent>
-                            </wps:txbx>
-                            <wps:bodyPr rot="0" spcFirstLastPara="0" vertOverflow="overflow" horzOverflow="overflow" vert="horz" wrap="square" lIns="0" tIns="0" rIns="0" bIns="0" numCol="1" spcCol="0" rtlCol="0" fromWordArt="0" anchor="ctr" anchorCtr="0" forceAA="0" compatLnSpc="1">
-                              <a:prstTxWarp prst="textNoShape">
-                                <a:avLst/>
-                              </a:prstTxWarp>
-                              <a:noAutofit/>
-                            </wps:bodyPr>
-                          </wps:wsp>
-                        </a:graphicData>
-                      </a:graphic>
-                      <wp14:sizeRelH relativeFrom="margin">
-                        <wp14:pctWidth>0</wp14:pctWidth>
-                      </wp14:sizeRelH>
-                      <wp14:sizeRelV relativeFrom="margin">
-                        <wp14:pctHeight>0</wp14:pctHeight>
-                      </wp14:sizeRelV>
-                    </wp:anchor>
-                  </w:drawing>
-                </mc:Choice>
-                <mc:Fallback>
-                  <w:pict>
-                    <v:rect w14:anchorId="39CCF745" id="_x0000_s1038" style="position:absolute;left:0;text-align:left;margin-left:198pt;margin-top:131.3pt;width:48.15pt;height:17pt;z-index:251671552;visibility:visible;mso-wrap-style:square;mso-width-percent:0;mso-height-percent:0;mso-wrap-distance-left:9pt;mso-wrap-distance-top:0;mso-wrap-distance-right:9pt;mso-wrap-distance-bottom:0;mso-position-horizontal:absolute;mso-position-horizontal-relative:text;mso-position-vertical:absolute;mso-position-vertical-relative:text;mso-width-percent:0;mso-height-percent:0;mso-width-relative:margin;mso-height-relative:margin;v-text-anchor:middle" o:gfxdata="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" fillcolor="black" strokecolor="red" strokeweight="1pt">
-                      <v:fill opacity="39321f"/>
-                      <v:textbox inset="0,0,0,0">
-                        <w:txbxContent>
-                          <w:p>
-                            <w:pPr>
-                              <w:spacing w:after="0"/>
-                              <w:jc w:val="center"/>
-                              <w:rPr>
-                                <w:b/>
-                                <w:bCs/>
-                                <w:color w:val="FF0000"/>
-                                <w:sz w:val="20"/>
-                                <w:szCs w:val="20"/>
-                                <w14:shadow w14:blurRad="50800" w14:dist="38100" w14:dir="2700000" w14:sx="100000" w14:sy="100000" w14:kx="0" w14:ky="0" w14:algn="tl">
-                                  <w14:srgbClr w14:val="000000">
-                                    <w14:alpha w14:val="60000"/>
-                                  </w14:srgbClr>
-                                </w14:shadow>
-                              </w:rPr>
-                            </w:pPr>
-                            <w:r>
-                              <w:rPr>
-                                <w:b/>
-                                <w:bCs/>
-                                <w:color w:val="FF0000"/>
-                                <w:sz w:val="20"/>
-                                <w:szCs w:val="20"/>
-                                <w14:shadow w14:blurRad="50800" w14:dist="38100" w14:dir="2700000" w14:sx="100000" w14:sy="100000" w14:kx="0" w14:ky="0" w14:algn="tl">
-                                  <w14:srgbClr w14:val="000000">
-                                    <w14:alpha w14:val="60000"/>
-                                  </w14:srgbClr>
-                                </w14:shadow>
-                              </w:rPr>
-                              <w:t>Throttle</w:t>
-                            </w:r>
-                          </w:p>
-                        </w:txbxContent>
-                      </v:textbox>
-                    </v:rect>
-                  </w:pict>
-                </mc:Fallback>
-              </mc:AlternateContent>
-            </w:r>
-            <w:r>
-              <w:rPr>
-                <w:noProof/>
-                <w:color w:val="FFFFFF" w:themeColor="background1"/>
-                <w:sz w:val="32"/>
-                <w:szCs w:val="32"/>
-              </w:rPr>
-              <mc:AlternateContent>
-                <mc:Choice Requires="wps">
-                  <w:drawing>
-                    <wp:anchor distT="0" distB="0" distL="114300" distR="114300" simplePos="0" relativeHeight="251669504" behindDoc="0" locked="0" layoutInCell="1" allowOverlap="1" wp14:anchorId="0B986780" wp14:editId="2F2A6C37">
-                      <wp:simplePos x="0" y="0"/>
-                      <wp:positionH relativeFrom="column">
-                        <wp:posOffset>1351280</wp:posOffset>
-                      </wp:positionH>
-                      <wp:positionV relativeFrom="paragraph">
-                        <wp:posOffset>1667510</wp:posOffset>
-                      </wp:positionV>
-                      <wp:extent cx="611505" cy="215900"/>
-                      <wp:effectExtent l="0" t="0" r="17145" b="12700"/>
-                      <wp:wrapNone/>
-                      <wp:docPr id="397081854" name="Rectangle 1"/>
-                      <wp:cNvGraphicFramePr/>
-                      <a:graphic xmlns:a="http://schemas.openxmlformats.org/drawingml/2006/main">
-                        <a:graphicData uri="http://schemas.microsoft.com/office/word/2010/wordprocessingShape">
-                          <wps:wsp>
-                            <wps:cNvSpPr/>
-                            <wps:spPr>
-                              <a:xfrm>
-                                <a:off x="0" y="0"/>
-                                <a:ext cx="611505" cy="215900"/>
-                              </a:xfrm>
-                              <a:prstGeom prst="rect">
-                                <a:avLst/>
-                              </a:prstGeom>
-                              <a:solidFill>
-                                <a:srgbClr val="000000">
-                                  <a:alpha val="60000"/>
-                                </a:srgbClr>
-                              </a:solidFill>
-                              <a:ln w="12700">
-                                <a:solidFill>
-                                  <a:srgbClr val="FF0000"/>
-                                </a:solidFill>
-                              </a:ln>
-                            </wps:spPr>
-                            <wps:style>
-                              <a:lnRef idx="2">
-                                <a:schemeClr val="accent1">
-                                  <a:shade val="15000"/>
-                                </a:schemeClr>
-                              </a:lnRef>
-                              <a:fillRef idx="1">
-                                <a:schemeClr val="accent1"/>
-                              </a:fillRef>
-                              <a:effectRef idx="0">
-                                <a:schemeClr val="accent1"/>
-                              </a:effectRef>
-                              <a:fontRef idx="minor">
-                                <a:schemeClr val="lt1"/>
-                              </a:fontRef>
-                            </wps:style>
-                            <wps:txbx>
-                              <w:txbxContent>
-                                <w:p>
-                                  <w:pPr>
-                                    <w:spacing w:after="0"/>
-                                    <w:jc w:val="center"/>
-                                    <w:rPr>
-                                      <w:b/>
-                                      <w:bCs/>
-                                      <w:color w:val="FF0000"/>
-                                      <w:sz w:val="20"/>
-                                      <w:szCs w:val="20"/>
-                                      <w14:shadow w14:blurRad="50800" w14:dist="38100" w14:dir="2700000" w14:sx="100000" w14:sy="100000" w14:kx="0" w14:ky="0" w14:algn="tl">
-                                        <w14:srgbClr w14:val="000000">
-                                          <w14:alpha w14:val="60000"/>
-                                        </w14:srgbClr>
-                                      </w14:shadow>
-                                    </w:rPr>
-                                  </w:pPr>
-                                  <w:r>
-                                    <w:rPr>
-                                      <w:b/>
-                                      <w:bCs/>
-                                      <w:color w:val="FF0000"/>
-                                      <w:sz w:val="20"/>
-                                      <w:szCs w:val="20"/>
-                                      <w14:shadow w14:blurRad="50800" w14:dist="38100" w14:dir="2700000" w14:sx="100000" w14:sy="100000" w14:kx="0" w14:ky="0" w14:algn="tl">
-                                        <w14:srgbClr w14:val="000000">
-                                          <w14:alpha w14:val="60000"/>
-                                        </w14:srgbClr>
-                                      </w14:shadow>
-                                    </w:rPr>
-                                    <w:t>Reverser</w:t>
-                                  </w:r>
-                                </w:p>
-                              </w:txbxContent>
-                            </wps:txbx>
-                            <wps:bodyPr rot="0" spcFirstLastPara="0" vertOverflow="overflow" horzOverflow="overflow" vert="horz" wrap="square" lIns="0" tIns="0" rIns="0" bIns="0" numCol="1" spcCol="0" rtlCol="0" fromWordArt="0" anchor="ctr" anchorCtr="0" forceAA="0" compatLnSpc="1">
-                              <a:prstTxWarp prst="textNoShape">
-                                <a:avLst/>
-                              </a:prstTxWarp>
-                              <a:noAutofit/>
-                            </wps:bodyPr>
-                          </wps:wsp>
-                        </a:graphicData>
-                      </a:graphic>
-                      <wp14:sizeRelH relativeFrom="margin">
-                        <wp14:pctWidth>0</wp14:pctWidth>
-                      </wp14:sizeRelH>
-                      <wp14:sizeRelV relativeFrom="margin">
-                        <wp14:pctHeight>0</wp14:pctHeight>
-                      </wp14:sizeRelV>
-                    </wp:anchor>
-                  </w:drawing>
-                </mc:Choice>
-                <mc:Fallback>
-                  <w:pict>
-                    <v:rect w14:anchorId="0B986780" id="_x0000_s1039" style="position:absolute;left:0;text-align:left;margin-left:106.4pt;margin-top:131.3pt;width:48.15pt;height:17pt;z-index:251669504;visibility:visible;mso-wrap-style:square;mso-width-percent:0;mso-height-percent:0;mso-wrap-distance-left:9pt;mso-wrap-distance-top:0;mso-wrap-distance-right:9pt;mso-wrap-distance-bottom:0;mso-position-horizontal:absolute;mso-position-horizontal-relative:text;mso-position-vertical:absolute;mso-position-vertical-relative:text;mso-width-percent:0;mso-height-percent:0;mso-width-relative:margin;mso-height-relative:margin;v-text-anchor:middle" o:gfxdata="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" fillcolor="black" strokecolor="red" strokeweight="1pt">
-                      <v:fill opacity="39321f"/>
-                      <v:textbox inset="0,0,0,0">
-                        <w:txbxContent>
-                          <w:p>
-                            <w:pPr>
-                              <w:spacing w:after="0"/>
-                              <w:jc w:val="center"/>
-                              <w:rPr>
-                                <w:b/>
-                                <w:bCs/>
-                                <w:color w:val="FF0000"/>
-                                <w:sz w:val="20"/>
-                                <w:szCs w:val="20"/>
-                                <w14:shadow w14:blurRad="50800" w14:dist="38100" w14:dir="2700000" w14:sx="100000" w14:sy="100000" w14:kx="0" w14:ky="0" w14:algn="tl">
-                                  <w14:srgbClr w14:val="000000">
-                                    <w14:alpha w14:val="60000"/>
-                                  </w14:srgbClr>
-                                </w14:shadow>
-                              </w:rPr>
-                            </w:pPr>
-                            <w:r>
-                              <w:rPr>
-                                <w:b/>
-                                <w:bCs/>
-                                <w:color w:val="FF0000"/>
-                                <w:sz w:val="20"/>
-                                <w:szCs w:val="20"/>
-                                <w14:shadow w14:blurRad="50800" w14:dist="38100" w14:dir="2700000" w14:sx="100000" w14:sy="100000" w14:kx="0" w14:ky="0" w14:algn="tl">
-                                  <w14:srgbClr w14:val="000000">
-                                    <w14:alpha w14:val="60000"/>
-                                  </w14:srgbClr>
-                                </w14:shadow>
-                              </w:rPr>
-                              <w:t>Reverser</w:t>
-                            </w:r>
-                          </w:p>
-                        </w:txbxContent>
-                      </v:textbox>
-                    </v:rect>
-                  </w:pict>
-                </mc:Fallback>
-              </mc:AlternateContent>
-            </w:r>
-            <w:r>
-              <w:rPr>
-                <w:noProof/>
-                <w:color w:val="FFFFFF" w:themeColor="background1"/>
-                <w:sz w:val="32"/>
-                <w:szCs w:val="32"/>
-              </w:rPr>
               <w:drawing>
-                <wp:inline distT="0" distB="0" distL="0" distR="0" wp14:anchorId="47FD71C7" wp14:editId="71EA760D">
+                <wp:inline distT="0" distB="0" distL="0" distR="0" wp14:anchorId="47FD71C7" wp14:editId="1B2E0364">
                   <wp:extent cx="4975906" cy="5987632"/>
                   <wp:effectExtent l="0" t="0" r="0" b="0"/>
                   <wp:docPr id="1388703815" name="Picture 1"/>
@@ -3481,7 +4579,7 @@
         <mc:AlternateContent>
           <mc:Choice Requires="wps">
             <w:drawing>
-              <wp:anchor distT="0" distB="0" distL="114300" distR="114300" simplePos="0" relativeHeight="251666432" behindDoc="1" locked="0" layoutInCell="1" allowOverlap="1" wp14:anchorId="32174439" wp14:editId="4140C947">
+              <wp:anchor distT="0" distB="0" distL="114300" distR="114300" simplePos="0" relativeHeight="251665408" behindDoc="1" locked="0" layoutInCell="1" allowOverlap="1" wp14:anchorId="32174439" wp14:editId="4B9E0427">
                 <wp:simplePos x="0" y="0"/>
                 <wp:positionH relativeFrom="page">
                   <wp:align>left</wp:align>
@@ -3569,7 +4667,7 @@
           </mc:Choice>
           <mc:Fallback>
             <w:pict>
-              <v:rect w14:anchorId="5D7B285E" id="Rectangle 3" o:spid="_x0000_s1026" style="position:absolute;margin-left:0;margin-top:0;width:594.95pt;height:693pt;z-index:-251650048;visibility:visible;mso-wrap-style:square;mso-width-percent:0;mso-height-percent:0;mso-wrap-distance-left:9pt;mso-wrap-distance-top:0;mso-wrap-distance-right:9pt;mso-wrap-distance-bottom:0;mso-position-horizontal:left;mso-position-horizontal-relative:page;mso-position-vertical:top;mso-position-vertical-relative:page;mso-width-percent:0;mso-height-percent:0;mso-width-relative:margin;mso-height-relative:margin;v-text-anchor:middle" o:gfxdata="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" fillcolor="#fc3" stroked="f" strokeweight="1.5pt">
+              <v:rect w14:anchorId="33E2700F" id="Rectangle 3" o:spid="_x0000_s1026" style="position:absolute;margin-left:0;margin-top:0;width:594.95pt;height:693pt;z-index:-251651072;visibility:visible;mso-wrap-style:square;mso-width-percent:0;mso-height-percent:0;mso-wrap-distance-left:9pt;mso-wrap-distance-top:0;mso-wrap-distance-right:9pt;mso-wrap-distance-bottom:0;mso-position-horizontal:left;mso-position-horizontal-relative:page;mso-position-vertical:top;mso-position-vertical-relative:page;mso-width-percent:0;mso-height-percent:0;mso-width-relative:margin;mso-height-relative:margin;v-text-anchor:middle" o:gfxdata="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" fillcolor="#fc3" stroked="f" strokeweight="1.5pt">
                 <v:fill color2="#003082" colors="0 #fc3;7864f #fc3;9830f white;19661f white;58982f #003082;1 #003082" focus="100%" type="gradient"/>
                 <w10:wrap anchorx="page" anchory="page"/>
               </v:rect>
@@ -3690,6 +4788,34 @@
                 <w:sz w:val="28"/>
                 <w:szCs w:val="28"/>
               </w:rPr>
+              <w:t>Open doors</w:t>
+            </w:r>
+          </w:p>
+          <w:p>
+            <w:pPr>
+              <w:pStyle w:val="ListParagraph"/>
+              <w:numPr>
+                <w:ilvl w:val="0"/>
+                <w:numId w:val="2"/>
+              </w:numPr>
+              <w:rPr>
+                <w:rFonts w:asciiTheme="majorHAnsi" w:hAnsiTheme="majorHAnsi"/>
+                <w:b/>
+                <w:bCs/>
+                <w:color w:val="FFFFFF" w:themeColor="background1"/>
+                <w:sz w:val="28"/>
+                <w:szCs w:val="28"/>
+              </w:rPr>
+            </w:pPr>
+            <w:r>
+              <w:rPr>
+                <w:rFonts w:asciiTheme="majorHAnsi" w:hAnsiTheme="majorHAnsi"/>
+                <w:b/>
+                <w:bCs/>
+                <w:color w:val="FFFFFF" w:themeColor="background1"/>
+                <w:sz w:val="28"/>
+                <w:szCs w:val="28"/>
+              </w:rPr>
               <w:t>Set headlights</w:t>
             </w:r>
           </w:p>
@@ -3720,6 +4846,45 @@
               </w:rPr>
               <w:t>Set destination</w:t>
             </w:r>
+            <w:r>
+              <w:rPr>
+                <w:rFonts w:asciiTheme="majorHAnsi" w:hAnsiTheme="majorHAnsi"/>
+                <w:b/>
+                <w:bCs/>
+                <w:color w:val="FFFFFF" w:themeColor="background1"/>
+                <w:sz w:val="28"/>
+                <w:szCs w:val="28"/>
+              </w:rPr>
+              <w:t xml:space="preserve"> board</w:t>
+            </w:r>
+          </w:p>
+          <w:p>
+            <w:pPr>
+              <w:pStyle w:val="ListParagraph"/>
+              <w:numPr>
+                <w:ilvl w:val="0"/>
+                <w:numId w:val="2"/>
+              </w:numPr>
+              <w:rPr>
+                <w:rFonts w:asciiTheme="majorHAnsi" w:hAnsiTheme="majorHAnsi"/>
+                <w:b/>
+                <w:bCs/>
+                <w:color w:val="FFFFFF" w:themeColor="background1"/>
+                <w:sz w:val="28"/>
+                <w:szCs w:val="28"/>
+              </w:rPr>
+            </w:pPr>
+            <w:r>
+              <w:rPr>
+                <w:rFonts w:asciiTheme="majorHAnsi" w:hAnsiTheme="majorHAnsi"/>
+                <w:b/>
+                <w:bCs/>
+                <w:color w:val="FFFFFF" w:themeColor="background1"/>
+                <w:sz w:val="28"/>
+                <w:szCs w:val="28"/>
+              </w:rPr>
+              <w:t>Set meter lights</w:t>
+            </w:r>
           </w:p>
           <w:p>
             <w:pPr>
@@ -3775,34 +4940,6 @@
                 <w:szCs w:val="28"/>
               </w:rPr>
               <w:t>Turn on Deadman</w:t>
-            </w:r>
-          </w:p>
-          <w:p>
-            <w:pPr>
-              <w:pStyle w:val="ListParagraph"/>
-              <w:numPr>
-                <w:ilvl w:val="0"/>
-                <w:numId w:val="2"/>
-              </w:numPr>
-              <w:rPr>
-                <w:rFonts w:asciiTheme="majorHAnsi" w:hAnsiTheme="majorHAnsi"/>
-                <w:b/>
-                <w:bCs/>
-                <w:color w:val="FFFFFF" w:themeColor="background1"/>
-                <w:sz w:val="28"/>
-                <w:szCs w:val="28"/>
-              </w:rPr>
-            </w:pPr>
-            <w:r>
-              <w:rPr>
-                <w:rFonts w:asciiTheme="majorHAnsi" w:hAnsiTheme="majorHAnsi"/>
-                <w:b/>
-                <w:bCs/>
-                <w:color w:val="FFFFFF" w:themeColor="background1"/>
-                <w:sz w:val="28"/>
-                <w:szCs w:val="28"/>
-              </w:rPr>
-              <w:t>Set meter lights</w:t>
             </w:r>
           </w:p>
         </w:tc>
@@ -3949,10 +5086,11 @@
     </w:tbl>
     <w:p>
       <w:pPr>
+        <w:jc w:val="right"/>
         <w:rPr>
           <w:color w:val="FFFFFF" w:themeColor="background1"/>
-          <w:sz w:val="16"/>
-          <w:szCs w:val="16"/>
+          <w:sz w:val="8"/>
+          <w:szCs w:val="8"/>
         </w:rPr>
       </w:pPr>
     </w:p>
@@ -3961,8 +5099,18 @@
         <w:jc w:val="right"/>
         <w:rPr>
           <w:color w:val="FFFFFF" w:themeColor="background1"/>
-          <w:sz w:val="16"/>
-          <w:szCs w:val="16"/>
+          <w:sz w:val="2"/>
+          <w:szCs w:val="2"/>
+        </w:rPr>
+      </w:pPr>
+    </w:p>
+    <w:p>
+      <w:pPr>
+        <w:jc w:val="right"/>
+        <w:rPr>
+          <w:color w:val="FFFFFF" w:themeColor="background1"/>
+          <w:sz w:val="2"/>
+          <w:szCs w:val="2"/>
         </w:rPr>
       </w:pPr>
     </w:p>
@@ -4025,23 +5173,13 @@
               </w:rPr>
               <w:t xml:space="preserve">For </w:t>
             </w:r>
-            <w:proofErr w:type="spellStart"/>
             <w:r>
               <w:rPr>
                 <w:color w:val="FFFFFF" w:themeColor="background1"/>
                 <w:sz w:val="16"/>
                 <w:szCs w:val="16"/>
               </w:rPr>
-              <w:t>ChrisTrains</w:t>
-            </w:r>
-            <w:proofErr w:type="spellEnd"/>
-            <w:r>
-              <w:rPr>
-                <w:color w:val="FFFFFF" w:themeColor="background1"/>
-                <w:sz w:val="16"/>
-                <w:szCs w:val="16"/>
-              </w:rPr>
-              <w:t xml:space="preserve"> </w:t>
+              <w:t xml:space="preserve">ChrisTrains </w:t>
             </w:r>
             <w:r>
               <w:rPr>
@@ -4093,19 +5231,8 @@
                 <w:sz w:val="16"/>
                 <w:szCs w:val="16"/>
               </w:rPr>
-              <w:t>©</w:t>
+              <w:t>©TheJAG</w:t>
             </w:r>
-            <w:proofErr w:type="spellStart"/>
-            <w:r>
-              <w:rPr>
-                <w:rFonts w:ascii="Magneto" w:hAnsi="Magneto"/>
-                <w:color w:val="FFFFFF" w:themeColor="background1"/>
-                <w:sz w:val="16"/>
-                <w:szCs w:val="16"/>
-              </w:rPr>
-              <w:t>TheJAG</w:t>
-            </w:r>
-            <w:proofErr w:type="spellEnd"/>
           </w:p>
         </w:tc>
       </w:tr>

</xml_diff>